<commit_message>
op 110: v5 operator prompt for agent 111 + lane reports (22:22 PDT)
</commit_message>
<xml_diff>
--- a/handoffs/op-f083060f/TGP-Operator-Prompt-v5-Agent-111.docx
+++ b/handoffs/op-f083060f/TGP-Operator-Prompt-v5-Agent-111.docx
@@ -30,7 +30,7 @@
         </w:r>
       </w:hyperlink>
       <w:r>
-        <w:t xml:space="preserve">) at Bradley's request (10-01 21:38: "keep progressing, updating the agent 110 prompt I gave you to reflect current state and issues - rename it agent 111 … for when your out of credits and retired happily!"). This snapshot: 2026-10-01 21:43 PDT (real clock). Agent 110 keeps regenerating it; the newest copy is in tgp-agent-context at handoffs/op-f083060f/TGP-Operator-Prompt-v5-Agent-111.md (and .docx). Paste this whole document as the first message to the next operator, and attach the same four owner documents plus docs.zip (section 3.4). It replaces prompt v4 (kept at handoffs/op-f083060f/TGP-Operator-Prompt-v4-Agent-110.md for history). Most of v4 is carried over word for word; the parts that changed are sections 0 (overarching facts, item 5), 2 (update note), 3, 4.13 (new), 5, 6.0 (110's lessons first), 7, 12 and 13.</w:t>
+        <w:t xml:space="preserve">) at Bradley's request (10-01 21:38: "keep progressing, updating the agent 110 prompt I gave you to reflect current state and issues - rename it agent 111 … for when your out of credits and retired happily!"). This snapshot: 2026-10-01 22:22 PDT (real clock). Agent 110 keeps regenerating it; the newest copy is in tgp-agent-context at handoffs/op-f083060f/TGP-Operator-Prompt-v5-Agent-111.md (and .docx). Paste this whole document as the first message to the next operator, and attach the same four owner documents plus docs.zip (section 3.4). It replaces prompt v4 (kept at handoffs/op-f083060f/TGP-Operator-Prompt-v4-Agent-110.md for history). Most of v4 is carried over word for word; the parts that changed are sections 0 (overarching facts, item 5), 2 (update note), 3, 4.13 (new), 5, 6.0 (110's lessons first), 7, 12 and 13.</w:t>
       </w:r>
     </w:p>
     <w:p>
@@ -1744,7 +1744,7 @@
         <w:pStyle w:val="FirstParagraph"/>
       </w:pPr>
       <w:r>
-        <w:t xml:space="preserve">UPDATE 10-01 20:17-21:43 (agent 110 era; sections 4.13 and 5 have the detail):</w:t>
+        <w:t xml:space="preserve">UPDATE 10-01 20:17-22:22 (agent 110 era; sections 4.13 and 5 have the detail):</w:t>
       </w:r>
     </w:p>
     <w:p>
@@ -5684,13 +5684,13 @@
         <w:t xml:space="preserve">The live, newest version of this section is the top of tgp-agent-context LAST_OPERATOR_STATE.md ("AGENT 110 TAKEOVER" + "Train log (agent 110)"). Agent 110 appends to that train log after every merge, deploy and lane result; if this prompt and the train log disagree, the train log wins.</w:t>
       </w:r>
     </w:p>
-    <w:bookmarkStart w:id="50" w:name="X838eb4fabaaeaa8860d19fcf4faf256dffbffc7"/>
+    <w:bookmarkStart w:id="50" w:name="X29946f4dbccf81d30e6fbdc622f541637d64250"/>
     <w:p>
       <w:pPr>
         <w:pStyle w:val="Heading3"/>
       </w:pPr>
       <w:r>
-        <w:t xml:space="preserve">AGENT 110 STATE FOR AGENT 111 — snapshot 2026-10-01 21:43 PDT (real clock)</w:t>
+        <w:t xml:space="preserve">AGENT 110 STATE FOR AGENT 111 — snapshot 2026-10-01 22:22 PDT (real clock)</w:t>
       </w:r>
     </w:p>
     <w:bookmarkStart w:id="43" w:name="production-and-mains"/>
@@ -5851,7 +5851,7 @@
         </w:numPr>
       </w:pPr>
       <w:r>
-        <w:t xml:space="preserve">AUD-SOL (GPT-6.1 Sol): standing Sol lens: deltas + full audits. Status: idle (re-queue by message); delivered 11 verdicts incl. #320 #323 #595 #626 #630 #631 #623 approvals and #324 REQUEST CHANGES (B-324-1).</w:t>
+        <w:t xml:space="preserve">AUD-SOL (GPT-6.1 Sol): standing Sol lens. Status: running batch #632, #624, #608, #627@2c57cc41, #633, #629.</w:t>
       </w:r>
     </w:p>
     <w:p>
@@ -5863,7 +5863,7 @@
         </w:numPr>
       </w:pPr>
       <w:r>
-        <w:t xml:space="preserve">AUD-OPUS (Claude Opus 5.5): standing Opus lens. Status: idle (re-queue by message); APPROVE #595 #630 #623; REQUEST CHANGES #626 (B-626-2).</w:t>
+        <w:t xml:space="preserve">AUD-OPUS (Claude Opus 5.5): standing Opus lens. Status: running batch #627, #629, mobile #321, #624, #608, #633.</w:t>
       </w:r>
     </w:p>
     <w:p>
@@ -5911,7 +5911,7 @@
         </w:numPr>
       </w:pPr>
       <w:r>
-        <w:t xml:space="preserve">B-FEE-R3 (Claude Opus 5.5): #627 B-627-1/2; #629; mobile #321. Status: running; pushed #627 -&gt; 7d66b350 (18 suites / 550 tests, tsc 0); #629, #321 next.</w:t>
+        <w:t xml:space="preserve">B-FEE-R3 (Claude Opus 5.5): #627 B-627-1/2; #629; mobile #321. Status: DONE 22:0x. #627 -&gt; 2c57cc41, #629 -&gt; 858eb40b (promoted T4: migration 20270216000000 first_published_at), mobile #321 -&gt; a9b1f49d; all CI green, all 5 findings closed; awaiting audits (Sol + Opus on #627/#629, Opus on #321). Open owner decision: refund/dispute recovery (see 7).</w:t>
       </w:r>
     </w:p>
     <w:p>
@@ -5923,7 +5923,7 @@
         </w:numPr>
       </w:pPr>
       <w:r>
-        <w:t xml:space="preserve">S-SCHED (GPT-6.1 Sol): native Calendar backend + mobile from 108's WIP. Status: running; opened backend #632 (T2, CI + schema parity green at 4accdbc3); mobile PR in progress.</w:t>
+        <w:t xml:space="preserve">S-SCHED (GPT-6.1 Sol): native Calendar from 108 WIP. Status: DONE. backend #632 @4accdbc3 (T2, CI + parity green) and mobile DRAFT #325 @bc1398c2 (T2, CI green, 404 suites). Paused higher-tier work (validation, concurrency, ownership, contracts, notification delivery) -&gt; lane S-SCHED-2 (objective written, Opus, T3/T4, migration 20270212000000), not launched yet. Shared mobile deps need expo-calendar 56.0.10 after #325 merges.</w:t>
       </w:r>
     </w:p>
     <w:p>
@@ -5948,6 +5948,30 @@
       </w:pPr>
       <w:r>
         <w:t xml:space="preserve">B-TRAIN-2 (Claude Opus 5.5): #604 (10 conflicts) -&gt; #607 -&gt; #609 forward merges. Status: running.</w:t>
+      </w:r>
+    </w:p>
+    <w:p>
+      <w:pPr>
+        <w:pStyle w:val="Compact"/>
+        <w:numPr>
+          <w:ilvl w:val="0"/>
+          <w:numId w:val="1080"/>
+        </w:numPr>
+      </w:pPr>
+      <w:r>
+        <w:t xml:space="preserve">Queued lane objectives (not launched; launch as builder slots free while keeping 2 auditor slots): S-SCHED-2, B-EXPORT (data export to private storage + signed URL), S-ERRORS (#324 B-324-1 + slices; also switch mobile errorCode() to read</w:t>
+      </w:r>
+      <w:r>
+        <w:t xml:space="preserve"> </w:t>
+      </w:r>
+      <w:r>
+        <w:rPr>
+          <w:rStyle w:val="VerbatimChar"/>
+        </w:rPr>
+        <w:t xml:space="preserve">code</w:t>
+      </w:r>
+      <w:r>
+        <w:t xml:space="preserve">).</w:t>
       </w:r>
     </w:p>
     <w:bookmarkEnd w:id="45"/>
@@ -6017,7 +6041,7 @@
         </w:numPr>
       </w:pPr>
       <w:r>
-        <w:t xml:space="preserve">backend #604 @21ffc02c: DIRTY, T4; verdicts at this head: GPT-6.1 Sol:APPROVE, Claude Opus 5.5:APPROVE. fix(throttler): isolate named throttlers to their routes, pu</w:t>
+        <w:t xml:space="preserve">backend #604 @87d09b1d: CLEAN, T4; verdicts at this head: -. fix(throttler): isolate named throttlers to their routes, pu</w:t>
       </w:r>
     </w:p>
     <w:p>
@@ -6053,7 +6077,7 @@
         </w:numPr>
       </w:pPr>
       <w:r>
-        <w:t xml:space="preserve">backend #608 @2759e1a0: BEHIND, T4; verdicts at this head: -. fix(account-deletion): in-app deletion completes on re-auth,</w:t>
+        <w:t xml:space="preserve">backend #608 @2759e1a0: BEHIND, T4; verdicts at this head: GPT-6.1 Sol:REQUEST CHANGES. fix(account-deletion): in-app deletion completes on re-auth,</w:t>
       </w:r>
     </w:p>
     <w:p>
@@ -6077,7 +6101,7 @@
         </w:numPr>
       </w:pPr>
       <w:r>
-        <w:t xml:space="preserve">backend #610 @d1e1732f: BEHIND, T4; verdicts at this head: Claude Opus 5.5:REQUEST CHANGES. feat(community): UGC safety for App Review 1.2 (content filt</w:t>
+        <w:t xml:space="preserve">backend #610 @9e4b3795: BEHIND, T4; verdicts at this head: -. feat(community): UGC safety for App Review 1.2 (content filt</w:t>
       </w:r>
     </w:p>
     <w:p>
@@ -6221,7 +6245,7 @@
         </w:numPr>
       </w:pPr>
       <w:r>
-        <w:t xml:space="preserve">backend #624 @75a4e563: BEHIND, T4; verdicts at this head: -. S-ENVTRUTH: register every src/ env read, ENV REGISTRATION b</w:t>
+        <w:t xml:space="preserve">backend #624 @75a4e563: BEHIND, T4; verdicts at this head: GPT-6.1 Sol:APPROVE. S-ENVTRUTH: register every src/ env read, ENV REGISTRATION b</w:t>
       </w:r>
     </w:p>
     <w:p>
@@ -6233,7 +6257,7 @@
         </w:numPr>
       </w:pPr>
       <w:r>
-        <w:t xml:space="preserve">backend #626 @9551d2c8: BEHIND, T4; verdicts at this head: GPT-6.1 Sol:APPROVE, Claude Opus 5.5:REQUEST CHANGES. R2b: single AI egress gate enforcing the live box-2 AI conse</w:t>
+        <w:t xml:space="preserve">backend #626 @d9be0c0d: CLEAN, T4; verdicts at this head: -. feat(ai-egress): R2b single AI egress gate enforcing the liv</w:t>
       </w:r>
     </w:p>
     <w:p>
@@ -6245,7 +6269,7 @@
         </w:numPr>
       </w:pPr>
       <w:r>
-        <w:t xml:space="preserve">backend #627 @7d66b350: BEHIND, T4; verdicts at this head: -. fix(billing): coach payout = price - actual Stripe fee - 2%</w:t>
+        <w:t xml:space="preserve">backend #627 @2c57cc41: CLEAN, T4; verdicts at this head: -. fix(billing): coach payout = price - actual Stripe fee - 2%</w:t>
       </w:r>
     </w:p>
     <w:p>
@@ -6257,7 +6281,7 @@
         </w:numPr>
       </w:pPr>
       <w:r>
-        <w:t xml:space="preserve">backend #628 @691528a0: BEHIND, T4; verdicts at this head: -. fix(dunning-v2): make the 10-day payment lockout live-ready</w:t>
+        <w:t xml:space="preserve">backend #628 @6720410e: BLOCKED, T4; verdicts at this head: -. fix(dunning-v2): live-ready 10-day lockout + native card upd</w:t>
       </w:r>
     </w:p>
     <w:p>
@@ -6269,7 +6293,7 @@
         </w:numPr>
       </w:pPr>
       <w:r>
-        <w:t xml:space="preserve">backend #629 @32d81faa: DIRTY, T3; verdicts at this head: GPT-6.1 Sol:REQUEST CHANGES. feat(packages): paid packages start at $19.99, or exactly $0</w:t>
+        <w:t xml:space="preserve">backend #629 @858eb40b: CLEAN, T4; verdicts at this head: -. feat(packages): paid packages start at $19.99, or exactly $0</w:t>
       </w:r>
     </w:p>
     <w:p>
@@ -6281,7 +6305,7 @@
         </w:numPr>
       </w:pPr>
       <w:r>
-        <w:t xml:space="preserve">backend #632 @4accdbc3: BEHIND, T2; verdicts at this head: -. S-SCHED: explicit booking reminders and safe C04 appointment</w:t>
+        <w:t xml:space="preserve">backend #632 @4accdbc3: BEHIND, T2; verdicts at this head: GPT-6.1 Sol:APPROVE. S-SCHED: explicit booking reminders and safe C04 appointment</w:t>
       </w:r>
     </w:p>
     <w:p>
@@ -6293,7 +6317,7 @@
         </w:numPr>
       </w:pPr>
       <w:r>
-        <w:t xml:space="preserve">backend #633 @850ec148: BLOCKED, T4; verdicts at this head: -. ci(flags): FEATURE_DUNNING_V2 closed-choice input for the Fl</w:t>
+        <w:t xml:space="preserve">backend #633 @850ec148: UNSTABLE, T4; verdicts at this head: -. ci(flags): FEATURE_DUNNING_V2 closed-choice input for the Fl</w:t>
       </w:r>
     </w:p>
     <w:p>
@@ -6317,7 +6341,7 @@
         </w:numPr>
       </w:pPr>
       <w:r>
-        <w:t xml:space="preserve">mobile #310 @1d7cc720: DIRTY, T4; verdicts at this head: GPT-6.1 Sol:REQUEST CHANGES, Claude Opus 5.5:APPROVE. feat(onboarding): config-driven consultation onboarding behi</w:t>
+        <w:t xml:space="preserve">mobile #310 @ea57074f: BLOCKED, T4; verdicts at this head: -. feat(onboarding): config-driven consultation onboarding behi</w:t>
       </w:r>
     </w:p>
     <w:p>
@@ -6341,7 +6365,7 @@
         </w:numPr>
       </w:pPr>
       <w:r>
-        <w:t xml:space="preserve">mobile #313 @4c6028d5: DIRTY, T4; verdicts at this head: GPT-6.1 Sol:APPROVE, Claude Opus 5.5:APPROVE. fix(account-deletion): in-app deletion completes with re-aut</w:t>
+        <w:t xml:space="preserve">mobile #313 @1e80017b: CLEAN, T4; verdicts at this head: -. fix(account-deletion): in-app deletion completes with re-aut</w:t>
       </w:r>
     </w:p>
     <w:p>
@@ -6353,7 +6377,7 @@
         </w:numPr>
       </w:pPr>
       <w:r>
-        <w:t xml:space="preserve">mobile #314 @2f7789ec: BEHIND, T4; verdicts at this head: Claude Opus 5.5:REQUEST CHANGES. feat(community): report, block, moderation actions and safet</w:t>
+        <w:t xml:space="preserve">mobile #314 @41d829d7: CLEAN, T4; verdicts at this head: -. feat(community): report, block, moderation actions and safet</w:t>
       </w:r>
     </w:p>
     <w:p>
@@ -6389,7 +6413,7 @@
         </w:numPr>
       </w:pPr>
       <w:r>
-        <w:t xml:space="preserve">mobile #321 @8bc4de3a: BEHIND, T3; verdicts at this head: GPT-6.1 Sol:REQUEST CHANGES. feat(packages): editor shows the $19.99 minimum or free rule</w:t>
+        <w:t xml:space="preserve">mobile #321 @a9b1f49d: CLEAN, T3; verdicts at this head: -. feat(packages): editor shows the $19.99 minimum or free rule</w:t>
       </w:r>
     </w:p>
     <w:p>
@@ -6401,7 +6425,7 @@
         </w:numPr>
       </w:pPr>
       <w:r>
-        <w:t xml:space="preserve">mobile #322 @2d77399d: BEHIND, T4; verdicts at this head: -. feat(dunning): calm full-screen payment lockout + Days 0-9 b</w:t>
+        <w:t xml:space="preserve">mobile #322 @de83aa61: BLOCKED, T4; verdicts at this head: -. feat(dunning): calm full-screen payment lockout + Days 0-9 b</w:t>
       </w:r>
     </w:p>
     <w:p>
@@ -6429,6 +6453,18 @@
     </w:p>
     <w:p>
       <w:pPr>
+        <w:pStyle w:val="Compact"/>
+        <w:numPr>
+          <w:ilvl w:val="0"/>
+          <w:numId w:val="1081"/>
+        </w:numPr>
+      </w:pPr>
+      <w:r>
+        <w:t xml:space="preserve">mobile #325 @bc1398c2: BEHIND, T2; verdicts at this head: -. S-SCHED: native Calendar, coach controls and welcome-call tu</w:t>
+      </w:r>
+    </w:p>
+    <w:p>
+      <w:pPr>
         <w:pStyle w:val="FirstParagraph"/>
       </w:pPr>
       <w:r>
@@ -7327,6 +7363,18 @@
       </w:pPr>
       <w:r>
         <w:t xml:space="preserve">LLC / D-U-N-S: only relevant if he wants a Play organization account (exempt from the 12-tester rule; needs a registered business and a D-U-N-S number, which can take up to 30 days). Do not raise it unless Play comes up.</w:t>
+      </w:r>
+    </w:p>
+    <w:p>
+      <w:pPr>
+        <w:pStyle w:val="Compact"/>
+        <w:numPr>
+          <w:ilvl w:val="0"/>
+          <w:numId w:val="1092"/>
+        </w:numPr>
+      </w:pPr>
+      <w:r>
+        <w:t xml:space="preserve">DECISION NEEDED (from B-FEE-R3, 10-01 ~22:05): on a full refund or lost dispute, #627 nets the recovery now and claws it back from the coach's future transfers; if the coach has no future transfers, TGP is out of pocket, which breaks "TGP never loses money". Options: A) enable Stripe Connect account debits (recover from the coach's bank) for that residual case; B) hold a small rolling reserve from coach payouts. Operator recommendation: A (no change to normal payouts); until he answers, ship #627 as built (the residual case needs a refund larger than the coach's pending + future balance).</w:t>
       </w:r>
     </w:p>
     <w:p>

</xml_diff>

<commit_message>
op 110: v5 operator prompt for agent 111 + lane reports (22:35 PDT)
</commit_message>
<xml_diff>
--- a/handoffs/op-f083060f/TGP-Operator-Prompt-v5-Agent-111.docx
+++ b/handoffs/op-f083060f/TGP-Operator-Prompt-v5-Agent-111.docx
@@ -30,7 +30,7 @@
         </w:r>
       </w:hyperlink>
       <w:r>
-        <w:t xml:space="preserve">) at Bradley's request (10-01 21:38: "keep progressing, updating the agent 110 prompt I gave you to reflect current state and issues - rename it agent 111 … for when your out of credits and retired happily!"). This snapshot: 2026-10-01 22:22 PDT (real clock). Agent 110 keeps regenerating it; the newest copy is in tgp-agent-context at handoffs/op-f083060f/TGP-Operator-Prompt-v5-Agent-111.md (and .docx). Paste this whole document as the first message to the next operator, and attach the same four owner documents plus docs.zip (section 3.4). It replaces prompt v4 (kept at handoffs/op-f083060f/TGP-Operator-Prompt-v4-Agent-110.md for history). Most of v4 is carried over word for word; the parts that changed are sections 0 (overarching facts, item 5), 2 (update note), 3, 4.13 (new), 5, 6.0 (110's lessons first), 7, 12 and 13.</w:t>
+        <w:t xml:space="preserve">) at Bradley's request (10-01 21:38: "keep progressing, updating the agent 110 prompt I gave you to reflect current state and issues - rename it agent 111 … for when your out of credits and retired happily!"). This snapshot: 2026-10-01 22:35 PDT (real clock). Agent 110 keeps regenerating it; the newest copy is in tgp-agent-context at handoffs/op-f083060f/TGP-Operator-Prompt-v5-Agent-111.md (and .docx). Paste this whole document as the first message to the next operator, and attach the same four owner documents plus docs.zip (section 3.4). It replaces prompt v4 (kept at handoffs/op-f083060f/TGP-Operator-Prompt-v4-Agent-110.md for history). Most of v4 is carried over word for word; the parts that changed are sections 0 (overarching facts, item 5), 2 (update note), 3, 4.13 (new), 5, 6.0 (110's lessons first), 7, 12 and 13.</w:t>
       </w:r>
     </w:p>
     <w:p>
@@ -1744,7 +1744,7 @@
         <w:pStyle w:val="FirstParagraph"/>
       </w:pPr>
       <w:r>
-        <w:t xml:space="preserve">UPDATE 10-01 20:17-22:22 (agent 110 era; sections 4.13 and 5 have the detail):</w:t>
+        <w:t xml:space="preserve">UPDATE 10-01 20:17-22:35 (agent 110 era; sections 4.13 and 5 have the detail):</w:t>
       </w:r>
     </w:p>
     <w:p>
@@ -5684,13 +5684,13 @@
         <w:t xml:space="preserve">The live, newest version of this section is the top of tgp-agent-context LAST_OPERATOR_STATE.md ("AGENT 110 TAKEOVER" + "Train log (agent 110)"). Agent 110 appends to that train log after every merge, deploy and lane result; if this prompt and the train log disagree, the train log wins.</w:t>
       </w:r>
     </w:p>
-    <w:bookmarkStart w:id="50" w:name="X29946f4dbccf81d30e6fbdc622f541637d64250"/>
+    <w:bookmarkStart w:id="50" w:name="X50ada3af81825eecd8a25ba6264309b2b3bd13a"/>
     <w:p>
       <w:pPr>
         <w:pStyle w:val="Heading3"/>
       </w:pPr>
       <w:r>
-        <w:t xml:space="preserve">AGENT 110 STATE FOR AGENT 111 — snapshot 2026-10-01 22:22 PDT (real clock)</w:t>
+        <w:t xml:space="preserve">AGENT 110 STATE FOR AGENT 111 — snapshot 2026-10-01 22:35 PDT (real clock)</w:t>
       </w:r>
     </w:p>
     <w:bookmarkStart w:id="43" w:name="production-and-mains"/>
@@ -5851,7 +5851,7 @@
         </w:numPr>
       </w:pPr>
       <w:r>
-        <w:t xml:space="preserve">AUD-SOL (GPT-6.1 Sol): standing Sol lens. Status: running batch #632, #624, #608, #627@2c57cc41, #633, #629.</w:t>
+        <w:t xml:space="preserve">AUD-SOL (GPT-6.1 Sol): standing Sol lens. Status: running batch #632, #624, #608, #627@2c57cc41, #633, #629, then #626, #326, #610, #314.</w:t>
       </w:r>
     </w:p>
     <w:p>
@@ -5875,6 +5875,18 @@
         </w:numPr>
       </w:pPr>
       <w:r>
+        <w:t xml:space="preserve">AUD-OPUS-2 (Claude Opus 5.5): second Opus lens, consent + UGC. Status: running #626, mobile #326, #610, mobile #314 (objective lanes/AUD-OPUS-2.md).</w:t>
+      </w:r>
+    </w:p>
+    <w:p>
+      <w:pPr>
+        <w:pStyle w:val="Compact"/>
+        <w:numPr>
+          <w:ilvl w:val="0"/>
+          <w:numId w:val="1080"/>
+        </w:numPr>
+      </w:pPr>
+      <w:r>
         <w:t xml:space="preserve">B-FIX2 (Claude Opus 5.5): #624 B-624-3; #608 B-608-11 + mobile #313 merge-main; mobile #310 B-310-5. Status: running; pushed #624 -&gt; 75a4e563 and #608 -&gt; 2759e1a0 (fix round 4; found the export-to-/tmp blocker); #313 and #310 next.</w:t>
       </w:r>
     </w:p>
@@ -5887,7 +5899,7 @@
         </w:numPr>
       </w:pPr>
       <w:r>
-        <w:t xml:space="preserve">B-UGC (Claude Opus 5.5): #610/#314 fix rounds + SUPPORT_EMAIL + voice-note reporting (owner 20:32) + member wins made safe. Status: running; migration 20270211000000.</w:t>
+        <w:t xml:space="preserve">B-UGC (Claude Opus 5.5): #610/#314 fix rounds + voice-note reporting + wins safety. Status: DONE ~22:30. backend #610 -&gt; 9e4b3795, mobile #314 -&gt; 41d829d, all CI green; all findings closed except C-610-4 (CI test DB = CI-gate change, deferred); voice: report target (migration 20270211000000), queue playback, 24h deadline, hide/warn/ban, block both ways, author delete, DM voice refused; fixed a bug where every voice-note create returned 400. Awaiting dual audit; voice flags stay off until audits + device pass.</w:t>
       </w:r>
     </w:p>
     <w:p>
@@ -5935,7 +5947,7 @@
         </w:numPr>
       </w:pPr>
       <w:r>
-        <w:t xml:space="preserve">B-R2B-2 (Claude Opus 5.5): #626 B-626-2 + new mobile PR for ai_consent_required / ai_egress_blocked. Status: running.</w:t>
+        <w:t xml:space="preserve">B-R2B-2 (Claude Opus 5.5): #626 B-626-2 + mobile AI-consent errors. Status: DONE ~22:45. backend #626 -&gt; d9be0c0d (B-626-2 + C-626-4 fixed; two main merges; PR title renamed feat(ai-egress) for danger), NEW mobile #326 @32ed8546 (both refusal codes on every AI surface), CI green. Merge order: #626 before #326; #310 and #326 in either order. FEATURE_AI_CONSENT_LEDGER_ENABLED must go ON with the #626 deploy (operator ruling OR-110-4; else every client sees "AI help is off").</w:t>
       </w:r>
     </w:p>
     <w:p>
@@ -5959,7 +5971,19 @@
         </w:numPr>
       </w:pPr>
       <w:r>
-        <w:t xml:space="preserve">Queued lane objectives (not launched; launch as builder slots free while keeping 2 auditor slots): S-SCHED-2, B-EXPORT (data export to private storage + signed URL), S-ERRORS (#324 B-324-1 + slices; also switch mobile errorCode() to read</w:t>
+        <w:t xml:space="preserve">S-SCHED-2 (Claude Opus 5.5): scheduling backend lifecycle/concurrency/ownership/contracts/notifications + #325 consumer changes. Status: running since ~22:30 (migration 20270212000000).</w:t>
+      </w:r>
+    </w:p>
+    <w:p>
+      <w:pPr>
+        <w:pStyle w:val="Compact"/>
+        <w:numPr>
+          <w:ilvl w:val="0"/>
+          <w:numId w:val="1080"/>
+        </w:numPr>
+      </w:pPr>
+      <w:r>
+        <w:t xml:space="preserve">Queued lane objectives (not launched; launch as builder slots free while keeping 2 auditor slots): B-EXPORT (data export to private storage + signed URL), S-ERRORS (#324 B-324-1 + slices; also switch mobile errorCode() to read</w:t>
       </w:r>
       <w:r>
         <w:t xml:space="preserve"> </w:t>
@@ -6065,7 +6089,7 @@
         </w:numPr>
       </w:pPr>
       <w:r>
-        <w:t xml:space="preserve">backend #607 @245da2e7: DIRTY, T4; verdicts at this head: GPT-6.1 Sol:REQUEST CHANGES, Claude Opus 5.5:APPROVE, GPT-6.1 Sol:APPROVE. C05/C07: consultation intake, idempotent onboarding complete</w:t>
+        <w:t xml:space="preserve">backend #607 @d6ac47e8: BLOCKED, T4; verdicts at this head: -. C05/C07: consultation intake, idempotent onboarding complete</w:t>
       </w:r>
     </w:p>
     <w:p>
@@ -6089,7 +6113,7 @@
         </w:numPr>
       </w:pPr>
       <w:r>
-        <w:t xml:space="preserve">backend #609 @1f8b22b9: DIRTY, T3; verdicts at this head: -. C05 items 6-7: coach welcome message at complete +13 min, wo</w:t>
+        <w:t xml:space="preserve">backend #609 @5fd61a1b: BLOCKED, T3; verdicts at this head: -. C05 items 6-7: coach welcome message at complete +13 min, wo</w:t>
       </w:r>
     </w:p>
     <w:p>
@@ -6269,7 +6293,7 @@
         </w:numPr>
       </w:pPr>
       <w:r>
-        <w:t xml:space="preserve">backend #627 @2c57cc41: CLEAN, T4; verdicts at this head: -. fix(billing): coach payout = price - actual Stripe fee - 2%</w:t>
+        <w:t xml:space="preserve">backend #627 @2c57cc41: CLEAN, T4; verdicts at this head: GPT-6.1 Sol:REQUEST CHANGES, Claude Opus 5.5:REQUEST CHANGES. fix(billing): coach payout = price - actual Stripe fee - 2%</w:t>
       </w:r>
     </w:p>
     <w:p>
@@ -6281,7 +6305,7 @@
         </w:numPr>
       </w:pPr>
       <w:r>
-        <w:t xml:space="preserve">backend #628 @6720410e: BLOCKED, T4; verdicts at this head: -. fix(dunning-v2): live-ready 10-day lockout + native card upd</w:t>
+        <w:t xml:space="preserve">backend #628 @5be90ef1: UNSTABLE, T4; verdicts at this head: -. fix(dunning-v2): live-ready 10-day lockout + native card upd</w:t>
       </w:r>
     </w:p>
     <w:p>
@@ -6293,7 +6317,7 @@
         </w:numPr>
       </w:pPr>
       <w:r>
-        <w:t xml:space="preserve">backend #629 @858eb40b: CLEAN, T4; verdicts at this head: -. feat(packages): paid packages start at $19.99, or exactly $0</w:t>
+        <w:t xml:space="preserve">backend #629 @858eb40b: CLEAN, T4; verdicts at this head: GPT-6.1 Sol:REQUEST CHANGES. feat(packages): paid packages start at $19.99, or exactly $0</w:t>
       </w:r>
     </w:p>
     <w:p>
@@ -6317,7 +6341,7 @@
         </w:numPr>
       </w:pPr>
       <w:r>
-        <w:t xml:space="preserve">backend #633 @850ec148: UNSTABLE, T4; verdicts at this head: -. ci(flags): FEATURE_DUNNING_V2 closed-choice input for the Fl</w:t>
+        <w:t xml:space="preserve">backend #633 @850ec148: UNSTABLE, T4; verdicts at this head: GPT-6.1 Sol:REQUEST CHANGES. ci(flags): FEATURE_DUNNING_V2 closed-choice input for the Fl</w:t>
       </w:r>
     </w:p>
     <w:p>
@@ -6341,7 +6365,7 @@
         </w:numPr>
       </w:pPr>
       <w:r>
-        <w:t xml:space="preserve">mobile #310 @ea57074f: BLOCKED, T4; verdicts at this head: -. feat(onboarding): config-driven consultation onboarding behi</w:t>
+        <w:t xml:space="preserve">mobile #310 @e1dbe7f9: BLOCKED, T4; verdicts at this head: -. feat(onboarding): config-driven consultation onboarding behi</w:t>
       </w:r>
     </w:p>
     <w:p>
@@ -6425,7 +6449,7 @@
         </w:numPr>
       </w:pPr>
       <w:r>
-        <w:t xml:space="preserve">mobile #322 @de83aa61: BLOCKED, T4; verdicts at this head: -. feat(dunning): calm full-screen payment lockout + Days 0-9 b</w:t>
+        <w:t xml:space="preserve">mobile #322 @8991ddf3: CLEAN, T4; verdicts at this head: -. feat(dunning): calm full-screen payment lockout + Days 0-9 b</w:t>
       </w:r>
     </w:p>
     <w:p>
@@ -6465,6 +6489,18 @@
     </w:p>
     <w:p>
       <w:pPr>
+        <w:pStyle w:val="Compact"/>
+        <w:numPr>
+          <w:ilvl w:val="0"/>
+          <w:numId w:val="1081"/>
+        </w:numPr>
+      </w:pPr>
+      <w:r>
+        <w:t xml:space="preserve">mobile #326 @32ed8546: CLEAN, T4; verdicts at this head: -. fix(ai): handle ai_consent_required and ai_egress_blocked on</w:t>
+      </w:r>
+    </w:p>
+    <w:p>
+      <w:pPr>
         <w:pStyle w:val="FirstParagraph"/>
       </w:pPr>
       <w:r>
@@ -6580,7 +6616,7 @@
         <w:pStyle w:val="FirstParagraph"/>
       </w:pPr>
       <w:r>
-        <w:t xml:space="preserve">OR-109-1 (community safety contact = SUPPORT_EMAIL), OR-109-2 (ai_egress_blocked 503 -&gt; contact support with reference), OR-109-3 (B-RECIPES defaults), OR-110-1 (user delete + account deletion erase AI chats), OR-110-2 (native Stripe surfaces), OR-110-3 (schema parity as merge gate; now enforced by GitHub).</w:t>
+        <w:t xml:space="preserve">OR-109-1 (community safety contact = SUPPORT_EMAIL), OR-109-2 (ai_egress_blocked 503 -&gt; contact support with reference), OR-109-3 (B-RECIPES defaults), OR-110-1 (user delete + account deletion erase AI chats), OR-110-2 (native Stripe surfaces), OR-110-3 (schema parity as merge gate; now enforced by GitHub), OR-110-4 (FEATURE_AI_CONSENT_LEDGER_ENABLED goes ON in the same window as the #626 deploy; #626 without the ledger flag blocks all AI for every client).</w:t>
       </w:r>
     </w:p>
     <w:bookmarkEnd w:id="48"/>

</xml_diff>

<commit_message>
op 110: v5 operator prompt for agent 111 + lane reports (22:37 PDT)
</commit_message>
<xml_diff>
--- a/handoffs/op-f083060f/TGP-Operator-Prompt-v5-Agent-111.docx
+++ b/handoffs/op-f083060f/TGP-Operator-Prompt-v5-Agent-111.docx
@@ -30,7 +30,7 @@
         </w:r>
       </w:hyperlink>
       <w:r>
-        <w:t xml:space="preserve">) at Bradley's request (10-01 21:38: "keep progressing, updating the agent 110 prompt I gave you to reflect current state and issues - rename it agent 111 … for when your out of credits and retired happily!"). This snapshot: 2026-10-01 22:35 PDT (real clock). Agent 110 keeps regenerating it; the newest copy is in tgp-agent-context at handoffs/op-f083060f/TGP-Operator-Prompt-v5-Agent-111.md (and .docx). Paste this whole document as the first message to the next operator, and attach the same four owner documents plus docs.zip (section 3.4). It replaces prompt v4 (kept at handoffs/op-f083060f/TGP-Operator-Prompt-v4-Agent-110.md for history). Most of v4 is carried over word for word; the parts that changed are sections 0 (overarching facts, item 5), 2 (update note), 3, 4.13 (new), 5, 6.0 (110's lessons first), 7, 12 and 13.</w:t>
+        <w:t xml:space="preserve">) at Bradley's request (10-01 21:38: "keep progressing, updating the agent 110 prompt I gave you to reflect current state and issues - rename it agent 111 … for when your out of credits and retired happily!"). This snapshot: 2026-10-01 22:37 PDT (real clock). Agent 110 keeps regenerating it; the newest copy is in tgp-agent-context at handoffs/op-f083060f/TGP-Operator-Prompt-v5-Agent-111.md (and .docx). Paste this whole document as the first message to the next operator, and attach the same four owner documents plus docs.zip (section 3.4). It replaces prompt v4 (kept at handoffs/op-f083060f/TGP-Operator-Prompt-v4-Agent-110.md for history). Most of v4 is carried over word for word; the parts that changed are sections 0 (overarching facts, item 5), 2 (update note), 3, 4.13 (new), 5, 6.0 (110's lessons first), 7, 12 and 13.</w:t>
       </w:r>
     </w:p>
     <w:p>
@@ -1744,7 +1744,7 @@
         <w:pStyle w:val="FirstParagraph"/>
       </w:pPr>
       <w:r>
-        <w:t xml:space="preserve">UPDATE 10-01 20:17-22:35 (agent 110 era; sections 4.13 and 5 have the detail):</w:t>
+        <w:t xml:space="preserve">UPDATE 10-01 20:17-22:37 (agent 110 era; sections 4.13 and 5 have the detail):</w:t>
       </w:r>
     </w:p>
     <w:p>
@@ -5684,13 +5684,13 @@
         <w:t xml:space="preserve">The live, newest version of this section is the top of tgp-agent-context LAST_OPERATOR_STATE.md ("AGENT 110 TAKEOVER" + "Train log (agent 110)"). Agent 110 appends to that train log after every merge, deploy and lane result; if this prompt and the train log disagree, the train log wins.</w:t>
       </w:r>
     </w:p>
-    <w:bookmarkStart w:id="50" w:name="X50ada3af81825eecd8a25ba6264309b2b3bd13a"/>
+    <w:bookmarkStart w:id="50" w:name="X9cd92a1d79f484679eeedb074c13af203a36100"/>
     <w:p>
       <w:pPr>
         <w:pStyle w:val="Heading3"/>
       </w:pPr>
       <w:r>
-        <w:t xml:space="preserve">AGENT 110 STATE FOR AGENT 111 — snapshot 2026-10-01 22:35 PDT (real clock)</w:t>
+        <w:t xml:space="preserve">AGENT 110 STATE FOR AGENT 111 — snapshot 2026-10-01 22:37 PDT (real clock)</w:t>
       </w:r>
     </w:p>
     <w:bookmarkStart w:id="43" w:name="production-and-mains"/>
@@ -5887,7 +5887,7 @@
         </w:numPr>
       </w:pPr>
       <w:r>
-        <w:t xml:space="preserve">B-FIX2 (Claude Opus 5.5): #624 B-624-3; #608 B-608-11 + mobile #313 merge-main; mobile #310 B-310-5. Status: running; pushed #624 -&gt; 75a4e563 and #608 -&gt; 2759e1a0 (fix round 4; found the export-to-/tmp blocker); #313 and #310 next.</w:t>
+        <w:t xml:space="preserve">B-FIX2 (Claude Opus 5.5): T4 fix rounds. Status: DONE ~22:50. backend #624 -&gt; 75a4e563 (B-624-3: no flyctl output printed at all), backend #608 -&gt; 2759e1a0 (B-608-11: durable cleanup record + nightly retry, migration 20270220000000), mobile #313 -&gt; 1e80017 (merge-only; test conflict), mobile #310 -&gt; e1dbe7f (B-310-5 + consultation flag declared in config/expected-env.json, T4 data). CI green except non-required shellcheck SC2015 in scripts/s10-core-diff-gate.sh (fails on main too; fix it — unassigned). Merge order note C-310-10: whichever of #313/#310 lands second keeps #310's consultation-draft purge. 108 WIP 8bdb5997 holds the env desired-state manifest #624 lacks (follow-up).</w:t>
       </w:r>
     </w:p>
     <w:p>
@@ -5983,7 +5983,19 @@
         </w:numPr>
       </w:pPr>
       <w:r>
-        <w:t xml:space="preserve">Queued lane objectives (not launched; launch as builder slots free while keeping 2 auditor slots): B-EXPORT (data export to private storage + signed URL), S-ERRORS (#324 B-324-1 + slices; also switch mobile errorCode() to read</w:t>
+        <w:t xml:space="preserve">B-EXPORT (Claude Opus 5.5): durable, downloadable data export stacked on #608 (migration 20270221000000). Status: running since ~22:55.</w:t>
+      </w:r>
+    </w:p>
+    <w:p>
+      <w:pPr>
+        <w:pStyle w:val="Compact"/>
+        <w:numPr>
+          <w:ilvl w:val="0"/>
+          <w:numId w:val="1080"/>
+        </w:numPr>
+      </w:pPr>
+      <w:r>
+        <w:t xml:space="preserve">Queued lane objectives (not launched): S-ERRORS (#324 B-324-1 + slices; also switch mobile errorCode() to read</w:t>
       </w:r>
       <w:r>
         <w:t xml:space="preserve"> </w:t>
@@ -5995,7 +6007,7 @@
         <w:t xml:space="preserve">code</w:t>
       </w:r>
       <w:r>
-        <w:t xml:space="preserve">).</w:t>
+        <w:t xml:space="preserve">); small CI fix for shellcheck SC2015 in scripts/s10-core-diff-gate.sh (T4 gate script).</w:t>
       </w:r>
     </w:p>
     <w:bookmarkEnd w:id="45"/>
@@ -6089,7 +6101,7 @@
         </w:numPr>
       </w:pPr>
       <w:r>
-        <w:t xml:space="preserve">backend #607 @d6ac47e8: BLOCKED, T4; verdicts at this head: -. C05/C07: consultation intake, idempotent onboarding complete</w:t>
+        <w:t xml:space="preserve">backend #607 @d6ac47e8: UNSTABLE, T4; verdicts at this head: -. C05/C07: consultation intake, idempotent onboarding complete</w:t>
       </w:r>
     </w:p>
     <w:p>
@@ -6305,7 +6317,7 @@
         </w:numPr>
       </w:pPr>
       <w:r>
-        <w:t xml:space="preserve">backend #628 @5be90ef1: UNSTABLE, T4; verdicts at this head: -. fix(dunning-v2): live-ready 10-day lockout + native card upd</w:t>
+        <w:t xml:space="preserve">backend #628 @ba1d9480: BLOCKED, T4; verdicts at this head: -. fix(dunning-v2): live-ready 10-day lockout + native card upd</w:t>
       </w:r>
     </w:p>
     <w:p>
@@ -6365,7 +6377,7 @@
         </w:numPr>
       </w:pPr>
       <w:r>
-        <w:t xml:space="preserve">mobile #310 @e1dbe7f9: BLOCKED, T4; verdicts at this head: -. feat(onboarding): config-driven consultation onboarding behi</w:t>
+        <w:t xml:space="preserve">mobile #310 @e1dbe7f9: CLEAN, T4; verdicts at this head: -. feat(onboarding): config-driven consultation onboarding behi</w:t>
       </w:r>
     </w:p>
     <w:p>

</xml_diff>

<commit_message>
op 110: v5 operator prompt for agent 111 + lane reports (22:45 PDT)
</commit_message>
<xml_diff>
--- a/handoffs/op-f083060f/TGP-Operator-Prompt-v5-Agent-111.docx
+++ b/handoffs/op-f083060f/TGP-Operator-Prompt-v5-Agent-111.docx
@@ -30,7 +30,7 @@
         </w:r>
       </w:hyperlink>
       <w:r>
-        <w:t xml:space="preserve">) at Bradley's request (10-01 21:38: "keep progressing, updating the agent 110 prompt I gave you to reflect current state and issues - rename it agent 111 … for when your out of credits and retired happily!"). This snapshot: 2026-10-01 22:37 PDT (real clock). Agent 110 keeps regenerating it; the newest copy is in tgp-agent-context at handoffs/op-f083060f/TGP-Operator-Prompt-v5-Agent-111.md (and .docx). Paste this whole document as the first message to the next operator, and attach the same four owner documents plus docs.zip (section 3.4). It replaces prompt v4 (kept at handoffs/op-f083060f/TGP-Operator-Prompt-v4-Agent-110.md for history). Most of v4 is carried over word for word; the parts that changed are sections 0 (overarching facts, item 5), 2 (update note), 3, 4.13 (new), 5, 6.0 (110's lessons first), 7, 12 and 13.</w:t>
+        <w:t xml:space="preserve">) at Bradley's request (10-01 21:38: "keep progressing, updating the agent 110 prompt I gave you to reflect current state and issues - rename it agent 111 … for when your out of credits and retired happily!"). This snapshot: 2026-10-01 22:45 PDT (real clock). Agent 110 keeps regenerating it; the newest copy is in tgp-agent-context at handoffs/op-f083060f/TGP-Operator-Prompt-v5-Agent-111.md (and .docx). Paste this whole document as the first message to the next operator, and attach the same four owner documents plus docs.zip (section 3.4). It replaces prompt v4 (kept at handoffs/op-f083060f/TGP-Operator-Prompt-v4-Agent-110.md for history). Most of v4 is carried over word for word; the parts that changed are sections 0 (overarching facts, item 5), 2 (update note), 3, 4.13 (new), 5, 6.0 (110's lessons first), 7, 12 and 13.</w:t>
       </w:r>
     </w:p>
     <w:p>
@@ -1744,7 +1744,7 @@
         <w:pStyle w:val="FirstParagraph"/>
       </w:pPr>
       <w:r>
-        <w:t xml:space="preserve">UPDATE 10-01 20:17-22:37 (agent 110 era; sections 4.13 and 5 have the detail):</w:t>
+        <w:t xml:space="preserve">UPDATE 10-01 20:17-22:45 (agent 110 era; sections 4.13 and 5 have the detail):</w:t>
       </w:r>
     </w:p>
     <w:p>
@@ -5684,13 +5684,13 @@
         <w:t xml:space="preserve">The live, newest version of this section is the top of tgp-agent-context LAST_OPERATOR_STATE.md ("AGENT 110 TAKEOVER" + "Train log (agent 110)"). Agent 110 appends to that train log after every merge, deploy and lane result; if this prompt and the train log disagree, the train log wins.</w:t>
       </w:r>
     </w:p>
-    <w:bookmarkStart w:id="50" w:name="X9cd92a1d79f484679eeedb074c13af203a36100"/>
+    <w:bookmarkStart w:id="50" w:name="X921f3d4f378d1c96c7ba83a6d8906cc3644981a"/>
     <w:p>
       <w:pPr>
         <w:pStyle w:val="Heading3"/>
       </w:pPr>
       <w:r>
-        <w:t xml:space="preserve">AGENT 110 STATE FOR AGENT 111 — snapshot 2026-10-01 22:37 PDT (real clock)</w:t>
+        <w:t xml:space="preserve">AGENT 110 STATE FOR AGENT 111 — snapshot 2026-10-01 22:45 PDT (real clock)</w:t>
       </w:r>
     </w:p>
     <w:bookmarkStart w:id="43" w:name="production-and-mains"/>
@@ -5959,7 +5959,19 @@
         </w:numPr>
       </w:pPr>
       <w:r>
-        <w:t xml:space="preserve">B-TRAIN-2 (Claude Opus 5.5): #604 (10 conflicts) -&gt; #607 -&gt; #609 forward merges. Status: running.</w:t>
+        <w:t xml:space="preserve">B-TRAIN-2 (Claude Opus 5.5): forward merges. Status: DONE ~23:00. #604 -&gt; 87d09b1d (merge-only, patch-id proof; delta audits queued to Sol + AUD-OPUS), #607 -&gt; d6ac47e8 (migration renamed 20270212000000; INT-607-1 tenancy finding -&gt; B-607-FIX), #609 -&gt; 5fd61a1b (migration renamed 20270213000000; re-grade T4). PR body edits were refused by the safety check (ready texts in reports/btrain2/; operator retry also refused -&gt; left to B-607-FIX / morning).</w:t>
+      </w:r>
+    </w:p>
+    <w:p>
+      <w:pPr>
+        <w:pStyle w:val="Compact"/>
+        <w:numPr>
+          <w:ilvl w:val="0"/>
+          <w:numId w:val="1080"/>
+        </w:numPr>
+      </w:pPr>
+      <w:r>
+        <w:t xml:space="preserve">B-607-FIX (Claude Opus 5.5): #607 INT-607-1 (explicit membership rule in API + RLS helper, phantom-chain tests) + #609 T4 readiness (env registration, live RLS tests). Status: running since ~23:05.</w:t>
       </w:r>
     </w:p>
     <w:p>
@@ -6125,7 +6137,7 @@
         </w:numPr>
       </w:pPr>
       <w:r>
-        <w:t xml:space="preserve">backend #609 @5fd61a1b: BLOCKED, T3; verdicts at this head: -. C05 items 6-7: coach welcome message at complete +13 min, wo</w:t>
+        <w:t xml:space="preserve">backend #609 @5fd61a1b: UNSTABLE, T3; verdicts at this head: -. C05 items 6-7: coach welcome message at complete +13 min, wo</w:t>
       </w:r>
     </w:p>
     <w:p>
@@ -6137,7 +6149,7 @@
         </w:numPr>
       </w:pPr>
       <w:r>
-        <w:t xml:space="preserve">backend #610 @9e4b3795: BEHIND, T4; verdicts at this head: -. feat(community): UGC safety for App Review 1.2 (content filt</w:t>
+        <w:t xml:space="preserve">backend #610 @9e4b3795: BEHIND, T4; verdicts at this head: GPT-6.1 Sol:BLOCK. feat(community): UGC safety for App Review 1.2 (content filt</w:t>
       </w:r>
     </w:p>
     <w:p>
@@ -6281,7 +6293,7 @@
         </w:numPr>
       </w:pPr>
       <w:r>
-        <w:t xml:space="preserve">backend #624 @75a4e563: BEHIND, T4; verdicts at this head: GPT-6.1 Sol:APPROVE. S-ENVTRUTH: register every src/ env read, ENV REGISTRATION b</w:t>
+        <w:t xml:space="preserve">backend #624 @75a4e563: BEHIND, T4; verdicts at this head: GPT-6.1 Sol:APPROVE, Claude Opus 5.5:APPROVE. S-ENVTRUTH: register every src/ env read, ENV REGISTRATION b</w:t>
       </w:r>
     </w:p>
     <w:p>
@@ -6293,7 +6305,7 @@
         </w:numPr>
       </w:pPr>
       <w:r>
-        <w:t xml:space="preserve">backend #626 @d9be0c0d: CLEAN, T4; verdicts at this head: -. feat(ai-egress): R2b single AI egress gate enforcing the liv</w:t>
+        <w:t xml:space="preserve">backend #626 @d9be0c0d: CLEAN, T4; verdicts at this head: Claude Opus 5.5:APPROVE. feat(ai-egress): R2b single AI egress gate enforcing the liv</w:t>
       </w:r>
     </w:p>
     <w:p>
@@ -6317,7 +6329,7 @@
         </w:numPr>
       </w:pPr>
       <w:r>
-        <w:t xml:space="preserve">backend #628 @ba1d9480: BLOCKED, T4; verdicts at this head: -. fix(dunning-v2): live-ready 10-day lockout + native card upd</w:t>
+        <w:t xml:space="preserve">backend #628 @ba1d9480: CLEAN, T4; verdicts at this head: -. fix(dunning-v2): live-ready 10-day lockout + native card upd</w:t>
       </w:r>
     </w:p>
     <w:p>
@@ -6329,7 +6341,7 @@
         </w:numPr>
       </w:pPr>
       <w:r>
-        <w:t xml:space="preserve">backend #629 @858eb40b: CLEAN, T4; verdicts at this head: GPT-6.1 Sol:REQUEST CHANGES. feat(packages): paid packages start at $19.99, or exactly $0</w:t>
+        <w:t xml:space="preserve">backend #629 @858eb40b: CLEAN, T4; verdicts at this head: GPT-6.1 Sol:REQUEST CHANGES, Claude Opus 5.5:REQUEST CHANGES. feat(packages): paid packages start at $19.99, or exactly $0</w:t>
       </w:r>
     </w:p>
     <w:p>
@@ -6413,7 +6425,7 @@
         </w:numPr>
       </w:pPr>
       <w:r>
-        <w:t xml:space="preserve">mobile #314 @41d829d7: CLEAN, T4; verdicts at this head: -. feat(community): report, block, moderation actions and safet</w:t>
+        <w:t xml:space="preserve">mobile #314 @41d829d7: CLEAN, T4; verdicts at this head: GPT-6.1 Sol:REQUEST CHANGES. feat(community): report, block, moderation actions and safet</w:t>
       </w:r>
     </w:p>
     <w:p>
@@ -6449,7 +6461,7 @@
         </w:numPr>
       </w:pPr>
       <w:r>
-        <w:t xml:space="preserve">mobile #321 @a9b1f49d: CLEAN, T3; verdicts at this head: -. feat(packages): editor shows the $19.99 minimum or free rule</w:t>
+        <w:t xml:space="preserve">mobile #321 @a9b1f49d: CLEAN, T3; verdicts at this head: Claude Opus 5.5:REQUEST CHANGES. feat(packages): editor shows the $19.99 minimum or free rule</w:t>
       </w:r>
     </w:p>
     <w:p>
@@ -6461,7 +6473,7 @@
         </w:numPr>
       </w:pPr>
       <w:r>
-        <w:t xml:space="preserve">mobile #322 @8991ddf3: CLEAN, T4; verdicts at this head: -. feat(dunning): calm full-screen payment lockout + Days 0-9 b</w:t>
+        <w:t xml:space="preserve">mobile #322 @8991ddf3: CLEAN, T4; verdicts at this head: -. feat(dunning): payment lockout + Days 0-9 banner + native Up</w:t>
       </w:r>
     </w:p>
     <w:p>

</xml_diff>

<commit_message>
op 110: v5 operator prompt for agent 111 + lane reports (22:50 PDT)
</commit_message>
<xml_diff>
--- a/handoffs/op-f083060f/TGP-Operator-Prompt-v5-Agent-111.docx
+++ b/handoffs/op-f083060f/TGP-Operator-Prompt-v5-Agent-111.docx
@@ -30,7 +30,7 @@
         </w:r>
       </w:hyperlink>
       <w:r>
-        <w:t xml:space="preserve">) at Bradley's request (10-01 21:38: "keep progressing, updating the agent 110 prompt I gave you to reflect current state and issues - rename it agent 111 … for when your out of credits and retired happily!"). This snapshot: 2026-10-01 22:45 PDT (real clock). Agent 110 keeps regenerating it; the newest copy is in tgp-agent-context at handoffs/op-f083060f/TGP-Operator-Prompt-v5-Agent-111.md (and .docx). Paste this whole document as the first message to the next operator, and attach the same four owner documents plus docs.zip (section 3.4). It replaces prompt v4 (kept at handoffs/op-f083060f/TGP-Operator-Prompt-v4-Agent-110.md for history). Most of v4 is carried over word for word; the parts that changed are sections 0 (overarching facts, item 5), 2 (update note), 3, 4.13 (new), 5, 6.0 (110's lessons first), 7, 12 and 13.</w:t>
+        <w:t xml:space="preserve">) at Bradley's request (10-01 21:38: "keep progressing, updating the agent 110 prompt I gave you to reflect current state and issues - rename it agent 111 … for when your out of credits and retired happily!"). This snapshot: 2026-10-01 22:50 PDT (real clock). Agent 110 keeps regenerating it; the newest copy is in tgp-agent-context at handoffs/op-f083060f/TGP-Operator-Prompt-v5-Agent-111.md (and .docx). Paste this whole document as the first message to the next operator, and attach the same four owner documents plus docs.zip (section 3.4). It replaces prompt v4 (kept at handoffs/op-f083060f/TGP-Operator-Prompt-v4-Agent-110.md for history). Most of v4 is carried over word for word; the parts that changed are sections 0 (overarching facts, item 5), 2 (update note), 3, 4.13 (new), 5, 6.0 (110's lessons first), 7, 12 and 13.</w:t>
       </w:r>
     </w:p>
     <w:p>
@@ -1744,7 +1744,7 @@
         <w:pStyle w:val="FirstParagraph"/>
       </w:pPr>
       <w:r>
-        <w:t xml:space="preserve">UPDATE 10-01 20:17-22:45 (agent 110 era; sections 4.13 and 5 have the detail):</w:t>
+        <w:t xml:space="preserve">UPDATE 10-01 20:17-22:50 (agent 110 era; sections 4.13 and 5 have the detail):</w:t>
       </w:r>
     </w:p>
     <w:p>
@@ -5684,13 +5684,13 @@
         <w:t xml:space="preserve">The live, newest version of this section is the top of tgp-agent-context LAST_OPERATOR_STATE.md ("AGENT 110 TAKEOVER" + "Train log (agent 110)"). Agent 110 appends to that train log after every merge, deploy and lane result; if this prompt and the train log disagree, the train log wins.</w:t>
       </w:r>
     </w:p>
-    <w:bookmarkStart w:id="50" w:name="X921f3d4f378d1c96c7ba83a6d8906cc3644981a"/>
+    <w:bookmarkStart w:id="50" w:name="X5f24a27e7f20b1d9d3824d58882b746340d7e4d"/>
     <w:p>
       <w:pPr>
         <w:pStyle w:val="Heading3"/>
       </w:pPr>
       <w:r>
-        <w:t xml:space="preserve">AGENT 110 STATE FOR AGENT 111 — snapshot 2026-10-01 22:45 PDT (real clock)</w:t>
+        <w:t xml:space="preserve">AGENT 110 STATE FOR AGENT 111 — snapshot 2026-10-01 22:50 PDT (real clock)</w:t>
       </w:r>
     </w:p>
     <w:bookmarkStart w:id="43" w:name="production-and-mains"/>
@@ -5723,7 +5723,7 @@
         </w:numPr>
       </w:pPr>
       <w:r>
-        <w:t xml:space="preserve">Backend main: 4bcfb444 fix(wearables): S14 [T4] on-device lane - JWT-only subject, typed userId 400, on-device registration, contract fixture (#623). Mobile main: 0b7f197f feat(android): default closed-test builds to no Health Connect (#323). Required checks: backend 10 (build-and-test, rls-floor-guard, rls-live-tests, mwb-3-live-tests, npm audit (high+critical, whole graph), CodeQL JS/TS (javascript-typescript), Banned cast tokens (R75 / R100.A2), build-sbom, danger, Schema parity (migrations match schema.prisma)); mobile 3 (Typecheck, lint, test; Analyze (javascript-typescript); Analyze (actions)). Both strict ("require up to date"), enforce_admins true, 0 required reviews.</w:t>
+        <w:t xml:space="preserve">Backend main: 7a6cfd82 feat(ai-egress): R2b single AI egress gate enforcing the live box-2 AI consent grant (T4) (#626). Mobile main: 0b7f197f feat(android): default closed-test builds to no Health Connect (#323). Required checks: backend 10 (build-and-test, rls-floor-guard, rls-live-tests, mwb-3-live-tests, npm audit (high+critical, whole graph), CodeQL JS/TS (javascript-typescript), Banned cast tokens (R75 / R100.A2), build-sbom, danger, Schema parity (migrations match schema.prisma)); mobile 3 (Typecheck, lint, test; Analyze (javascript-typescript); Analyze (actions)). Both strict ("require up to date"), enforce_admins true, 0 required reviews.</w:t>
       </w:r>
     </w:p>
     <w:p>
@@ -5832,6 +5832,18 @@
         <w:t xml:space="preserve">backend #623 wearables ingest (T4): Sol + Opus delta APPROVE @32bde193; merged as 4bcfb444 (not deployed yet).</w:t>
       </w:r>
     </w:p>
+    <w:p>
+      <w:pPr>
+        <w:pStyle w:val="Compact"/>
+        <w:numPr>
+          <w:ilvl w:val="0"/>
+          <w:numId w:val="1079"/>
+        </w:numPr>
+      </w:pPr>
+      <w:r>
+        <w:t xml:space="preserve">backend #626 R2b single AI egress gate (T4): Opus (AUD-OPUS-2) + Sol APPROVE @d9be0c0d; merged as 7a6cfd82 (23:2x; NOT deployed: needs FEATURE_AI_CONSENT_LEDGER_ENABLED ON in the same window and no audited workflow can set it yet -&gt; lane B-FLAGS).</w:t>
+      </w:r>
+    </w:p>
     <w:bookmarkEnd w:id="44"/>
     <w:bookmarkStart w:id="45" w:name="Xb1516ea5eaf9578ee2bbc5f702e711473fc385c"/>
     <w:p>
@@ -5911,7 +5923,7 @@
         </w:numPr>
       </w:pPr>
       <w:r>
-        <w:t xml:space="preserve">S-DUNNING-R2 (Claude Opus 5.5): #628/#322: 1A, 2A, native update-card (OR-110-2). Status: running; opened #633 (FEATURE_DUNNING_V2 flags-workflow input, T4); migration 20270215000000.</w:t>
+        <w:t xml:space="preserve">S-DUNNING-R2 (Claude Opus 5.5): dunning 1A/2A + native card. Status: DONE ~23:15. backend #628 -&gt; ba1d9480 (CI green, migration 20270215000000), mobile #322 -&gt; 8991ddf (CI green), flags PR #633 @850ec148 (Sol + Opus REQUEST CHANGES, B-633-1; to be superseded by B-FLAGS manifest). Audits of #628/#322 queued (AUD-OPUS first, then Sol). Stripe live settings list for the owner in reports/S-DUNNING.md (section 7 here).</w:t>
       </w:r>
     </w:p>
     <w:p>
@@ -6007,7 +6019,19 @@
         </w:numPr>
       </w:pPr>
       <w:r>
-        <w:t xml:space="preserve">Queued lane objectives (not launched): S-ERRORS (#324 B-324-1 + slices; also switch mobile errorCode() to read</w:t>
+        <w:t xml:space="preserve">B-FEE-R4 (Claude Opus 5.5): fix round 4 on #627 (Sol B-627-2..5 + Opus B), #629, mobile #321. Status: running since ~23:25.</w:t>
+      </w:r>
+    </w:p>
+    <w:p>
+      <w:pPr>
+        <w:pStyle w:val="Compact"/>
+        <w:numPr>
+          <w:ilvl w:val="0"/>
+          <w:numId w:val="1080"/>
+        </w:numPr>
+      </w:pPr>
+      <w:r>
+        <w:t xml:space="preserve">Queued lane objectives (written, not launched; next free builder slots in this order): B-UGC-2 (#610 Sol BLOCK A-610-1/2 + B, #314 B-314-2..5 incl. real native recorder/playback), B-FLAGS (prod-switch desired-state manifest on #624 = the one audited path to set day-1 flags; supersede #633; shellcheck SC2015 fix), B-CONSENT-COPY (R-626-1: consent copy says chats kept 180 days, owner said forever; #310 copy; #611 fix round), S-ERRORS (#324 B-324-1 + slices; mobile errorCode() reads</w:t>
       </w:r>
       <w:r>
         <w:t xml:space="preserve"> </w:t>
@@ -6019,7 +6043,7 @@
         <w:t xml:space="preserve">code</w:t>
       </w:r>
       <w:r>
-        <w:t xml:space="preserve">); small CI fix for shellcheck SC2015 in scripts/s10-core-diff-gate.sh (T4 gate script).</w:t>
+        <w:t xml:space="preserve">).</w:t>
       </w:r>
     </w:p>
     <w:bookmarkEnd w:id="45"/>
@@ -6041,7 +6065,7 @@
         </w:numPr>
       </w:pPr>
       <w:r>
-        <w:t xml:space="preserve">backend #598 @2c7b1de8: DIRTY, T2; verdicts at this head: -. feat(roman): model config, boot probe, /health/roman and hon</w:t>
+        <w:t xml:space="preserve">backend #598 @2c7b1de8: UNKNOWN, T2; verdicts at this head: -. feat(roman): model config, boot probe, /health/roman and hon</w:t>
       </w:r>
     </w:p>
     <w:p>
@@ -6053,7 +6077,7 @@
         </w:numPr>
       </w:pPr>
       <w:r>
-        <w:t xml:space="preserve">backend #601 @d767f65c: DIRTY, T4; verdicts at this head: -. feat(roman): AI processing consent record + server-side enfo</w:t>
+        <w:t xml:space="preserve">backend #601 @d767f65c: UNKNOWN, T4; verdicts at this head: -. feat(roman): AI processing consent record + server-side enfo</w:t>
       </w:r>
     </w:p>
     <w:p>
@@ -6065,7 +6089,7 @@
         </w:numPr>
       </w:pPr>
       <w:r>
-        <w:t xml:space="preserve">backend #602 @bb5f13b0: DIRTY, T4; verdicts at this head: -. feat(roman): RomanClientContext builder + per-turn grounding</w:t>
+        <w:t xml:space="preserve">backend #602 @bb5f13b0: UNKNOWN, T4; verdicts at this head: -. feat(roman): RomanClientContext builder + per-turn grounding</w:t>
       </w:r>
     </w:p>
     <w:p>
@@ -6077,7 +6101,7 @@
         </w:numPr>
       </w:pPr>
       <w:r>
-        <w:t xml:space="preserve">backend #603 @75c4a181: BEHIND, T3; verdicts at this head: -. feat(roman): guardrail contract, deterministic safety router</w:t>
+        <w:t xml:space="preserve">backend #603 @75c4a181: UNKNOWN, T3; verdicts at this head: -. feat(roman): guardrail contract, deterministic safety router</w:t>
       </w:r>
     </w:p>
     <w:p>
@@ -6089,7 +6113,7 @@
         </w:numPr>
       </w:pPr>
       <w:r>
-        <w:t xml:space="preserve">backend #604 @87d09b1d: CLEAN, T4; verdicts at this head: -. fix(throttler): isolate named throttlers to their routes, pu</w:t>
+        <w:t xml:space="preserve">backend #604 @12a4d423: BLOCKED, T4; verdicts at this head: -. fix(throttler): isolate named throttlers to their routes, pu</w:t>
       </w:r>
     </w:p>
     <w:p>
@@ -6101,7 +6125,7 @@
         </w:numPr>
       </w:pPr>
       <w:r>
-        <w:t xml:space="preserve">backend #605 @686d0888: DIRTY, T2; verdicts at this head: -. test(roman): eval harness — G1–G30 golden set, six CI layers</w:t>
+        <w:t xml:space="preserve">backend #605 @686d0888: UNKNOWN, T2; verdicts at this head: -. test(roman): eval harness — G1–G30 golden set, six CI layers</w:t>
       </w:r>
     </w:p>
     <w:p>
@@ -6113,7 +6137,7 @@
         </w:numPr>
       </w:pPr>
       <w:r>
-        <w:t xml:space="preserve">backend #607 @d6ac47e8: UNSTABLE, T4; verdicts at this head: -. C05/C07: consultation intake, idempotent onboarding complete</w:t>
+        <w:t xml:space="preserve">backend #607 @d6ac47e8: UNKNOWN, T4; verdicts at this head: -. C05/C07: consultation intake, idempotent onboarding complete</w:t>
       </w:r>
     </w:p>
     <w:p>
@@ -6125,7 +6149,7 @@
         </w:numPr>
       </w:pPr>
       <w:r>
-        <w:t xml:space="preserve">backend #608 @2759e1a0: BEHIND, T4; verdicts at this head: GPT-6.1 Sol:REQUEST CHANGES. fix(account-deletion): in-app deletion completes on re-auth,</w:t>
+        <w:t xml:space="preserve">backend #608 @2759e1a0: UNKNOWN, T4; verdicts at this head: GPT-6.1 Sol:REQUEST CHANGES, Claude Opus 5.5:APPROVE. fix(account-deletion): in-app deletion completes on re-auth,</w:t>
       </w:r>
     </w:p>
     <w:p>
@@ -6137,7 +6161,7 @@
         </w:numPr>
       </w:pPr>
       <w:r>
-        <w:t xml:space="preserve">backend #609 @5fd61a1b: UNSTABLE, T3; verdicts at this head: -. C05 items 6-7: coach welcome message at complete +13 min, wo</w:t>
+        <w:t xml:space="preserve">backend #609 @5fd61a1b: UNKNOWN, T3; verdicts at this head: -. C05 items 6-7: coach welcome message at complete +13 min, wo</w:t>
       </w:r>
     </w:p>
     <w:p>
@@ -6149,7 +6173,7 @@
         </w:numPr>
       </w:pPr>
       <w:r>
-        <w:t xml:space="preserve">backend #610 @9e4b3795: BEHIND, T4; verdicts at this head: GPT-6.1 Sol:BLOCK. feat(community): UGC safety for App Review 1.2 (content filt</w:t>
+        <w:t xml:space="preserve">backend #610 @9e4b3795: UNKNOWN, T4; verdicts at this head: GPT-6.1 Sol:BLOCK. feat(community): UGC safety for App Review 1.2 (content filt</w:t>
       </w:r>
     </w:p>
     <w:p>
@@ -6161,7 +6185,7 @@
         </w:numPr>
       </w:pPr>
       <w:r>
-        <w:t xml:space="preserve">backend #611 @e5777735: BEHIND, T3; verdicts at this head: GPT-6.1 Sol:REQUEST CHANGES. feat(public-pages): accurate privacy policy, consumer health</w:t>
+        <w:t xml:space="preserve">backend #611 @e5777735: UNKNOWN, T3; verdicts at this head: GPT-6.1 Sol:REQUEST CHANGES. feat(public-pages): accurate privacy policy, consumer health</w:t>
       </w:r>
     </w:p>
     <w:p>
@@ -6173,7 +6197,7 @@
         </w:numPr>
       </w:pPr>
       <w:r>
-        <w:t xml:space="preserve">backend #612 @2855141e: BEHIND, ?; verdicts at this head: -. chore(deps): bump @nestjs/testing from 11.1.26 to 12.1.1</w:t>
+        <w:t xml:space="preserve">backend #612 @2855141e: UNKNOWN, ?; verdicts at this head: -. chore(deps): bump @nestjs/testing from 11.1.26 to 12.1.1</w:t>
       </w:r>
     </w:p>
     <w:p>
@@ -6185,7 +6209,7 @@
         </w:numPr>
       </w:pPr>
       <w:r>
-        <w:t xml:space="preserve">backend #613 @8593a09b: BEHIND, ?; verdicts at this head: -. chore(deps): bump @types/node from 26.0.0 to 26.6.3</w:t>
+        <w:t xml:space="preserve">backend #613 @8593a09b: UNKNOWN, ?; verdicts at this head: -. chore(deps): bump @types/node from 26.0.0 to 26.6.3</w:t>
       </w:r>
     </w:p>
     <w:p>
@@ -6197,7 +6221,7 @@
         </w:numPr>
       </w:pPr>
       <w:r>
-        <w:t xml:space="preserve">backend #614 @6572ccfd: BEHIND, ?; verdicts at this head: -. chore(deps): bump ts-jest from 29.4.9 to 29.4.14</w:t>
+        <w:t xml:space="preserve">backend #614 @6572ccfd: UNKNOWN, ?; verdicts at this head: -. chore(deps): bump ts-jest from 29.4.9 to 29.4.14</w:t>
       </w:r>
     </w:p>
     <w:p>
@@ -6209,7 +6233,7 @@
         </w:numPr>
       </w:pPr>
       <w:r>
-        <w:t xml:space="preserve">backend #615 @f38569fb: BEHIND, ?; verdicts at this head: -. chore(deps): bump js-yaml from 4.3.2 to 5.4.2</w:t>
+        <w:t xml:space="preserve">backend #615 @f38569fb: UNKNOWN, ?; verdicts at this head: -. chore(deps): bump js-yaml from 4.3.2 to 5.4.2</w:t>
       </w:r>
     </w:p>
     <w:p>
@@ -6221,7 +6245,7 @@
         </w:numPr>
       </w:pPr>
       <w:r>
-        <w:t xml:space="preserve">backend #616 @a3d76527: BEHIND, ?; verdicts at this head: -. chore(deps): bump @aws-sdk/client-s3 from 3.1071.0 to 3.1141</w:t>
+        <w:t xml:space="preserve">backend #616 @a3d76527: UNKNOWN, ?; verdicts at this head: -. chore(deps): bump @aws-sdk/client-s3 from 3.1071.0 to 3.1141</w:t>
       </w:r>
     </w:p>
     <w:p>
@@ -6233,7 +6257,7 @@
         </w:numPr>
       </w:pPr>
       <w:r>
-        <w:t xml:space="preserve">backend #617 @be6c957a: BEHIND, ?; verdicts at this head: -. chore(deps): bump posthog-node from 5.36.8 to 5.54.1</w:t>
+        <w:t xml:space="preserve">backend #617 @be6c957a: UNKNOWN, ?; verdicts at this head: -. chore(deps): bump posthog-node from 5.36.8 to 5.54.1</w:t>
       </w:r>
     </w:p>
     <w:p>
@@ -6245,7 +6269,7 @@
         </w:numPr>
       </w:pPr>
       <w:r>
-        <w:t xml:space="preserve">backend #618 @8d612b72: BEHIND, ?; verdicts at this head: -. chore(deps): bump @nestjs/cli from 11.0.21 to 12.0.8</w:t>
+        <w:t xml:space="preserve">backend #618 @8d612b72: UNKNOWN, ?; verdicts at this head: -. chore(deps): bump @nestjs/cli from 11.0.21 to 12.0.8</w:t>
       </w:r>
     </w:p>
     <w:p>
@@ -6257,7 +6281,7 @@
         </w:numPr>
       </w:pPr>
       <w:r>
-        <w:t xml:space="preserve">backend #619 @e53a0688: BEHIND, ?; verdicts at this head: -. chore(deps): bump @nestjs/platform-express from 11.1.26 to 1</w:t>
+        <w:t xml:space="preserve">backend #619 @e53a0688: UNKNOWN, ?; verdicts at this head: -. chore(deps): bump @nestjs/platform-express from 11.1.26 to 1</w:t>
       </w:r>
     </w:p>
     <w:p>
@@ -6269,7 +6293,7 @@
         </w:numPr>
       </w:pPr>
       <w:r>
-        <w:t xml:space="preserve">backend #620 @aa9a0126: BEHIND, ?; verdicts at this head: -. chore(deps): bump @supabase/supabase-js from 2.108.1 to 2.11</w:t>
+        <w:t xml:space="preserve">backend #620 @aa9a0126: UNKNOWN, ?; verdicts at this head: -. chore(deps): bump @supabase/supabase-js from 2.108.1 to 2.11</w:t>
       </w:r>
     </w:p>
     <w:p>
@@ -6281,7 +6305,7 @@
         </w:numPr>
       </w:pPr>
       <w:r>
-        <w:t xml:space="preserve">backend #621 @1a7b6c26: BEHIND, ?; verdicts at this head: -. chore(deps): bump @nestjs/common from 11.1.26 to 12.1.1</w:t>
+        <w:t xml:space="preserve">backend #621 @1a7b6c26: UNKNOWN, ?; verdicts at this head: -. chore(deps): bump @nestjs/common from 11.1.26 to 12.1.1</w:t>
       </w:r>
     </w:p>
     <w:p>
@@ -6293,7 +6317,7 @@
         </w:numPr>
       </w:pPr>
       <w:r>
-        <w:t xml:space="preserve">backend #624 @75a4e563: BEHIND, T4; verdicts at this head: GPT-6.1 Sol:APPROVE, Claude Opus 5.5:APPROVE. S-ENVTRUTH: register every src/ env read, ENV REGISTRATION b</w:t>
+        <w:t xml:space="preserve">backend #624 @e3e0a314: BLOCKED, T4; verdicts at this head: -. S-ENVTRUTH: register every src/ env read, ENV REGISTRATION b</w:t>
       </w:r>
     </w:p>
     <w:p>
@@ -6305,7 +6329,7 @@
         </w:numPr>
       </w:pPr>
       <w:r>
-        <w:t xml:space="preserve">backend #626 @d9be0c0d: CLEAN, T4; verdicts at this head: Claude Opus 5.5:APPROVE. feat(ai-egress): R2b single AI egress gate enforcing the liv</w:t>
+        <w:t xml:space="preserve">backend #627 @2c57cc41: BEHIND, T4; verdicts at this head: GPT-6.1 Sol:REQUEST CHANGES, Claude Opus 5.5:REQUEST CHANGES. fix(billing): coach payout = price - actual Stripe fee - 2%</w:t>
       </w:r>
     </w:p>
     <w:p>
@@ -6317,7 +6341,7 @@
         </w:numPr>
       </w:pPr>
       <w:r>
-        <w:t xml:space="preserve">backend #627 @2c57cc41: CLEAN, T4; verdicts at this head: GPT-6.1 Sol:REQUEST CHANGES, Claude Opus 5.5:REQUEST CHANGES. fix(billing): coach payout = price - actual Stripe fee - 2%</w:t>
+        <w:t xml:space="preserve">backend #628 @ba1d9480: UNKNOWN, T4; verdicts at this head: -. fix(dunning-v2): live-ready 10-day lockout + native card upd</w:t>
       </w:r>
     </w:p>
     <w:p>
@@ -6329,7 +6353,7 @@
         </w:numPr>
       </w:pPr>
       <w:r>
-        <w:t xml:space="preserve">backend #628 @ba1d9480: CLEAN, T4; verdicts at this head: -. fix(dunning-v2): live-ready 10-day lockout + native card upd</w:t>
+        <w:t xml:space="preserve">backend #629 @858eb40b: BEHIND, T4; verdicts at this head: GPT-6.1 Sol:REQUEST CHANGES, Claude Opus 5.5:REQUEST CHANGES. feat(packages): paid packages start at $19.99, or exactly $0</w:t>
       </w:r>
     </w:p>
     <w:p>
@@ -6341,7 +6365,7 @@
         </w:numPr>
       </w:pPr>
       <w:r>
-        <w:t xml:space="preserve">backend #629 @858eb40b: CLEAN, T4; verdicts at this head: GPT-6.1 Sol:REQUEST CHANGES, Claude Opus 5.5:REQUEST CHANGES. feat(packages): paid packages start at $19.99, or exactly $0</w:t>
+        <w:t xml:space="preserve">backend #632 @0ae744b6: BLOCKED, T2; verdicts at this head: -. S-SCHED: explicit booking reminders and safe C04 appointment</w:t>
       </w:r>
     </w:p>
     <w:p>
@@ -6353,7 +6377,7 @@
         </w:numPr>
       </w:pPr>
       <w:r>
-        <w:t xml:space="preserve">backend #632 @4accdbc3: BEHIND, T2; verdicts at this head: GPT-6.1 Sol:APPROVE. S-SCHED: explicit booking reminders and safe C04 appointment</w:t>
+        <w:t xml:space="preserve">backend #633 @850ec148: UNKNOWN, T4; verdicts at this head: GPT-6.1 Sol:REQUEST CHANGES, Claude Opus 5.5:REQUEST CHANGES. ci(flags): FEATURE_DUNNING_V2 closed-choice input for the Fl</w:t>
       </w:r>
     </w:p>
     <w:p>
@@ -6365,7 +6389,7 @@
         </w:numPr>
       </w:pPr>
       <w:r>
-        <w:t xml:space="preserve">backend #633 @850ec148: UNSTABLE, T4; verdicts at this head: GPT-6.1 Sol:REQUEST CHANGES. ci(flags): FEATURE_DUNNING_V2 closed-choice input for the Fl</w:t>
+        <w:t xml:space="preserve">mobile #305 @45787152: CLEAN (base clinic/m2-core-polish), T3; verdicts at this head: -. clinic/m3: expo-updates (EAS Update, fingerprint runtime, ch</w:t>
       </w:r>
     </w:p>
     <w:p>
@@ -6377,19 +6401,7 @@
         </w:numPr>
       </w:pPr>
       <w:r>
-        <w:t xml:space="preserve">mobile #305 @45787152: CLEAN (base clinic/m2-core-polish), T3; verdicts at this head: -. clinic/m3: expo-updates (EAS Update, fingerprint runtime, ch</w:t>
-      </w:r>
-    </w:p>
-    <w:p>
-      <w:pPr>
-        <w:pStyle w:val="Compact"/>
-        <w:numPr>
-          <w:ilvl w:val="0"/>
-          <w:numId w:val="1081"/>
-        </w:numPr>
-      </w:pPr>
-      <w:r>
-        <w:t xml:space="preserve">mobile #310 @e1dbe7f9: CLEAN, T4; verdicts at this head: -. feat(onboarding): config-driven consultation onboarding behi</w:t>
+        <w:t xml:space="preserve">mobile #310 @e1dbe7f9: CLEAN, T4; verdicts at this head: Claude Opus 5.5:REQUEST CHANGES. feat(onboarding): config-driven consultation onboarding behi</w:t>
       </w:r>
     </w:p>
     <w:p>
@@ -6520,7 +6532,7 @@
         </w:numPr>
       </w:pPr>
       <w:r>
-        <w:t xml:space="preserve">mobile #326 @32ed8546: CLEAN, T4; verdicts at this head: -. fix(ai): handle ai_consent_required and ai_egress_blocked on</w:t>
+        <w:t xml:space="preserve">mobile #326 @32ed8546: CLEAN, T4; verdicts at this head: GPT-6.1 Sol:REQUEST CHANGES, Claude Opus 5.5:REQUEST CHANGES. fix(ai): handle ai_consent_required and ai_egress_blocked on</w:t>
       </w:r>
     </w:p>
     <w:p>
@@ -7435,6 +7447,30 @@
       </w:pPr>
       <w:r>
         <w:t xml:space="preserve">DECISION NEEDED (from B-FEE-R3, 10-01 ~22:05): on a full refund or lost dispute, #627 nets the recovery now and claws it back from the coach's future transfers; if the coach has no future transfers, TGP is out of pocket, which breaks "TGP never loses money". Options: A) enable Stripe Connect account debits (recover from the coach's bank) for that residual case; B) hold a small rolling reserve from coach payouts. Operator recommendation: A (no change to normal payouts); until he answers, ship #627 as built (the residual case needs a refund larger than the coach's pending + future balance).</w:t>
+      </w:r>
+    </w:p>
+    <w:p>
+      <w:pPr>
+        <w:pStyle w:val="Compact"/>
+        <w:numPr>
+          <w:ilvl w:val="0"/>
+          <w:numId w:val="1092"/>
+        </w:numPr>
+      </w:pPr>
+      <w:r>
+        <w:t xml:space="preserve">DECISION NEEDED (from S-DUNNING-R2): Apple Pay / Google Pay in the native card sheet. Operator recommendation: yes for launch (owner fact 4: more functionality); needs an Apple Pay merchant ID in Apple Developer (owner action, free) and an app-config change; until he answers, cards only.</w:t>
+      </w:r>
+    </w:p>
+    <w:p>
+      <w:pPr>
+        <w:pStyle w:val="Compact"/>
+        <w:numPr>
+          <w:ilvl w:val="0"/>
+          <w:numId w:val="1092"/>
+        </w:numPr>
+      </w:pPr>
+      <w:r>
+        <w:t xml:space="preserve">OWNER ACTIONS, Stripe live dashboard (from S-DUNNING-R2; do when #628 deploys): custom retry schedule Days 1/3/7 (not Smart Retries); after final retry leave subscription past-due; turn off Stripe failed-payment and 3DS emails only once TGP email transport is live; customer portal for older builds only (update payment method on, cancel at period end, no proration); Fly STRIPE_PUBLISHABLE_KEY = the pk_live key matching the live secret.</w:t>
       </w:r>
     </w:p>
     <w:p>

</xml_diff>

<commit_message>
op 110: v5 operator prompt for agent 111 + lane reports (22:51 PDT)
</commit_message>
<xml_diff>
--- a/handoffs/op-f083060f/TGP-Operator-Prompt-v5-Agent-111.docx
+++ b/handoffs/op-f083060f/TGP-Operator-Prompt-v5-Agent-111.docx
@@ -30,7 +30,7 @@
         </w:r>
       </w:hyperlink>
       <w:r>
-        <w:t xml:space="preserve">) at Bradley's request (10-01 21:38: "keep progressing, updating the agent 110 prompt I gave you to reflect current state and issues - rename it agent 111 … for when your out of credits and retired happily!"). This snapshot: 2026-10-01 22:50 PDT (real clock). Agent 110 keeps regenerating it; the newest copy is in tgp-agent-context at handoffs/op-f083060f/TGP-Operator-Prompt-v5-Agent-111.md (and .docx). Paste this whole document as the first message to the next operator, and attach the same four owner documents plus docs.zip (section 3.4). It replaces prompt v4 (kept at handoffs/op-f083060f/TGP-Operator-Prompt-v4-Agent-110.md for history). Most of v4 is carried over word for word; the parts that changed are sections 0 (overarching facts, item 5), 2 (update note), 3, 4.13 (new), 5, 6.0 (110's lessons first), 7, 12 and 13.</w:t>
+        <w:t xml:space="preserve">) at Bradley's request (10-01 21:38: "keep progressing, updating the agent 110 prompt I gave you to reflect current state and issues - rename it agent 111 … for when your out of credits and retired happily!"). This snapshot: 2026-10-01 22:51 PDT (real clock). Agent 110 keeps regenerating it; the newest copy is in tgp-agent-context at handoffs/op-f083060f/TGP-Operator-Prompt-v5-Agent-111.md (and .docx). Paste this whole document as the first message to the next operator, and attach the same four owner documents plus docs.zip (section 3.4). It replaces prompt v4 (kept at handoffs/op-f083060f/TGP-Operator-Prompt-v4-Agent-110.md for history). Most of v4 is carried over word for word; the parts that changed are sections 0 (overarching facts, item 5), 2 (update note), 3, 4.13 (new), 5, 6.0 (110's lessons first), 7, 12 and 13.</w:t>
       </w:r>
     </w:p>
     <w:p>
@@ -1744,7 +1744,7 @@
         <w:pStyle w:val="FirstParagraph"/>
       </w:pPr>
       <w:r>
-        <w:t xml:space="preserve">UPDATE 10-01 20:17-22:50 (agent 110 era; sections 4.13 and 5 have the detail):</w:t>
+        <w:t xml:space="preserve">UPDATE 10-01 20:17-22:51 (agent 110 era; sections 4.13 and 5 have the detail):</w:t>
       </w:r>
     </w:p>
     <w:p>
@@ -5684,13 +5684,13 @@
         <w:t xml:space="preserve">The live, newest version of this section is the top of tgp-agent-context LAST_OPERATOR_STATE.md ("AGENT 110 TAKEOVER" + "Train log (agent 110)"). Agent 110 appends to that train log after every merge, deploy and lane result; if this prompt and the train log disagree, the train log wins.</w:t>
       </w:r>
     </w:p>
-    <w:bookmarkStart w:id="50" w:name="X5f24a27e7f20b1d9d3824d58882b746340d7e4d"/>
+    <w:bookmarkStart w:id="50" w:name="X780760761b3572c4b90aac2b654741d660f6dfc"/>
     <w:p>
       <w:pPr>
         <w:pStyle w:val="Heading3"/>
       </w:pPr>
       <w:r>
-        <w:t xml:space="preserve">AGENT 110 STATE FOR AGENT 111 — snapshot 2026-10-01 22:50 PDT (real clock)</w:t>
+        <w:t xml:space="preserve">AGENT 110 STATE FOR AGENT 111 — snapshot 2026-10-01 22:51 PDT (real clock)</w:t>
       </w:r>
     </w:p>
     <w:bookmarkStart w:id="43" w:name="production-and-mains"/>
@@ -5841,7 +5841,7 @@
         </w:numPr>
       </w:pPr>
       <w:r>
-        <w:t xml:space="preserve">backend #626 R2b single AI egress gate (T4): Opus (AUD-OPUS-2) + Sol APPROVE @d9be0c0d; merged as 7a6cfd82 (23:2x; NOT deployed: needs FEATURE_AI_CONSENT_LEDGER_ENABLED ON in the same window and no audited workflow can set it yet -&gt; lane B-FLAGS).</w:t>
+        <w:t xml:space="preserve">backend #626 R2b single AI egress gate (T4): Opus (AUD-OPUS-2) + Sol APPROVE @d9be0c0d; merged as 7a6cfd82 (22:48; NOT deployed: needs FEATURE_AI_CONSENT_LEDGER_ENABLED ON in the same window and no audited workflow can set it yet -&gt; lane B-FLAGS).</w:t>
       </w:r>
     </w:p>
     <w:bookmarkEnd w:id="44"/>
@@ -5899,7 +5899,7 @@
         </w:numPr>
       </w:pPr>
       <w:r>
-        <w:t xml:space="preserve">B-FIX2 (Claude Opus 5.5): T4 fix rounds. Status: DONE ~22:50. backend #624 -&gt; 75a4e563 (B-624-3: no flyctl output printed at all), backend #608 -&gt; 2759e1a0 (B-608-11: durable cleanup record + nightly retry, migration 20270220000000), mobile #313 -&gt; 1e80017 (merge-only; test conflict), mobile #310 -&gt; e1dbe7f (B-310-5 + consultation flag declared in config/expected-env.json, T4 data). CI green except non-required shellcheck SC2015 in scripts/s10-core-diff-gate.sh (fails on main too; fix it — unassigned). Merge order note C-310-10: whichever of #313/#310 lands second keeps #310's consultation-draft purge. 108 WIP 8bdb5997 holds the env desired-state manifest #624 lacks (follow-up).</w:t>
+        <w:t xml:space="preserve">B-FIX2 (Claude Opus 5.5): T4 fix rounds. Status: DONE 22:37. backend #624 -&gt; 75a4e563 (B-624-3: no flyctl output printed at all), backend #608 -&gt; 2759e1a0 (B-608-11: durable cleanup record + nightly retry, migration 20270220000000), mobile #313 -&gt; 1e80017 (merge-only; test conflict), mobile #310 -&gt; e1dbe7f (B-310-5 + consultation flag declared in config/expected-env.json, T4 data). CI green except non-required shellcheck SC2015 in scripts/s10-core-diff-gate.sh (fails on main too; fix it — unassigned). Merge order note C-310-10: whichever of #313/#310 lands second keeps #310's consultation-draft purge. 108 WIP 8bdb5997 holds the env desired-state manifest #624 lacks (follow-up).</w:t>
       </w:r>
     </w:p>
     <w:p>
@@ -5911,7 +5911,7 @@
         </w:numPr>
       </w:pPr>
       <w:r>
-        <w:t xml:space="preserve">B-UGC (Claude Opus 5.5): #610/#314 fix rounds + voice-note reporting + wins safety. Status: DONE ~22:30. backend #610 -&gt; 9e4b3795, mobile #314 -&gt; 41d829d, all CI green; all findings closed except C-610-4 (CI test DB = CI-gate change, deferred); voice: report target (migration 20270211000000), queue playback, 24h deadline, hide/warn/ban, block both ways, author delete, DM voice refused; fixed a bug where every voice-note create returned 400. Awaiting dual audit; voice flags stay off until audits + device pass.</w:t>
+        <w:t xml:space="preserve">B-UGC (Claude Opus 5.5): #610/#314 fix rounds + voice-note reporting + wins safety. Status: DONE 22:25. backend #610 -&gt; 9e4b3795, mobile #314 -&gt; 41d829d, all CI green; all findings closed except C-610-4 (CI test DB = CI-gate change, deferred); voice: report target (migration 20270211000000), queue playback, 24h deadline, hide/warn/ban, block both ways, author delete, DM voice refused; fixed a bug where every voice-note create returned 400. Awaiting dual audit; voice flags stay off until audits + device pass.</w:t>
       </w:r>
     </w:p>
     <w:p>
@@ -5923,7 +5923,7 @@
         </w:numPr>
       </w:pPr>
       <w:r>
-        <w:t xml:space="preserve">S-DUNNING-R2 (Claude Opus 5.5): dunning 1A/2A + native card. Status: DONE ~23:15. backend #628 -&gt; ba1d9480 (CI green, migration 20270215000000), mobile #322 -&gt; 8991ddf (CI green), flags PR #633 @850ec148 (Sol + Opus REQUEST CHANGES, B-633-1; to be superseded by B-FLAGS manifest). Audits of #628/#322 queued (AUD-OPUS first, then Sol). Stripe live settings list for the owner in reports/S-DUNNING.md (section 7 here).</w:t>
+        <w:t xml:space="preserve">S-DUNNING-R2 (Claude Opus 5.5): dunning 1A/2A + native card. Status: DONE 22:47. backend #628 -&gt; ba1d9480 (CI green, migration 20270215000000), mobile #322 -&gt; 8991ddf (CI green), flags PR #633 @850ec148 (Sol + Opus REQUEST CHANGES, B-633-1; to be superseded by B-FLAGS manifest). Audits of #628/#322 queued (AUD-OPUS first, then Sol). Stripe live settings list for the owner in reports/S-DUNNING.md (section 7 here).</w:t>
       </w:r>
     </w:p>
     <w:p>
@@ -5935,7 +5935,7 @@
         </w:numPr>
       </w:pPr>
       <w:r>
-        <w:t xml:space="preserve">B-FEE-R3 (Claude Opus 5.5): #627 B-627-1/2; #629; mobile #321. Status: DONE 22:0x. #627 -&gt; 2c57cc41, #629 -&gt; 858eb40b (promoted T4: migration 20270216000000 first_published_at), mobile #321 -&gt; a9b1f49d; all CI green, all 5 findings closed; awaiting audits (Sol + Opus on #627/#629, Opus on #321). Open owner decision: refund/dispute recovery (see 7).</w:t>
+        <w:t xml:space="preserve">B-FEE-R3 (Claude Opus 5.5): #627 B-627-1/2; #629; mobile #321. Status: DONE 22:20. #627 -&gt; 2c57cc41, #629 -&gt; 858eb40b (promoted T4: migration 20270216000000 first_published_at), mobile #321 -&gt; a9b1f49d; all CI green, all 5 findings closed; awaiting audits (Sol + Opus on #627/#629, Opus on #321). Open owner decision: refund/dispute recovery (see 7).</w:t>
       </w:r>
     </w:p>
     <w:p>
@@ -5959,7 +5959,7 @@
         </w:numPr>
       </w:pPr>
       <w:r>
-        <w:t xml:space="preserve">B-R2B-2 (Claude Opus 5.5): #626 B-626-2 + mobile AI-consent errors. Status: DONE ~22:45. backend #626 -&gt; d9be0c0d (B-626-2 + C-626-4 fixed; two main merges; PR title renamed feat(ai-egress) for danger), NEW mobile #326 @32ed8546 (both refusal codes on every AI surface), CI green. Merge order: #626 before #326; #310 and #326 in either order. FEATURE_AI_CONSENT_LEDGER_ENABLED must go ON with the #626 deploy (operator ruling OR-110-4; else every client sees "AI help is off").</w:t>
+        <w:t xml:space="preserve">B-R2B-2 (Claude Opus 5.5): #626 B-626-2 + mobile AI-consent errors. Status: DONE 22:35. backend #626 -&gt; d9be0c0d (B-626-2 + C-626-4 fixed; two main merges; PR title renamed feat(ai-egress) for danger), NEW mobile #326 @32ed8546 (both refusal codes on every AI surface), CI green. Merge order: #626 before #326; #310 and #326 in either order. FEATURE_AI_CONSENT_LEDGER_ENABLED must go ON with the #626 deploy (operator ruling OR-110-4; else every client sees "AI help is off").</w:t>
       </w:r>
     </w:p>
     <w:p>
@@ -5971,7 +5971,7 @@
         </w:numPr>
       </w:pPr>
       <w:r>
-        <w:t xml:space="preserve">B-TRAIN-2 (Claude Opus 5.5): forward merges. Status: DONE ~23:00. #604 -&gt; 87d09b1d (merge-only, patch-id proof; delta audits queued to Sol + AUD-OPUS), #607 -&gt; d6ac47e8 (migration renamed 20270212000000; INT-607-1 tenancy finding -&gt; B-607-FIX), #609 -&gt; 5fd61a1b (migration renamed 20270213000000; re-grade T4). PR body edits were refused by the safety check (ready texts in reports/btrain2/; operator retry also refused -&gt; left to B-607-FIX / morning).</w:t>
+        <w:t xml:space="preserve">B-TRAIN-2 (Claude Opus 5.5): forward merges. Status: DONE 22:45. #604 -&gt; 87d09b1d (merge-only, patch-id proof; delta audits queued to Sol + AUD-OPUS), #607 -&gt; d6ac47e8 (migration renamed 20270212000000; INT-607-1 tenancy finding -&gt; B-607-FIX), #609 -&gt; 5fd61a1b (migration renamed 20270213000000; re-grade T4). PR body edits were refused by the safety check (ready texts in reports/btrain2/; operator retry also refused -&gt; left to B-607-FIX / morning).</w:t>
       </w:r>
     </w:p>
     <w:p>
@@ -5983,7 +5983,7 @@
         </w:numPr>
       </w:pPr>
       <w:r>
-        <w:t xml:space="preserve">B-607-FIX (Claude Opus 5.5): #607 INT-607-1 (explicit membership rule in API + RLS helper, phantom-chain tests) + #609 T4 readiness (env registration, live RLS tests). Status: running since ~23:05.</w:t>
+        <w:t xml:space="preserve">B-607-FIX (Claude Opus 5.5): #607 INT-607-1 (explicit membership rule in API + RLS helper, phantom-chain tests) + #609 T4 readiness (env registration, live RLS tests). Status: running since 22:46.</w:t>
       </w:r>
     </w:p>
     <w:p>
@@ -5995,7 +5995,7 @@
         </w:numPr>
       </w:pPr>
       <w:r>
-        <w:t xml:space="preserve">S-SCHED-2 (Claude Opus 5.5): scheduling backend lifecycle/concurrency/ownership/contracts/notifications + #325 consumer changes. Status: running since ~22:30 (migration 20270212000000).</w:t>
+        <w:t xml:space="preserve">S-SCHED-2 (Claude Opus 5.5): scheduling backend lifecycle/concurrency/ownership/contracts/notifications + #325 consumer changes. Status: running since 22:26 (migration 20270212000000).</w:t>
       </w:r>
     </w:p>
     <w:p>
@@ -6007,7 +6007,7 @@
         </w:numPr>
       </w:pPr>
       <w:r>
-        <w:t xml:space="preserve">B-EXPORT (Claude Opus 5.5): durable, downloadable data export stacked on #608 (migration 20270221000000). Status: running since ~22:55.</w:t>
+        <w:t xml:space="preserve">B-EXPORT (Claude Opus 5.5): durable, downloadable data export stacked on #608 (migration 20270221000000). Status: running since 22:38.</w:t>
       </w:r>
     </w:p>
     <w:p>
@@ -6019,7 +6019,7 @@
         </w:numPr>
       </w:pPr>
       <w:r>
-        <w:t xml:space="preserve">B-FEE-R4 (Claude Opus 5.5): fix round 4 on #627 (Sol B-627-2..5 + Opus B), #629, mobile #321. Status: running since ~23:25.</w:t>
+        <w:t xml:space="preserve">B-FEE-R4 (Claude Opus 5.5): fix round 4 on #627 (Sol B-627-2..5 + Opus B), #629, mobile #321. Status: running since 22:49.</w:t>
       </w:r>
     </w:p>
     <w:p>
@@ -6065,7 +6065,7 @@
         </w:numPr>
       </w:pPr>
       <w:r>
-        <w:t xml:space="preserve">backend #598 @2c7b1de8: UNKNOWN, T2; verdicts at this head: -. feat(roman): model config, boot probe, /health/roman and hon</w:t>
+        <w:t xml:space="preserve">backend #598 @2c7b1de8: DIRTY, T2; verdicts at this head: -. feat(roman): model config, boot probe, /health/roman and hon</w:t>
       </w:r>
     </w:p>
     <w:p>
@@ -6077,7 +6077,7 @@
         </w:numPr>
       </w:pPr>
       <w:r>
-        <w:t xml:space="preserve">backend #601 @d767f65c: UNKNOWN, T4; verdicts at this head: -. feat(roman): AI processing consent record + server-side enfo</w:t>
+        <w:t xml:space="preserve">backend #601 @d767f65c: DIRTY, T4; verdicts at this head: -. feat(roman): AI processing consent record + server-side enfo</w:t>
       </w:r>
     </w:p>
     <w:p>
@@ -6089,7 +6089,7 @@
         </w:numPr>
       </w:pPr>
       <w:r>
-        <w:t xml:space="preserve">backend #602 @bb5f13b0: UNKNOWN, T4; verdicts at this head: -. feat(roman): RomanClientContext builder + per-turn grounding</w:t>
+        <w:t xml:space="preserve">backend #602 @bb5f13b0: DIRTY, T4; verdicts at this head: -. feat(roman): RomanClientContext builder + per-turn grounding</w:t>
       </w:r>
     </w:p>
     <w:p>
@@ -6101,7 +6101,7 @@
         </w:numPr>
       </w:pPr>
       <w:r>
-        <w:t xml:space="preserve">backend #603 @75c4a181: UNKNOWN, T3; verdicts at this head: -. feat(roman): guardrail contract, deterministic safety router</w:t>
+        <w:t xml:space="preserve">backend #603 @75c4a181: BEHIND, T3; verdicts at this head: -. feat(roman): guardrail contract, deterministic safety router</w:t>
       </w:r>
     </w:p>
     <w:p>
@@ -6125,7 +6125,7 @@
         </w:numPr>
       </w:pPr>
       <w:r>
-        <w:t xml:space="preserve">backend #605 @686d0888: UNKNOWN, T2; verdicts at this head: -. test(roman): eval harness — G1–G30 golden set, six CI layers</w:t>
+        <w:t xml:space="preserve">backend #605 @686d0888: DIRTY, T2; verdicts at this head: -. test(roman): eval harness — G1–G30 golden set, six CI layers</w:t>
       </w:r>
     </w:p>
     <w:p>
@@ -6137,7 +6137,7 @@
         </w:numPr>
       </w:pPr>
       <w:r>
-        <w:t xml:space="preserve">backend #607 @d6ac47e8: UNKNOWN, T4; verdicts at this head: -. C05/C07: consultation intake, idempotent onboarding complete</w:t>
+        <w:t xml:space="preserve">backend #607 @d6ac47e8: BEHIND, T4; verdicts at this head: -. C05/C07: consultation intake, idempotent onboarding complete</w:t>
       </w:r>
     </w:p>
     <w:p>
@@ -6149,7 +6149,7 @@
         </w:numPr>
       </w:pPr>
       <w:r>
-        <w:t xml:space="preserve">backend #608 @2759e1a0: UNKNOWN, T4; verdicts at this head: GPT-6.1 Sol:REQUEST CHANGES, Claude Opus 5.5:APPROVE. fix(account-deletion): in-app deletion completes on re-auth,</w:t>
+        <w:t xml:space="preserve">backend #608 @2759e1a0: BEHIND, T4; verdicts at this head: GPT-6.1 Sol:REQUEST CHANGES, Claude Opus 5.5:APPROVE. fix(account-deletion): in-app deletion completes on re-auth,</w:t>
       </w:r>
     </w:p>
     <w:p>
@@ -6161,7 +6161,7 @@
         </w:numPr>
       </w:pPr>
       <w:r>
-        <w:t xml:space="preserve">backend #609 @5fd61a1b: UNKNOWN, T3; verdicts at this head: -. C05 items 6-7: coach welcome message at complete +13 min, wo</w:t>
+        <w:t xml:space="preserve">backend #609 @5fd61a1b: BEHIND, T3; verdicts at this head: -. C05 items 6-7: coach welcome message at complete +13 min, wo</w:t>
       </w:r>
     </w:p>
     <w:p>
@@ -6173,7 +6173,7 @@
         </w:numPr>
       </w:pPr>
       <w:r>
-        <w:t xml:space="preserve">backend #610 @9e4b3795: UNKNOWN, T4; verdicts at this head: GPT-6.1 Sol:BLOCK. feat(community): UGC safety for App Review 1.2 (content filt</w:t>
+        <w:t xml:space="preserve">backend #610 @9e4b3795: BEHIND, T4; verdicts at this head: GPT-6.1 Sol:BLOCK. feat(community): UGC safety for App Review 1.2 (content filt</w:t>
       </w:r>
     </w:p>
     <w:p>
@@ -6185,7 +6185,7 @@
         </w:numPr>
       </w:pPr>
       <w:r>
-        <w:t xml:space="preserve">backend #611 @e5777735: UNKNOWN, T3; verdicts at this head: GPT-6.1 Sol:REQUEST CHANGES. feat(public-pages): accurate privacy policy, consumer health</w:t>
+        <w:t xml:space="preserve">backend #611 @e5777735: BEHIND, T3; verdicts at this head: GPT-6.1 Sol:REQUEST CHANGES. feat(public-pages): accurate privacy policy, consumer health</w:t>
       </w:r>
     </w:p>
     <w:p>
@@ -6197,7 +6197,7 @@
         </w:numPr>
       </w:pPr>
       <w:r>
-        <w:t xml:space="preserve">backend #612 @2855141e: UNKNOWN, ?; verdicts at this head: -. chore(deps): bump @nestjs/testing from 11.1.26 to 12.1.1</w:t>
+        <w:t xml:space="preserve">backend #612 @2855141e: BEHIND, ?; verdicts at this head: -. chore(deps): bump @nestjs/testing from 11.1.26 to 12.1.1</w:t>
       </w:r>
     </w:p>
     <w:p>
@@ -6209,7 +6209,7 @@
         </w:numPr>
       </w:pPr>
       <w:r>
-        <w:t xml:space="preserve">backend #613 @8593a09b: UNKNOWN, ?; verdicts at this head: -. chore(deps): bump @types/node from 26.0.0 to 26.6.3</w:t>
+        <w:t xml:space="preserve">backend #613 @8593a09b: BEHIND, ?; verdicts at this head: -. chore(deps): bump @types/node from 26.0.0 to 26.6.3</w:t>
       </w:r>
     </w:p>
     <w:p>
@@ -6221,7 +6221,7 @@
         </w:numPr>
       </w:pPr>
       <w:r>
-        <w:t xml:space="preserve">backend #614 @6572ccfd: UNKNOWN, ?; verdicts at this head: -. chore(deps): bump ts-jest from 29.4.9 to 29.4.14</w:t>
+        <w:t xml:space="preserve">backend #614 @6572ccfd: BEHIND, ?; verdicts at this head: -. chore(deps): bump ts-jest from 29.4.9 to 29.4.14</w:t>
       </w:r>
     </w:p>
     <w:p>
@@ -6233,7 +6233,7 @@
         </w:numPr>
       </w:pPr>
       <w:r>
-        <w:t xml:space="preserve">backend #615 @f38569fb: UNKNOWN, ?; verdicts at this head: -. chore(deps): bump js-yaml from 4.3.2 to 5.4.2</w:t>
+        <w:t xml:space="preserve">backend #615 @f38569fb: BEHIND, ?; verdicts at this head: -. chore(deps): bump js-yaml from 4.3.2 to 5.4.2</w:t>
       </w:r>
     </w:p>
     <w:p>
@@ -6245,7 +6245,7 @@
         </w:numPr>
       </w:pPr>
       <w:r>
-        <w:t xml:space="preserve">backend #616 @a3d76527: UNKNOWN, ?; verdicts at this head: -. chore(deps): bump @aws-sdk/client-s3 from 3.1071.0 to 3.1141</w:t>
+        <w:t xml:space="preserve">backend #616 @a3d76527: BEHIND, ?; verdicts at this head: -. chore(deps): bump @aws-sdk/client-s3 from 3.1071.0 to 3.1141</w:t>
       </w:r>
     </w:p>
     <w:p>
@@ -6257,7 +6257,7 @@
         </w:numPr>
       </w:pPr>
       <w:r>
-        <w:t xml:space="preserve">backend #617 @be6c957a: UNKNOWN, ?; verdicts at this head: -. chore(deps): bump posthog-node from 5.36.8 to 5.54.1</w:t>
+        <w:t xml:space="preserve">backend #617 @be6c957a: BEHIND, ?; verdicts at this head: -. chore(deps): bump posthog-node from 5.36.8 to 5.54.1</w:t>
       </w:r>
     </w:p>
     <w:p>
@@ -6269,7 +6269,7 @@
         </w:numPr>
       </w:pPr>
       <w:r>
-        <w:t xml:space="preserve">backend #618 @8d612b72: UNKNOWN, ?; verdicts at this head: -. chore(deps): bump @nestjs/cli from 11.0.21 to 12.0.8</w:t>
+        <w:t xml:space="preserve">backend #618 @8d612b72: BEHIND, ?; verdicts at this head: -. chore(deps): bump @nestjs/cli from 11.0.21 to 12.0.8</w:t>
       </w:r>
     </w:p>
     <w:p>
@@ -6281,7 +6281,7 @@
         </w:numPr>
       </w:pPr>
       <w:r>
-        <w:t xml:space="preserve">backend #619 @e53a0688: UNKNOWN, ?; verdicts at this head: -. chore(deps): bump @nestjs/platform-express from 11.1.26 to 1</w:t>
+        <w:t xml:space="preserve">backend #619 @e53a0688: BEHIND, ?; verdicts at this head: -. chore(deps): bump @nestjs/platform-express from 11.1.26 to 1</w:t>
       </w:r>
     </w:p>
     <w:p>
@@ -6293,7 +6293,7 @@
         </w:numPr>
       </w:pPr>
       <w:r>
-        <w:t xml:space="preserve">backend #620 @aa9a0126: UNKNOWN, ?; verdicts at this head: -. chore(deps): bump @supabase/supabase-js from 2.108.1 to 2.11</w:t>
+        <w:t xml:space="preserve">backend #620 @aa9a0126: BEHIND, ?; verdicts at this head: -. chore(deps): bump @supabase/supabase-js from 2.108.1 to 2.11</w:t>
       </w:r>
     </w:p>
     <w:p>
@@ -6305,7 +6305,7 @@
         </w:numPr>
       </w:pPr>
       <w:r>
-        <w:t xml:space="preserve">backend #621 @1a7b6c26: UNKNOWN, ?; verdicts at this head: -. chore(deps): bump @nestjs/common from 11.1.26 to 12.1.1</w:t>
+        <w:t xml:space="preserve">backend #621 @1a7b6c26: BEHIND, ?; verdicts at this head: -. chore(deps): bump @nestjs/common from 11.1.26 to 12.1.1</w:t>
       </w:r>
     </w:p>
     <w:p>
@@ -6341,7 +6341,7 @@
         </w:numPr>
       </w:pPr>
       <w:r>
-        <w:t xml:space="preserve">backend #628 @ba1d9480: UNKNOWN, T4; verdicts at this head: -. fix(dunning-v2): live-ready 10-day lockout + native card upd</w:t>
+        <w:t xml:space="preserve">backend #628 @ba1d9480: BEHIND, T4; verdicts at this head: -. fix(dunning-v2): live-ready 10-day lockout + native card upd</w:t>
       </w:r>
     </w:p>
     <w:p>
@@ -6377,7 +6377,7 @@
         </w:numPr>
       </w:pPr>
       <w:r>
-        <w:t xml:space="preserve">backend #633 @850ec148: UNKNOWN, T4; verdicts at this head: GPT-6.1 Sol:REQUEST CHANGES, Claude Opus 5.5:REQUEST CHANGES. ci(flags): FEATURE_DUNNING_V2 closed-choice input for the Fl</w:t>
+        <w:t xml:space="preserve">backend #633 @850ec148: BEHIND, T4; verdicts at this head: GPT-6.1 Sol:REQUEST CHANGES, Claude Opus 5.5:REQUEST CHANGES. ci(flags): FEATURE_DUNNING_V2 closed-choice input for the Fl</w:t>
       </w:r>
     </w:p>
     <w:p>
@@ -6425,7 +6425,7 @@
         </w:numPr>
       </w:pPr>
       <w:r>
-        <w:t xml:space="preserve">mobile #313 @1e80017b: CLEAN, T4; verdicts at this head: -. fix(account-deletion): in-app deletion completes with re-aut</w:t>
+        <w:t xml:space="preserve">mobile #313 @1e80017b: CLEAN, T4; verdicts at this head: Claude Opus 5.5:APPROVE. fix(account-deletion): in-app deletion completes with re-aut</w:t>
       </w:r>
     </w:p>
     <w:p>
@@ -6857,6 +6857,66 @@
       </w:pPr>
       <w:r>
         <w:t xml:space="preserve">Look for the hidden launch blocker in every builder report. B-FIX2's note that data export writes to local /tmp (users cannot download exports) was buried at the end of a report; read every "open blocker" line and turn it into a lane the same hour.</w:t>
+      </w:r>
+    </w:p>
+    <w:p>
+      <w:pPr>
+        <w:pStyle w:val="Compact"/>
+        <w:numPr>
+          <w:ilvl w:val="0"/>
+          <w:numId w:val="1084"/>
+        </w:numPr>
+      </w:pPr>
+      <w:r>
+        <w:t xml:space="preserve">Timestamp every log line from</w:t>
+      </w:r>
+      <w:r>
+        <w:t xml:space="preserve"> </w:t>
+      </w:r>
+      <w:r>
+        <w:rPr>
+          <w:rStyle w:val="VerbatimChar"/>
+        </w:rPr>
+        <w:t xml:space="preserve">TZ=America/Los_Angeles date +%H:%M</w:t>
+      </w:r>
+      <w:r>
+        <w:t xml:space="preserve">, never from memory. 110 estimated times for an hour and drifted 10-35 minutes ahead before correcting them.</w:t>
+      </w:r>
+    </w:p>
+    <w:p>
+      <w:pPr>
+        <w:pStyle w:val="Compact"/>
+        <w:numPr>
+          <w:ilvl w:val="0"/>
+          <w:numId w:val="1084"/>
+        </w:numPr>
+      </w:pPr>
+      <w:r>
+        <w:t xml:space="preserve">Check that the switch exists before you merge code that needs it. #626 (AI egress gate) merged at 22:48, but production can't take it yet: it needs FEATURE_AI_CONSENT_LEDGER_ENABLED on in the same window, and no audited workflow on main can set that flag. Before merging a flag-coupled PR, confirm the flag's audited set path (v4 4.9: the fly-env-sync manifest) is merged, or queue that lane first.</w:t>
+      </w:r>
+    </w:p>
+    <w:p>
+      <w:pPr>
+        <w:pStyle w:val="Compact"/>
+        <w:numPr>
+          <w:ilvl w:val="0"/>
+          <w:numId w:val="1084"/>
+        </w:numPr>
+      </w:pPr>
+      <w:r>
+        <w:t xml:space="preserve">Reserve migration prefixes in one place (AGENT_BRIEF_COMMON.md) before any lane renames a migration. B-TRAIN-2 renamed #607/#609 to 0212/0213 while 0212 was promised to S-SCHED-2; caught within minutes, but every rename should check the map first.</w:t>
+      </w:r>
+    </w:p>
+    <w:p>
+      <w:pPr>
+        <w:pStyle w:val="Compact"/>
+        <w:numPr>
+          <w:ilvl w:val="0"/>
+          <w:numId w:val="1084"/>
+        </w:numPr>
+      </w:pPr>
+      <w:r>
+        <w:t xml:space="preserve">The safety check may refuse PR-body edits that carry long agent-written text (B-TRAIN-2's and the operator's #604/#607/#609 body updates were refused). Don't retry or route around it: keep the text in the lane report, point auditors to it, and let the PR's own builder fold it in with its next fix round.</w:t>
       </w:r>
     </w:p>
     <w:bookmarkEnd w:id="52"/>

</xml_diff>

<commit_message>
op 110: v5 operator prompt for agent 111 + lane reports (23:06 PDT)
</commit_message>
<xml_diff>
--- a/handoffs/op-f083060f/TGP-Operator-Prompt-v5-Agent-111.docx
+++ b/handoffs/op-f083060f/TGP-Operator-Prompt-v5-Agent-111.docx
@@ -30,7 +30,7 @@
         </w:r>
       </w:hyperlink>
       <w:r>
-        <w:t xml:space="preserve">) at Bradley's request (10-01 21:38: "keep progressing, updating the agent 110 prompt I gave you to reflect current state and issues - rename it agent 111 … for when your out of credits and retired happily!"). This snapshot: 2026-10-01 22:51 PDT (real clock). Agent 110 keeps regenerating it; the newest copy is in tgp-agent-context at handoffs/op-f083060f/TGP-Operator-Prompt-v5-Agent-111.md (and .docx). Paste this whole document as the first message to the next operator, and attach the same four owner documents plus docs.zip (section 3.4). It replaces prompt v4 (kept at handoffs/op-f083060f/TGP-Operator-Prompt-v4-Agent-110.md for history). Most of v4 is carried over word for word; the parts that changed are sections 0 (overarching facts, item 5), 2 (update note), 3, 4.13 (new), 5, 6.0 (110's lessons first), 7, 12 and 13.</w:t>
+        <w:t xml:space="preserve">) at Bradley's request (10-01 21:38: "keep progressing, updating the agent 110 prompt I gave you to reflect current state and issues - rename it agent 111 … for when your out of credits and retired happily!"). This snapshot: 2026-10-01 23:06 PDT (real clock). Agent 110 keeps regenerating it; the newest copy is in tgp-agent-context at handoffs/op-f083060f/TGP-Operator-Prompt-v5-Agent-111.md (and .docx). Paste this whole document as the first message to the next operator, and attach the same four owner documents plus docs.zip (section 3.4). It replaces prompt v4 (kept at handoffs/op-f083060f/TGP-Operator-Prompt-v4-Agent-110.md for history). Most of v4 is carried over word for word; the parts that changed are sections 0 (overarching facts, item 5), 2 (update note), 3, 4.13 (new), 5, 6.0 (110's lessons first), 7, 12 and 13.</w:t>
       </w:r>
     </w:p>
     <w:p>
@@ -1744,7 +1744,7 @@
         <w:pStyle w:val="FirstParagraph"/>
       </w:pPr>
       <w:r>
-        <w:t xml:space="preserve">UPDATE 10-01 20:17-22:51 (agent 110 era; sections 4.13 and 5 have the detail):</w:t>
+        <w:t xml:space="preserve">UPDATE 10-01 20:17-23:06 (agent 110 era; sections 4.13 and 5 have the detail):</w:t>
       </w:r>
     </w:p>
     <w:p>
@@ -5684,13 +5684,13 @@
         <w:t xml:space="preserve">The live, newest version of this section is the top of tgp-agent-context LAST_OPERATOR_STATE.md ("AGENT 110 TAKEOVER" + "Train log (agent 110)"). Agent 110 appends to that train log after every merge, deploy and lane result; if this prompt and the train log disagree, the train log wins.</w:t>
       </w:r>
     </w:p>
-    <w:bookmarkStart w:id="50" w:name="X780760761b3572c4b90aac2b654741d660f6dfc"/>
+    <w:bookmarkStart w:id="50" w:name="X3081ed917b2a57de024dcdb41c517458bfa3c4a"/>
     <w:p>
       <w:pPr>
         <w:pStyle w:val="Heading3"/>
       </w:pPr>
       <w:r>
-        <w:t xml:space="preserve">AGENT 110 STATE FOR AGENT 111 — snapshot 2026-10-01 22:51 PDT (real clock)</w:t>
+        <w:t xml:space="preserve">AGENT 110 STATE FOR AGENT 111 — snapshot 2026-10-01 23:06 PDT (real clock)</w:t>
       </w:r>
     </w:p>
     <w:bookmarkStart w:id="43" w:name="production-and-mains"/>
@@ -5875,7 +5875,7 @@
         </w:numPr>
       </w:pPr>
       <w:r>
-        <w:t xml:space="preserve">AUD-OPUS (Claude Opus 5.5): standing Opus lens. Status: running batch #627, #629, mobile #321, #624, #608, #633.</w:t>
+        <w:t xml:space="preserve">AUD-OPUS (Claude Opus 5.5): standing Opus lens. Status: batch done 23:00: #627 RC 0/3/2, #629 RC 0/2/1, mobile #321 RC 0/2/1, #624 APPROVE (75a4e563) + delta ready at e3e0a314 (posting after danger fix), #608 APPROVE (export counted to B-EXPORT), #633 RC 0/2/3, mobile #313 delta APPROVE @1e80017, #604 delta APPROVE @12a4d423, #628 RC 0/2/4, mobile #322 RC 0/2/1.</w:t>
       </w:r>
     </w:p>
     <w:p>
@@ -5887,7 +5887,7 @@
         </w:numPr>
       </w:pPr>
       <w:r>
-        <w:t xml:space="preserve">AUD-OPUS-2 (Claude Opus 5.5): second Opus lens, consent + UGC. Status: running #626, mobile #326, #610, mobile #314 (objective lanes/AUD-OPUS-2.md).</w:t>
+        <w:t xml:space="preserve">AUD-OPUS-2 (Claude Opus 5.5): second Opus lens. Status: DONE: #626 APPROVE (merged), mobile #326 RC 0/2/3 (B-326-1/2), mobile #310 RC 0/1/1 (B-310-6: 180-day copy), #610 BLOCK 1/6/1 (confirms A-610-1; new B-610-5 voice not erased on deletion), mobile #314 RC 0/5/1 (verdict NOT posted: platform check refused the post; text in ops/aud-opus2-110/; superseded by B-UGC-2).</w:t>
       </w:r>
     </w:p>
     <w:p>
@@ -6031,7 +6031,19 @@
         </w:numPr>
       </w:pPr>
       <w:r>
-        <w:t xml:space="preserve">Queued lane objectives (written, not launched; next free builder slots in this order): B-UGC-2 (#610 Sol BLOCK A-610-1/2 + B, #314 B-314-2..5 incl. real native recorder/playback), B-FLAGS (prod-switch desired-state manifest on #624 = the one audited path to set day-1 flags; supersede #633; shellcheck SC2015 fix), B-CONSENT-COPY (R-626-1: consent copy says chats kept 180 days, owner said forever; #310 copy; #611 fix round), S-ERRORS (#324 B-324-1 + slices; mobile errorCode() reads</w:t>
+        <w:t xml:space="preserve">B-UGC-2 (Claude Opus 5.5): #610 + #314 fix round (A-610-1/2, B-610-1..5, B-314-2..5, real recorder/playback, C-610-4 CI DB suites). Status: running since 22:59.</w:t>
+      </w:r>
+    </w:p>
+    <w:p>
+      <w:pPr>
+        <w:pStyle w:val="Compact"/>
+        <w:numPr>
+          <w:ilvl w:val="0"/>
+          <w:numId w:val="1080"/>
+        </w:numPr>
+      </w:pPr>
+      <w:r>
+        <w:t xml:space="preserve">Queued lane objectives (written, not launched; next free builder slots in this order): B-CONSENT-COPY (R-626-1/B-310-6 180-day copy -&gt; client-ai-v4 "kept until you delete them or your account"; #326 B-326-1/2; #611), B-FLAGS (prod-switch desired-state manifest on #624; supersede #633; shellcheck SC2015), S-DUNNING-R3 (#628/#322 Opus RC: cancel after retry paid, partial-charge copy, lost-confirm copy), S-ERRORS (#324 B-324-1 + slices; mobile errorCode() reads</w:t>
       </w:r>
       <w:r>
         <w:t xml:space="preserve"> </w:t>
@@ -6113,7 +6125,7 @@
         </w:numPr>
       </w:pPr>
       <w:r>
-        <w:t xml:space="preserve">backend #604 @12a4d423: BLOCKED, T4; verdicts at this head: -. fix(throttler): isolate named throttlers to their routes, pu</w:t>
+        <w:t xml:space="preserve">backend #604 @12a4d423: CLEAN, T4; verdicts at this head: GPT-6.1 Sol:APPROVE, Claude Opus 5.5:APPROVE. fix(throttler): isolate named throttlers to their routes, pu</w:t>
       </w:r>
     </w:p>
     <w:p>
@@ -6173,7 +6185,7 @@
         </w:numPr>
       </w:pPr>
       <w:r>
-        <w:t xml:space="preserve">backend #610 @9e4b3795: BEHIND, T4; verdicts at this head: GPT-6.1 Sol:BLOCK. feat(community): UGC safety for App Review 1.2 (content filt</w:t>
+        <w:t xml:space="preserve">backend #610 @9e4b3795: BEHIND, T4; verdicts at this head: GPT-6.1 Sol:BLOCK, Claude Opus 5.5:BLOCK. feat(community): UGC safety for App Review 1.2 (content filt</w:t>
       </w:r>
     </w:p>
     <w:p>
@@ -6317,7 +6329,7 @@
         </w:numPr>
       </w:pPr>
       <w:r>
-        <w:t xml:space="preserve">backend #624 @e3e0a314: BLOCKED, T4; verdicts at this head: -. S-ENVTRUTH: register every src/ env read, ENV REGISTRATION b</w:t>
+        <w:t xml:space="preserve">backend #624 @e3e0a314: UNSTABLE, T4; verdicts at this head: Claude Opus 5.5:APPROVE. ci(env): S-ENVTRUTH register every src/ env read, env regist</w:t>
       </w:r>
     </w:p>
     <w:p>
@@ -6341,7 +6353,7 @@
         </w:numPr>
       </w:pPr>
       <w:r>
-        <w:t xml:space="preserve">backend #628 @ba1d9480: BEHIND, T4; verdicts at this head: -. fix(dunning-v2): live-ready 10-day lockout + native card upd</w:t>
+        <w:t xml:space="preserve">backend #628 @ba1d9480: BEHIND, T4; verdicts at this head: Claude Opus 5.5:REQUEST CHANGES. fix(dunning-v2): live-ready 10-day lockout + native card upd</w:t>
       </w:r>
     </w:p>
     <w:p>
@@ -6365,7 +6377,7 @@
         </w:numPr>
       </w:pPr>
       <w:r>
-        <w:t xml:space="preserve">backend #632 @0ae744b6: BLOCKED, T2; verdicts at this head: -. S-SCHED: explicit booking reminders and safe C04 appointment</w:t>
+        <w:t xml:space="preserve">backend #632 @0ae744b6: UNSTABLE, T2; verdicts at this head: -. feat(scheduling): S-SCHED explicit booking reminders and saf</w:t>
       </w:r>
     </w:p>
     <w:p>
@@ -6401,7 +6413,7 @@
         </w:numPr>
       </w:pPr>
       <w:r>
-        <w:t xml:space="preserve">mobile #310 @e1dbe7f9: CLEAN, T4; verdicts at this head: Claude Opus 5.5:REQUEST CHANGES. feat(onboarding): config-driven consultation onboarding behi</w:t>
+        <w:t xml:space="preserve">mobile #310 @e1dbe7f9: CLEAN, T4; verdicts at this head: Claude Opus 5.5:REQUEST CHANGES, GPT-6.1 Sol:REQUEST CHANGES. feat(onboarding): config-driven consultation onboarding behi</w:t>
       </w:r>
     </w:p>
     <w:p>
@@ -6425,7 +6437,7 @@
         </w:numPr>
       </w:pPr>
       <w:r>
-        <w:t xml:space="preserve">mobile #313 @1e80017b: CLEAN, T4; verdicts at this head: Claude Opus 5.5:APPROVE. fix(account-deletion): in-app deletion completes with re-aut</w:t>
+        <w:t xml:space="preserve">mobile #313 @1e80017b: CLEAN, T4; verdicts at this head: Claude Opus 5.5:APPROVE, GPT-6.1 Sol:APPROVE. fix(account-deletion): in-app deletion completes with re-aut</w:t>
       </w:r>
     </w:p>
     <w:p>
@@ -6485,7 +6497,7 @@
         </w:numPr>
       </w:pPr>
       <w:r>
-        <w:t xml:space="preserve">mobile #322 @8991ddf3: CLEAN, T4; verdicts at this head: -. feat(dunning): payment lockout + Days 0-9 banner + native Up</w:t>
+        <w:t xml:space="preserve">mobile #322 @8991ddf3: CLEAN, T4; verdicts at this head: Claude Opus 5.5:REQUEST CHANGES. feat(dunning): payment lockout + Days 0-9 banner + native Up</w:t>
       </w:r>
     </w:p>
     <w:p>

</xml_diff>

<commit_message>
op 110: v5 operator prompt for agent 111 + lane reports (23:17 PDT)
</commit_message>
<xml_diff>
--- a/handoffs/op-f083060f/TGP-Operator-Prompt-v5-Agent-111.docx
+++ b/handoffs/op-f083060f/TGP-Operator-Prompt-v5-Agent-111.docx
@@ -30,7 +30,7 @@
         </w:r>
       </w:hyperlink>
       <w:r>
-        <w:t xml:space="preserve">) at Bradley's request (10-01 21:38: "keep progressing, updating the agent 110 prompt I gave you to reflect current state and issues - rename it agent 111 … for when your out of credits and retired happily!"). This snapshot: 2026-10-01 23:06 PDT (real clock). Agent 110 keeps regenerating it; the newest copy is in tgp-agent-context at handoffs/op-f083060f/TGP-Operator-Prompt-v5-Agent-111.md (and .docx). Paste this whole document as the first message to the next operator, and attach the same four owner documents plus docs.zip (section 3.4). It replaces prompt v4 (kept at handoffs/op-f083060f/TGP-Operator-Prompt-v4-Agent-110.md for history). Most of v4 is carried over word for word; the parts that changed are sections 0 (overarching facts, item 5), 2 (update note), 3, 4.13 (new), 5, 6.0 (110's lessons first), 7, 12 and 13.</w:t>
+        <w:t xml:space="preserve">) at Bradley's request (10-01 21:38: "keep progressing, updating the agent 110 prompt I gave you to reflect current state and issues - rename it agent 111 … for when your out of credits and retired happily!"). This snapshot: 2026-10-01 23:17 PDT (real clock). Agent 110 keeps regenerating it; the newest copy is in tgp-agent-context at handoffs/op-f083060f/TGP-Operator-Prompt-v5-Agent-111.md (and .docx). Paste this whole document as the first message to the next operator, and attach the same four owner documents plus docs.zip (section 3.4). It replaces prompt v4 (kept at handoffs/op-f083060f/TGP-Operator-Prompt-v4-Agent-110.md for history). Most of v4 is carried over word for word; the parts that changed are sections 0 (overarching facts, item 5), 2 (update note), 3, 4.13 (new), 5, 6.0 (110's lessons first), 7, 12 and 13.</w:t>
       </w:r>
     </w:p>
     <w:p>
@@ -1744,7 +1744,7 @@
         <w:pStyle w:val="FirstParagraph"/>
       </w:pPr>
       <w:r>
-        <w:t xml:space="preserve">UPDATE 10-01 20:17-23:06 (agent 110 era; sections 4.13 and 5 have the detail):</w:t>
+        <w:t xml:space="preserve">UPDATE 10-01 20:17-23:17 (agent 110 era; sections 4.13 and 5 have the detail):</w:t>
       </w:r>
     </w:p>
     <w:p>
@@ -5684,13 +5684,13 @@
         <w:t xml:space="preserve">The live, newest version of this section is the top of tgp-agent-context LAST_OPERATOR_STATE.md ("AGENT 110 TAKEOVER" + "Train log (agent 110)"). Agent 110 appends to that train log after every merge, deploy and lane result; if this prompt and the train log disagree, the train log wins.</w:t>
       </w:r>
     </w:p>
-    <w:bookmarkStart w:id="50" w:name="X3081ed917b2a57de024dcdb41c517458bfa3c4a"/>
+    <w:bookmarkStart w:id="50" w:name="X569ed181d7b2c0c807115ba3e6b03bce572248f"/>
     <w:p>
       <w:pPr>
         <w:pStyle w:val="Heading3"/>
       </w:pPr>
       <w:r>
-        <w:t xml:space="preserve">AGENT 110 STATE FOR AGENT 111 — snapshot 2026-10-01 23:06 PDT (real clock)</w:t>
+        <w:t xml:space="preserve">AGENT 110 STATE FOR AGENT 111 — snapshot 2026-10-01 23:17 PDT (real clock)</w:t>
       </w:r>
     </w:p>
     <w:bookmarkStart w:id="43" w:name="production-and-mains"/>
@@ -5723,7 +5723,7 @@
         </w:numPr>
       </w:pPr>
       <w:r>
-        <w:t xml:space="preserve">Backend main: 7a6cfd82 feat(ai-egress): R2b single AI egress gate enforcing the live box-2 AI consent grant (T4) (#626). Mobile main: 0b7f197f feat(android): default closed-test builds to no Health Connect (#323). Required checks: backend 10 (build-and-test, rls-floor-guard, rls-live-tests, mwb-3-live-tests, npm audit (high+critical, whole graph), CodeQL JS/TS (javascript-typescript), Banned cast tokens (R75 / R100.A2), build-sbom, danger, Schema parity (migrations match schema.prisma)); mobile 3 (Typecheck, lint, test; Analyze (javascript-typescript); Analyze (actions)). Both strict ("require up to date"), enforce_admins true, 0 required reviews.</w:t>
+        <w:t xml:space="preserve">Backend main: e5a6044a ci(env): S-ENVTRUTH register every src/ env read, env registration board invariant, fly env sync + read-only env-truth workflows (T4) (#624). Mobile main: e3986e89 fix(account-deletion): in-app deletion completes with re-auth (password or Sign in with Apple), exact date, status + cancel (#313). Required checks: backend 10 (build-and-test, rls-floor-guard, rls-live-tests, mwb-3-live-tests, npm audit (high+critical, whole graph), CodeQL JS/TS (javascript-typescript), Banned cast tokens (R75 / R100.A2), build-sbom, danger, Schema parity (migrations match schema.prisma)); mobile 3 (Typecheck, lint, test; Analyze (javascript-typescript); Analyze (actions)). Both strict ("require up to date"), enforce_admins true, 0 required reviews.</w:t>
       </w:r>
     </w:p>
     <w:p>
@@ -5844,6 +5844,30 @@
         <w:t xml:space="preserve">backend #626 R2b single AI egress gate (T4): Opus (AUD-OPUS-2) + Sol APPROVE @d9be0c0d; merged as 7a6cfd82 (22:48; NOT deployed: needs FEATURE_AI_CONSENT_LEDGER_ENABLED ON in the same window and no audited workflow can set it yet -&gt; lane B-FLAGS).</w:t>
       </w:r>
     </w:p>
+    <w:p>
+      <w:pPr>
+        <w:pStyle w:val="Compact"/>
+        <w:numPr>
+          <w:ilvl w:val="0"/>
+          <w:numId w:val="1079"/>
+        </w:numPr>
+      </w:pPr>
+      <w:r>
+        <w:t xml:space="preserve">backend #624 S-ENVTRUTH env registration + fly env sync (T4): Sol + Opus APPROVE @e3e0a314 (after retitle for danger); merged as e5a6044a (23:15). Workflows only; fly-env-sync stages an allowlist of SECRETS from GitHub secrets — it cannot set feature flags (B-FLAGS builds that).</w:t>
+      </w:r>
+    </w:p>
+    <w:p>
+      <w:pPr>
+        <w:pStyle w:val="Compact"/>
+        <w:numPr>
+          <w:ilvl w:val="0"/>
+          <w:numId w:val="1079"/>
+        </w:numPr>
+      </w:pPr>
+      <w:r>
+        <w:t xml:space="preserve">mobile #313 in-app account deletion with re-auth (T4): Sol + Opus APPROVE @1e80017 (merge-only delta); merged as e3986e89 (mobile main). #310 must keep its consultation-draft purge when it merges main (C-310-10).</w:t>
+      </w:r>
+    </w:p>
     <w:bookmarkEnd w:id="44"/>
     <w:bookmarkStart w:id="45" w:name="Xb1516ea5eaf9578ee2bbc5f702e711473fc385c"/>
     <w:p>
@@ -5863,7 +5887,7 @@
         </w:numPr>
       </w:pPr>
       <w:r>
-        <w:t xml:space="preserve">AUD-SOL (GPT-6.1 Sol): standing Sol lens. Status: running batch #632, #624, #608, #627@2c57cc41, #633, #629, then #626, #326, #610, #314.</w:t>
+        <w:t xml:space="preserve">AUD-SOL (GPT-6.1 Sol): standing Sol lens. Batch done 23:12: APPROVE #624 @e3e0a314, #632 @0ae744b6, #604 @12a4d423, mobile #313 @1e80017; RC mobile #326 0/4/0, mobile #310 0/2/0, #628 0/10/1, mobile #322 0/6/1 (plus earlier: #608 B-608-12, #627 0/4/0, #633, #629, #610 BLOCK, #314). Now: merge-only delta on #604 @08658e77.</w:t>
       </w:r>
     </w:p>
     <w:p>
@@ -6043,7 +6067,19 @@
         </w:numPr>
       </w:pPr>
       <w:r>
-        <w:t xml:space="preserve">Queued lane objectives (written, not launched; next free builder slots in this order): B-CONSENT-COPY (R-626-1/B-310-6 180-day copy -&gt; client-ai-v4 "kept until you delete them or your account"; #326 B-326-1/2; #611), B-FLAGS (prod-switch desired-state manifest on #624; supersede #633; shellcheck SC2015), S-DUNNING-R3 (#628/#322 Opus RC: cancel after retry paid, partial-charge copy, lost-confirm copy), S-ERRORS (#324 B-324-1 + slices; mobile errorCode() reads</w:t>
+        <w:t xml:space="preserve">B-CONSENT-COPY (Claude Opus 5.5): client-ai-v4 retention copy (backend + #310), #326 one consent queue, #611 fix round. Status: running since 23:08.</w:t>
+      </w:r>
+    </w:p>
+    <w:p>
+      <w:pPr>
+        <w:pStyle w:val="Compact"/>
+        <w:numPr>
+          <w:ilvl w:val="0"/>
+          <w:numId w:val="1080"/>
+        </w:numPr>
+      </w:pPr>
+      <w:r>
+        <w:t xml:space="preserve">Queued lane objectives (written, not launched; next free builder slots in this order): B-FLAGS (prod-switch desired-state manifest on #624; supersede #633; shellcheck SC2015), S-DUNNING-R3 (#628/#322 Opus RC: cancel after retry paid, partial-charge copy, lost-confirm copy), S-ERRORS (#324 B-324-1 + slices; mobile errorCode() reads</w:t>
       </w:r>
       <w:r>
         <w:t xml:space="preserve"> </w:t>
@@ -6077,7 +6113,7 @@
         </w:numPr>
       </w:pPr>
       <w:r>
-        <w:t xml:space="preserve">backend #598 @2c7b1de8: DIRTY, T2; verdicts at this head: -. feat(roman): model config, boot probe, /health/roman and hon</w:t>
+        <w:t xml:space="preserve">backend #598 @2c7b1de8: UNKNOWN, T2; verdicts at this head: -. feat(roman): model config, boot probe, /health/roman and hon</w:t>
       </w:r>
     </w:p>
     <w:p>
@@ -6089,7 +6125,7 @@
         </w:numPr>
       </w:pPr>
       <w:r>
-        <w:t xml:space="preserve">backend #601 @d767f65c: DIRTY, T4; verdicts at this head: -. feat(roman): AI processing consent record + server-side enfo</w:t>
+        <w:t xml:space="preserve">backend #601 @d767f65c: UNKNOWN, T4; verdicts at this head: -. feat(roman): AI processing consent record + server-side enfo</w:t>
       </w:r>
     </w:p>
     <w:p>
@@ -6101,7 +6137,7 @@
         </w:numPr>
       </w:pPr>
       <w:r>
-        <w:t xml:space="preserve">backend #602 @bb5f13b0: DIRTY, T4; verdicts at this head: -. feat(roman): RomanClientContext builder + per-turn grounding</w:t>
+        <w:t xml:space="preserve">backend #602 @bb5f13b0: UNKNOWN, T4; verdicts at this head: -. feat(roman): RomanClientContext builder + per-turn grounding</w:t>
       </w:r>
     </w:p>
     <w:p>
@@ -6113,7 +6149,7 @@
         </w:numPr>
       </w:pPr>
       <w:r>
-        <w:t xml:space="preserve">backend #603 @75c4a181: BEHIND, T3; verdicts at this head: -. feat(roman): guardrail contract, deterministic safety router</w:t>
+        <w:t xml:space="preserve">backend #603 @75c4a181: UNKNOWN, T3; verdicts at this head: -. feat(roman): guardrail contract, deterministic safety router</w:t>
       </w:r>
     </w:p>
     <w:p>
@@ -6125,7 +6161,7 @@
         </w:numPr>
       </w:pPr>
       <w:r>
-        <w:t xml:space="preserve">backend #604 @12a4d423: CLEAN, T4; verdicts at this head: GPT-6.1 Sol:APPROVE, Claude Opus 5.5:APPROVE. fix(throttler): isolate named throttlers to their routes, pu</w:t>
+        <w:t xml:space="preserve">backend #604 @08658e77: BLOCKED, T4; verdicts at this head: -. fix(throttler): isolate named throttlers to their routes, pu</w:t>
       </w:r>
     </w:p>
     <w:p>
@@ -6137,7 +6173,7 @@
         </w:numPr>
       </w:pPr>
       <w:r>
-        <w:t xml:space="preserve">backend #605 @686d0888: DIRTY, T2; verdicts at this head: -. test(roman): eval harness — G1–G30 golden set, six CI layers</w:t>
+        <w:t xml:space="preserve">backend #605 @686d0888: UNKNOWN, T2; verdicts at this head: -. test(roman): eval harness — G1–G30 golden set, six CI layers</w:t>
       </w:r>
     </w:p>
     <w:p>
@@ -6149,7 +6185,7 @@
         </w:numPr>
       </w:pPr>
       <w:r>
-        <w:t xml:space="preserve">backend #607 @d6ac47e8: BEHIND, T4; verdicts at this head: -. C05/C07: consultation intake, idempotent onboarding complete</w:t>
+        <w:t xml:space="preserve">backend #607 @e8feb0d2: UNKNOWN, T4; verdicts at this head: -. C05/C07: consultation intake, idempotent onboarding complete</w:t>
       </w:r>
     </w:p>
     <w:p>
@@ -6161,7 +6197,7 @@
         </w:numPr>
       </w:pPr>
       <w:r>
-        <w:t xml:space="preserve">backend #608 @2759e1a0: BEHIND, T4; verdicts at this head: GPT-6.1 Sol:REQUEST CHANGES, Claude Opus 5.5:APPROVE. fix(account-deletion): in-app deletion completes on re-auth,</w:t>
+        <w:t xml:space="preserve">backend #608 @2759e1a0: UNKNOWN, T4; verdicts at this head: GPT-6.1 Sol:REQUEST CHANGES, Claude Opus 5.5:APPROVE. fix(account-deletion): in-app deletion completes on re-auth,</w:t>
       </w:r>
     </w:p>
     <w:p>
@@ -6173,7 +6209,7 @@
         </w:numPr>
       </w:pPr>
       <w:r>
-        <w:t xml:space="preserve">backend #609 @5fd61a1b: BEHIND, T3; verdicts at this head: -. C05 items 6-7: coach welcome message at complete +13 min, wo</w:t>
+        <w:t xml:space="preserve">backend #609 @5fd61a1b: UNKNOWN, T3; verdicts at this head: -. C05 items 6-7: coach welcome message at complete +13 min, wo</w:t>
       </w:r>
     </w:p>
     <w:p>
@@ -6185,7 +6221,7 @@
         </w:numPr>
       </w:pPr>
       <w:r>
-        <w:t xml:space="preserve">backend #610 @9e4b3795: BEHIND, T4; verdicts at this head: GPT-6.1 Sol:BLOCK, Claude Opus 5.5:BLOCK. feat(community): UGC safety for App Review 1.2 (content filt</w:t>
+        <w:t xml:space="preserve">backend #610 @9e4b3795: UNKNOWN, T4; verdicts at this head: GPT-6.1 Sol:BLOCK, Claude Opus 5.5:BLOCK. feat(community): UGC safety for App Review 1.2 (content filt</w:t>
       </w:r>
     </w:p>
     <w:p>
@@ -6197,7 +6233,7 @@
         </w:numPr>
       </w:pPr>
       <w:r>
-        <w:t xml:space="preserve">backend #611 @e5777735: BEHIND, T3; verdicts at this head: GPT-6.1 Sol:REQUEST CHANGES. feat(public-pages): accurate privacy policy, consumer health</w:t>
+        <w:t xml:space="preserve">backend #611 @e5777735: UNKNOWN, T3; verdicts at this head: GPT-6.1 Sol:REQUEST CHANGES. feat(public-pages): accurate privacy policy, consumer health</w:t>
       </w:r>
     </w:p>
     <w:p>
@@ -6209,7 +6245,7 @@
         </w:numPr>
       </w:pPr>
       <w:r>
-        <w:t xml:space="preserve">backend #612 @2855141e: BEHIND, ?; verdicts at this head: -. chore(deps): bump @nestjs/testing from 11.1.26 to 12.1.1</w:t>
+        <w:t xml:space="preserve">backend #612 @2855141e: UNKNOWN, ?; verdicts at this head: -. chore(deps): bump @nestjs/testing from 11.1.26 to 12.1.1</w:t>
       </w:r>
     </w:p>
     <w:p>
@@ -6221,7 +6257,7 @@
         </w:numPr>
       </w:pPr>
       <w:r>
-        <w:t xml:space="preserve">backend #613 @8593a09b: BEHIND, ?; verdicts at this head: -. chore(deps): bump @types/node from 26.0.0 to 26.6.3</w:t>
+        <w:t xml:space="preserve">backend #613 @8593a09b: UNKNOWN, ?; verdicts at this head: -. chore(deps): bump @types/node from 26.0.0 to 26.6.3</w:t>
       </w:r>
     </w:p>
     <w:p>
@@ -6233,7 +6269,7 @@
         </w:numPr>
       </w:pPr>
       <w:r>
-        <w:t xml:space="preserve">backend #614 @6572ccfd: BEHIND, ?; verdicts at this head: -. chore(deps): bump ts-jest from 29.4.9 to 29.4.14</w:t>
+        <w:t xml:space="preserve">backend #614 @6572ccfd: UNKNOWN, ?; verdicts at this head: -. chore(deps): bump ts-jest from 29.4.9 to 29.4.14</w:t>
       </w:r>
     </w:p>
     <w:p>
@@ -6245,7 +6281,7 @@
         </w:numPr>
       </w:pPr>
       <w:r>
-        <w:t xml:space="preserve">backend #615 @f38569fb: BEHIND, ?; verdicts at this head: -. chore(deps): bump js-yaml from 4.3.2 to 5.4.2</w:t>
+        <w:t xml:space="preserve">backend #615 @f38569fb: UNKNOWN, ?; verdicts at this head: -. chore(deps): bump js-yaml from 4.3.2 to 5.4.2</w:t>
       </w:r>
     </w:p>
     <w:p>
@@ -6257,7 +6293,7 @@
         </w:numPr>
       </w:pPr>
       <w:r>
-        <w:t xml:space="preserve">backend #616 @a3d76527: BEHIND, ?; verdicts at this head: -. chore(deps): bump @aws-sdk/client-s3 from 3.1071.0 to 3.1141</w:t>
+        <w:t xml:space="preserve">backend #616 @a3d76527: UNKNOWN, ?; verdicts at this head: -. chore(deps): bump @aws-sdk/client-s3 from 3.1071.0 to 3.1141</w:t>
       </w:r>
     </w:p>
     <w:p>
@@ -6269,7 +6305,7 @@
         </w:numPr>
       </w:pPr>
       <w:r>
-        <w:t xml:space="preserve">backend #617 @be6c957a: BEHIND, ?; verdicts at this head: -. chore(deps): bump posthog-node from 5.36.8 to 5.54.1</w:t>
+        <w:t xml:space="preserve">backend #617 @be6c957a: UNKNOWN, ?; verdicts at this head: -. chore(deps): bump posthog-node from 5.36.8 to 5.54.1</w:t>
       </w:r>
     </w:p>
     <w:p>
@@ -6281,7 +6317,7 @@
         </w:numPr>
       </w:pPr>
       <w:r>
-        <w:t xml:space="preserve">backend #618 @8d612b72: BEHIND, ?; verdicts at this head: -. chore(deps): bump @nestjs/cli from 11.0.21 to 12.0.8</w:t>
+        <w:t xml:space="preserve">backend #618 @8d612b72: UNKNOWN, ?; verdicts at this head: -. chore(deps): bump @nestjs/cli from 11.0.21 to 12.0.8</w:t>
       </w:r>
     </w:p>
     <w:p>
@@ -6293,7 +6329,7 @@
         </w:numPr>
       </w:pPr>
       <w:r>
-        <w:t xml:space="preserve">backend #619 @e53a0688: BEHIND, ?; verdicts at this head: -. chore(deps): bump @nestjs/platform-express from 11.1.26 to 1</w:t>
+        <w:t xml:space="preserve">backend #619 @e53a0688: UNKNOWN, ?; verdicts at this head: -. chore(deps): bump @nestjs/platform-express from 11.1.26 to 1</w:t>
       </w:r>
     </w:p>
     <w:p>
@@ -6305,7 +6341,7 @@
         </w:numPr>
       </w:pPr>
       <w:r>
-        <w:t xml:space="preserve">backend #620 @aa9a0126: BEHIND, ?; verdicts at this head: -. chore(deps): bump @supabase/supabase-js from 2.108.1 to 2.11</w:t>
+        <w:t xml:space="preserve">backend #620 @aa9a0126: UNKNOWN, ?; verdicts at this head: -. chore(deps): bump @supabase/supabase-js from 2.108.1 to 2.11</w:t>
       </w:r>
     </w:p>
     <w:p>
@@ -6317,7 +6353,7 @@
         </w:numPr>
       </w:pPr>
       <w:r>
-        <w:t xml:space="preserve">backend #621 @1a7b6c26: BEHIND, ?; verdicts at this head: -. chore(deps): bump @nestjs/common from 11.1.26 to 12.1.1</w:t>
+        <w:t xml:space="preserve">backend #621 @1a7b6c26: UNKNOWN, ?; verdicts at this head: -. chore(deps): bump @nestjs/common from 11.1.26 to 12.1.1</w:t>
       </w:r>
     </w:p>
     <w:p>
@@ -6329,7 +6365,7 @@
         </w:numPr>
       </w:pPr>
       <w:r>
-        <w:t xml:space="preserve">backend #624 @e3e0a314: UNSTABLE, T4; verdicts at this head: Claude Opus 5.5:APPROVE. ci(env): S-ENVTRUTH register every src/ env read, env regist</w:t>
+        <w:t xml:space="preserve">backend #627 @2c57cc41: UNKNOWN, T4; verdicts at this head: GPT-6.1 Sol:REQUEST CHANGES, Claude Opus 5.5:REQUEST CHANGES. fix(billing): coach payout = price - actual Stripe fee - 2%</w:t>
       </w:r>
     </w:p>
     <w:p>
@@ -6341,7 +6377,7 @@
         </w:numPr>
       </w:pPr>
       <w:r>
-        <w:t xml:space="preserve">backend #627 @2c57cc41: BEHIND, T4; verdicts at this head: GPT-6.1 Sol:REQUEST CHANGES, Claude Opus 5.5:REQUEST CHANGES. fix(billing): coach payout = price - actual Stripe fee - 2%</w:t>
+        <w:t xml:space="preserve">backend #628 @ba1d9480: UNKNOWN, T4; verdicts at this head: Claude Opus 5.5:REQUEST CHANGES, GPT-6.1 Sol:REQUEST CHANGES. fix(dunning-v2): live-ready 10-day lockout + native card upd</w:t>
       </w:r>
     </w:p>
     <w:p>
@@ -6353,7 +6389,7 @@
         </w:numPr>
       </w:pPr>
       <w:r>
-        <w:t xml:space="preserve">backend #628 @ba1d9480: BEHIND, T4; verdicts at this head: Claude Opus 5.5:REQUEST CHANGES. fix(dunning-v2): live-ready 10-day lockout + native card upd</w:t>
+        <w:t xml:space="preserve">backend #629 @858eb40b: UNKNOWN, T4; verdicts at this head: GPT-6.1 Sol:REQUEST CHANGES, Claude Opus 5.5:REQUEST CHANGES. feat(packages): paid packages start at $19.99, or exactly $0</w:t>
       </w:r>
     </w:p>
     <w:p>
@@ -6365,7 +6401,7 @@
         </w:numPr>
       </w:pPr>
       <w:r>
-        <w:t xml:space="preserve">backend #629 @858eb40b: BEHIND, T4; verdicts at this head: GPT-6.1 Sol:REQUEST CHANGES, Claude Opus 5.5:REQUEST CHANGES. feat(packages): paid packages start at $19.99, or exactly $0</w:t>
+        <w:t xml:space="preserve">backend #632 @0ae744b6: DIRTY, T2; verdicts at this head: GPT-6.1 Sol:APPROVE. feat(scheduling): S-SCHED explicit booking reminders and saf</w:t>
       </w:r>
     </w:p>
     <w:p>
@@ -6377,7 +6413,7 @@
         </w:numPr>
       </w:pPr>
       <w:r>
-        <w:t xml:space="preserve">backend #632 @0ae744b6: UNSTABLE, T2; verdicts at this head: -. feat(scheduling): S-SCHED explicit booking reminders and saf</w:t>
+        <w:t xml:space="preserve">backend #633 @850ec148: UNKNOWN, T4; verdicts at this head: GPT-6.1 Sol:REQUEST CHANGES, Claude Opus 5.5:REQUEST CHANGES. ci(flags): FEATURE_DUNNING_V2 closed-choice input for the Fl</w:t>
       </w:r>
     </w:p>
     <w:p>
@@ -6389,7 +6425,7 @@
         </w:numPr>
       </w:pPr>
       <w:r>
-        <w:t xml:space="preserve">backend #633 @850ec148: BEHIND, T4; verdicts at this head: GPT-6.1 Sol:REQUEST CHANGES, Claude Opus 5.5:REQUEST CHANGES. ci(flags): FEATURE_DUNNING_V2 closed-choice input for the Fl</w:t>
+        <w:t xml:space="preserve">backend #634 @7284e079: UNKNOWN, T4; verdicts at this head: -. feat(scheduling): S-SCHED-2 authoritative booking lifecycle,</w:t>
       </w:r>
     </w:p>
     <w:p>
@@ -6413,7 +6449,7 @@
         </w:numPr>
       </w:pPr>
       <w:r>
-        <w:t xml:space="preserve">mobile #310 @e1dbe7f9: CLEAN, T4; verdicts at this head: Claude Opus 5.5:REQUEST CHANGES, GPT-6.1 Sol:REQUEST CHANGES. feat(onboarding): config-driven consultation onboarding behi</w:t>
+        <w:t xml:space="preserve">mobile #310 @e1dbe7f9: UNKNOWN, T4; verdicts at this head: Claude Opus 5.5:REQUEST CHANGES, GPT-6.1 Sol:REQUEST CHANGES. feat(onboarding): config-driven consultation onboarding behi</w:t>
       </w:r>
     </w:p>
     <w:p>
@@ -6425,7 +6461,7 @@
         </w:numPr>
       </w:pPr>
       <w:r>
-        <w:t xml:space="preserve">mobile #312 @5b26e1f4: BEHIND, T3; verdicts at this head: -. C05 item 7: Workout reminders toggle in Settings &gt; Notificat</w:t>
+        <w:t xml:space="preserve">mobile #312 @5b26e1f4: UNKNOWN, T3; verdicts at this head: -. C05 item 7: Workout reminders toggle in Settings &gt; Notificat</w:t>
       </w:r>
     </w:p>
     <w:p>
@@ -6437,7 +6473,7 @@
         </w:numPr>
       </w:pPr>
       <w:r>
-        <w:t xml:space="preserve">mobile #313 @1e80017b: CLEAN, T4; verdicts at this head: Claude Opus 5.5:APPROVE, GPT-6.1 Sol:APPROVE. fix(account-deletion): in-app deletion completes with re-aut</w:t>
+        <w:t xml:space="preserve">mobile #314 @41d829d7: UNKNOWN, T4; verdicts at this head: GPT-6.1 Sol:REQUEST CHANGES. feat(community): report, block, moderation actions and safet</w:t>
       </w:r>
     </w:p>
     <w:p>
@@ -6449,7 +6485,7 @@
         </w:numPr>
       </w:pPr>
       <w:r>
-        <w:t xml:space="preserve">mobile #314 @41d829d7: CLEAN, T4; verdicts at this head: GPT-6.1 Sol:REQUEST CHANGES. feat(community): report, block, moderation actions and safet</w:t>
+        <w:t xml:space="preserve">mobile #315 @d9c2e669: UNKNOWN, T3; verdicts at this head: GPT-6.1 Sol:APPROVE, Claude Opus 5.5:APPROVE. fix(trust-center): open the real privacy policy, link the co</w:t>
       </w:r>
     </w:p>
     <w:p>
@@ -6461,7 +6497,7 @@
         </w:numPr>
       </w:pPr>
       <w:r>
-        <w:t xml:space="preserve">mobile #315 @d9c2e669: BEHIND, T3; verdicts at this head: GPT-6.1 Sol:APPROVE, Claude Opus 5.5:APPROVE. fix(trust-center): open the real privacy policy, link the co</w:t>
+        <w:t xml:space="preserve">mobile #317 @c7e35d84: UNKNOWN, T4; verdicts at this head: GPT-6.1 Sol:BLOCK, Claude Opus 5.5:REQUEST CHANGES. fix(wearables): S14 [T4] Apple Health / Health Connect conne</w:t>
       </w:r>
     </w:p>
     <w:p>
@@ -6473,7 +6509,7 @@
         </w:numPr>
       </w:pPr>
       <w:r>
-        <w:t xml:space="preserve">mobile #317 @c7e35d84: DIRTY, T4; verdicts at this head: GPT-6.1 Sol:BLOCK, Claude Opus 5.5:REQUEST CHANGES. fix(wearables): S14 [T4] Apple Health / Health Connect conne</w:t>
+        <w:t xml:space="preserve">mobile #321 @a9b1f49d: UNKNOWN, T3; verdicts at this head: Claude Opus 5.5:REQUEST CHANGES. feat(packages): editor shows the $19.99 minimum or free rule</w:t>
       </w:r>
     </w:p>
     <w:p>
@@ -6485,7 +6521,7 @@
         </w:numPr>
       </w:pPr>
       <w:r>
-        <w:t xml:space="preserve">mobile #321 @a9b1f49d: CLEAN, T3; verdicts at this head: Claude Opus 5.5:REQUEST CHANGES. feat(packages): editor shows the $19.99 minimum or free rule</w:t>
+        <w:t xml:space="preserve">mobile #322 @8991ddf3: UNKNOWN, T4; verdicts at this head: Claude Opus 5.5:REQUEST CHANGES, GPT-6.1 Sol:REQUEST CHANGES. feat(dunning): payment lockout + Days 0-9 banner + native Up</w:t>
       </w:r>
     </w:p>
     <w:p>
@@ -6497,19 +6533,7 @@
         </w:numPr>
       </w:pPr>
       <w:r>
-        <w:t xml:space="preserve">mobile #322 @8991ddf3: CLEAN, T4; verdicts at this head: Claude Opus 5.5:REQUEST CHANGES. feat(dunning): payment lockout + Days 0-9 banner + native Up</w:t>
-      </w:r>
-    </w:p>
-    <w:p>
-      <w:pPr>
-        <w:pStyle w:val="Compact"/>
-        <w:numPr>
-          <w:ilvl w:val="0"/>
-          <w:numId w:val="1081"/>
-        </w:numPr>
-      </w:pPr>
-      <w:r>
-        <w:t xml:space="preserve">mobile #324 @7f20255d: BEHIND, T2; verdicts at this head: GPT-6.1 Sol:REQUEST CHANGES. fix(support): one support email (</w:t>
+        <w:t xml:space="preserve">mobile #324 @7f20255d: UNKNOWN, T2; verdicts at this head: GPT-6.1 Sol:REQUEST CHANGES. fix(support): one support email (</w:t>
       </w:r>
       <w:hyperlink r:id="rId39">
         <w:r>
@@ -6532,7 +6556,7 @@
         </w:numPr>
       </w:pPr>
       <w:r>
-        <w:t xml:space="preserve">mobile #325 @bc1398c2: BEHIND, T2; verdicts at this head: -. S-SCHED: native Calendar, coach controls and welcome-call tu</w:t>
+        <w:t xml:space="preserve">mobile #325 @bc1398c2: UNKNOWN, T2; verdicts at this head: -. S-SCHED: native Calendar, coach controls and welcome-call tu</w:t>
       </w:r>
     </w:p>
     <w:p>
@@ -6544,7 +6568,7 @@
         </w:numPr>
       </w:pPr>
       <w:r>
-        <w:t xml:space="preserve">mobile #326 @32ed8546: CLEAN, T4; verdicts at this head: GPT-6.1 Sol:REQUEST CHANGES, Claude Opus 5.5:REQUEST CHANGES. fix(ai): handle ai_consent_required and ai_egress_blocked on</w:t>
+        <w:t xml:space="preserve">mobile #326 @32ed8546: UNKNOWN, T4; verdicts at this head: GPT-6.1 Sol:REQUEST CHANGES, Claude Opus 5.5:REQUEST CHANGES. fix(ai): handle ai_consent_required and ai_egress_blocked on</w:t>
       </w:r>
     </w:p>
     <w:p>

</xml_diff>

<commit_message>
op 110: v5 operator prompt for agent 111 + lane reports (23:32 PDT)
</commit_message>
<xml_diff>
--- a/handoffs/op-f083060f/TGP-Operator-Prompt-v5-Agent-111.docx
+++ b/handoffs/op-f083060f/TGP-Operator-Prompt-v5-Agent-111.docx
@@ -30,7 +30,7 @@
         </w:r>
       </w:hyperlink>
       <w:r>
-        <w:t xml:space="preserve">) at Bradley's request (10-01 21:38: "keep progressing, updating the agent 110 prompt I gave you to reflect current state and issues - rename it agent 111 … for when your out of credits and retired happily!"). This snapshot: 2026-10-01 23:17 PDT (real clock). Agent 110 keeps regenerating it; the newest copy is in tgp-agent-context at handoffs/op-f083060f/TGP-Operator-Prompt-v5-Agent-111.md (and .docx). Paste this whole document as the first message to the next operator, and attach the same four owner documents plus docs.zip (section 3.4). It replaces prompt v4 (kept at handoffs/op-f083060f/TGP-Operator-Prompt-v4-Agent-110.md for history). Most of v4 is carried over word for word; the parts that changed are sections 0 (overarching facts, item 5), 2 (update note), 3, 4.13 (new), 5, 6.0 (110's lessons first), 7, 12 and 13.</w:t>
+        <w:t xml:space="preserve">) at Bradley's request (10-01 21:38: "keep progressing, updating the agent 110 prompt I gave you to reflect current state and issues - rename it agent 111 … for when your out of credits and retired happily!"). This snapshot: 2026-10-01 23:32 PDT (real clock). Agent 110 keeps regenerating it; the newest copy is in tgp-agent-context at handoffs/op-f083060f/TGP-Operator-Prompt-v5-Agent-111.md (and .docx). Paste this whole document as the first message to the next operator, and attach the same four owner documents plus docs.zip (section 3.4). It replaces prompt v4 (kept at handoffs/op-f083060f/TGP-Operator-Prompt-v4-Agent-110.md for history). Most of v4 is carried over word for word; the parts that changed are sections 0 (overarching facts, item 5), 2 (update note), 3, 4.13 (new), 5, 6.0 (110's lessons first), 7, 12 and 13.</w:t>
       </w:r>
     </w:p>
     <w:p>
@@ -1744,7 +1744,7 @@
         <w:pStyle w:val="FirstParagraph"/>
       </w:pPr>
       <w:r>
-        <w:t xml:space="preserve">UPDATE 10-01 20:17-23:17 (agent 110 era; sections 4.13 and 5 have the detail):</w:t>
+        <w:t xml:space="preserve">UPDATE 10-01 20:17-23:32 (agent 110 era; sections 4.13 and 5 have the detail):</w:t>
       </w:r>
     </w:p>
     <w:p>
@@ -5684,13 +5684,13 @@
         <w:t xml:space="preserve">The live, newest version of this section is the top of tgp-agent-context LAST_OPERATOR_STATE.md ("AGENT 110 TAKEOVER" + "Train log (agent 110)"). Agent 110 appends to that train log after every merge, deploy and lane result; if this prompt and the train log disagree, the train log wins.</w:t>
       </w:r>
     </w:p>
-    <w:bookmarkStart w:id="50" w:name="X569ed181d7b2c0c807115ba3e6b03bce572248f"/>
+    <w:bookmarkStart w:id="50" w:name="Xf1b42f45fe6200c2752a12b56c1545c7dde2488"/>
     <w:p>
       <w:pPr>
         <w:pStyle w:val="Heading3"/>
       </w:pPr>
       <w:r>
-        <w:t xml:space="preserve">AGENT 110 STATE FOR AGENT 111 — snapshot 2026-10-01 23:17 PDT (real clock)</w:t>
+        <w:t xml:space="preserve">AGENT 110 STATE FOR AGENT 111 — snapshot 2026-10-01 23:32 PDT (real clock)</w:t>
       </w:r>
     </w:p>
     <w:bookmarkStart w:id="43" w:name="production-and-mains"/>
@@ -5887,7 +5887,7 @@
         </w:numPr>
       </w:pPr>
       <w:r>
-        <w:t xml:space="preserve">AUD-SOL (GPT-6.1 Sol): standing Sol lens. Batch done 23:12: APPROVE #624 @e3e0a314, #632 @0ae744b6, #604 @12a4d423, mobile #313 @1e80017; RC mobile #326 0/4/0, mobile #310 0/2/0, #628 0/10/1, mobile #322 0/6/1 (plus earlier: #608 B-608-12, #627 0/4/0, #633, #629, #610 BLOCK, #314). Now: merge-only delta on #604 @08658e77.</w:t>
+        <w:t xml:space="preserve">AUD-SOL (GPT-6.1 Sol): standing Sol lens. Batch done 23:12 (see train log); 23:32 #604 delta @08658e77 REQUEST CHANGES B-604-1 (four C14 ENV_RULES entries need explicit defaults 240/60/400/10 under #624's hygiene contract; build-and-test red) -&gt; fix sent to B-607-FIX. Idle until fixes land.</w:t>
       </w:r>
     </w:p>
     <w:p>
@@ -6079,7 +6079,19 @@
         </w:numPr>
       </w:pPr>
       <w:r>
-        <w:t xml:space="preserve">Queued lane objectives (written, not launched; next free builder slots in this order): B-FLAGS (prod-switch desired-state manifest on #624; supersede #633; shellcheck SC2015), S-DUNNING-R3 (#628/#322 Opus RC: cancel after retry paid, partial-charge copy, lost-confirm copy), S-ERRORS (#324 B-324-1 + slices; mobile errorCode() reads</w:t>
+        <w:t xml:space="preserve">B-FLAGS (Claude Opus 5.5): prod-switch desired-state manifest + plan/apply workflow (the audited flag path; unblocks the held deploy) + shellcheck SC2015 PR. Status: running since 23:32.</w:t>
+      </w:r>
+    </w:p>
+    <w:p>
+      <w:pPr>
+        <w:pStyle w:val="Compact"/>
+        <w:numPr>
+          <w:ilvl w:val="0"/>
+          <w:numId w:val="1080"/>
+        </w:numPr>
+      </w:pPr>
+      <w:r>
+        <w:t xml:space="preserve">Queued lane objectives (written, not launched; next free builder slots in this order): S-DUNNING-R3 (#628/#322 Opus RC: cancel after retry paid, partial-charge copy, lost-confirm copy), S-ERRORS (#324 B-324-1 + slices; mobile errorCode() reads</w:t>
       </w:r>
       <w:r>
         <w:t xml:space="preserve"> </w:t>
@@ -6113,7 +6125,7 @@
         </w:numPr>
       </w:pPr>
       <w:r>
-        <w:t xml:space="preserve">backend #598 @2c7b1de8: UNKNOWN, T2; verdicts at this head: -. feat(roman): model config, boot probe, /health/roman and hon</w:t>
+        <w:t xml:space="preserve">backend #598 @2c7b1de8: DIRTY, T2; verdicts at this head: -. feat(roman): model config, boot probe, /health/roman and hon</w:t>
       </w:r>
     </w:p>
     <w:p>
@@ -6125,7 +6137,7 @@
         </w:numPr>
       </w:pPr>
       <w:r>
-        <w:t xml:space="preserve">backend #601 @d767f65c: UNKNOWN, T4; verdicts at this head: -. feat(roman): AI processing consent record + server-side enfo</w:t>
+        <w:t xml:space="preserve">backend #601 @d767f65c: DIRTY, T4; verdicts at this head: -. feat(roman): AI processing consent record + server-side enfo</w:t>
       </w:r>
     </w:p>
     <w:p>
@@ -6137,7 +6149,7 @@
         </w:numPr>
       </w:pPr>
       <w:r>
-        <w:t xml:space="preserve">backend #602 @bb5f13b0: UNKNOWN, T4; verdicts at this head: -. feat(roman): RomanClientContext builder + per-turn grounding</w:t>
+        <w:t xml:space="preserve">backend #602 @bb5f13b0: DIRTY, T4; verdicts at this head: -. feat(roman): RomanClientContext builder + per-turn grounding</w:t>
       </w:r>
     </w:p>
     <w:p>
@@ -6149,7 +6161,7 @@
         </w:numPr>
       </w:pPr>
       <w:r>
-        <w:t xml:space="preserve">backend #603 @75c4a181: UNKNOWN, T3; verdicts at this head: -. feat(roman): guardrail contract, deterministic safety router</w:t>
+        <w:t xml:space="preserve">backend #603 @75c4a181: BEHIND, T3; verdicts at this head: -. feat(roman): guardrail contract, deterministic safety router</w:t>
       </w:r>
     </w:p>
     <w:p>
@@ -6161,7 +6173,7 @@
         </w:numPr>
       </w:pPr>
       <w:r>
-        <w:t xml:space="preserve">backend #604 @08658e77: BLOCKED, T4; verdicts at this head: -. fix(throttler): isolate named throttlers to their routes, pu</w:t>
+        <w:t xml:space="preserve">backend #604 @08658e77: BLOCKED, T4; verdicts at this head: GPT-6.1 Sol:REQUEST CHANGES. fix(throttler): isolate named throttlers to their routes, pu</w:t>
       </w:r>
     </w:p>
     <w:p>
@@ -6173,7 +6185,7 @@
         </w:numPr>
       </w:pPr>
       <w:r>
-        <w:t xml:space="preserve">backend #605 @686d0888: UNKNOWN, T2; verdicts at this head: -. test(roman): eval harness — G1–G30 golden set, six CI layers</w:t>
+        <w:t xml:space="preserve">backend #605 @686d0888: DIRTY, T2; verdicts at this head: -. test(roman): eval harness — G1–G30 golden set, six CI layers</w:t>
       </w:r>
     </w:p>
     <w:p>
@@ -6185,7 +6197,7 @@
         </w:numPr>
       </w:pPr>
       <w:r>
-        <w:t xml:space="preserve">backend #607 @e8feb0d2: UNKNOWN, T4; verdicts at this head: -. C05/C07: consultation intake, idempotent onboarding complete</w:t>
+        <w:t xml:space="preserve">backend #607 @e8feb0d2: BEHIND, T4; verdicts at this head: -. C05/C07: consultation intake, idempotent onboarding complete</w:t>
       </w:r>
     </w:p>
     <w:p>
@@ -6197,7 +6209,7 @@
         </w:numPr>
       </w:pPr>
       <w:r>
-        <w:t xml:space="preserve">backend #608 @2759e1a0: UNKNOWN, T4; verdicts at this head: GPT-6.1 Sol:REQUEST CHANGES, Claude Opus 5.5:APPROVE. fix(account-deletion): in-app deletion completes on re-auth,</w:t>
+        <w:t xml:space="preserve">backend #608 @2759e1a0: BEHIND, T4; verdicts at this head: GPT-6.1 Sol:REQUEST CHANGES, Claude Opus 5.5:APPROVE. fix(account-deletion): in-app deletion completes on re-auth,</w:t>
       </w:r>
     </w:p>
     <w:p>
@@ -6209,7 +6221,7 @@
         </w:numPr>
       </w:pPr>
       <w:r>
-        <w:t xml:space="preserve">backend #609 @5fd61a1b: UNKNOWN, T3; verdicts at this head: -. C05 items 6-7: coach welcome message at complete +13 min, wo</w:t>
+        <w:t xml:space="preserve">backend #609 @5fd61a1b: BEHIND, T3; verdicts at this head: -. C05 items 6-7: coach welcome message at complete +13 min, wo</w:t>
       </w:r>
     </w:p>
     <w:p>
@@ -6221,7 +6233,7 @@
         </w:numPr>
       </w:pPr>
       <w:r>
-        <w:t xml:space="preserve">backend #610 @9e4b3795: UNKNOWN, T4; verdicts at this head: GPT-6.1 Sol:BLOCK, Claude Opus 5.5:BLOCK. feat(community): UGC safety for App Review 1.2 (content filt</w:t>
+        <w:t xml:space="preserve">backend #610 @9e4b3795: BEHIND, T4; verdicts at this head: GPT-6.1 Sol:BLOCK, Claude Opus 5.5:BLOCK. feat(community): UGC safety for App Review 1.2 (content filt</w:t>
       </w:r>
     </w:p>
     <w:p>
@@ -6233,7 +6245,7 @@
         </w:numPr>
       </w:pPr>
       <w:r>
-        <w:t xml:space="preserve">backend #611 @e5777735: UNKNOWN, T3; verdicts at this head: GPT-6.1 Sol:REQUEST CHANGES. feat(public-pages): accurate privacy policy, consumer health</w:t>
+        <w:t xml:space="preserve">backend #611 @e5777735: BEHIND, T3; verdicts at this head: GPT-6.1 Sol:REQUEST CHANGES. feat(public-pages): accurate privacy policy, consumer health</w:t>
       </w:r>
     </w:p>
     <w:p>
@@ -6245,7 +6257,7 @@
         </w:numPr>
       </w:pPr>
       <w:r>
-        <w:t xml:space="preserve">backend #612 @2855141e: UNKNOWN, ?; verdicts at this head: -. chore(deps): bump @nestjs/testing from 11.1.26 to 12.1.1</w:t>
+        <w:t xml:space="preserve">backend #612 @2855141e: BEHIND, ?; verdicts at this head: -. chore(deps): bump @nestjs/testing from 11.1.26 to 12.1.1</w:t>
       </w:r>
     </w:p>
     <w:p>
@@ -6257,7 +6269,7 @@
         </w:numPr>
       </w:pPr>
       <w:r>
-        <w:t xml:space="preserve">backend #613 @8593a09b: UNKNOWN, ?; verdicts at this head: -. chore(deps): bump @types/node from 26.0.0 to 26.6.3</w:t>
+        <w:t xml:space="preserve">backend #613 @8593a09b: BEHIND, ?; verdicts at this head: -. chore(deps): bump @types/node from 26.0.0 to 26.6.3</w:t>
       </w:r>
     </w:p>
     <w:p>
@@ -6269,7 +6281,7 @@
         </w:numPr>
       </w:pPr>
       <w:r>
-        <w:t xml:space="preserve">backend #614 @6572ccfd: UNKNOWN, ?; verdicts at this head: -. chore(deps): bump ts-jest from 29.4.9 to 29.4.14</w:t>
+        <w:t xml:space="preserve">backend #614 @6572ccfd: BEHIND, ?; verdicts at this head: -. chore(deps): bump ts-jest from 29.4.9 to 29.4.14</w:t>
       </w:r>
     </w:p>
     <w:p>
@@ -6281,7 +6293,7 @@
         </w:numPr>
       </w:pPr>
       <w:r>
-        <w:t xml:space="preserve">backend #615 @f38569fb: UNKNOWN, ?; verdicts at this head: -. chore(deps): bump js-yaml from 4.3.2 to 5.4.2</w:t>
+        <w:t xml:space="preserve">backend #615 @f38569fb: BEHIND, ?; verdicts at this head: -. chore(deps): bump js-yaml from 4.3.2 to 5.4.2</w:t>
       </w:r>
     </w:p>
     <w:p>
@@ -6293,7 +6305,7 @@
         </w:numPr>
       </w:pPr>
       <w:r>
-        <w:t xml:space="preserve">backend #616 @a3d76527: UNKNOWN, ?; verdicts at this head: -. chore(deps): bump @aws-sdk/client-s3 from 3.1071.0 to 3.1141</w:t>
+        <w:t xml:space="preserve">backend #616 @a3d76527: BEHIND, ?; verdicts at this head: -. chore(deps): bump @aws-sdk/client-s3 from 3.1071.0 to 3.1141</w:t>
       </w:r>
     </w:p>
     <w:p>
@@ -6305,7 +6317,7 @@
         </w:numPr>
       </w:pPr>
       <w:r>
-        <w:t xml:space="preserve">backend #617 @be6c957a: UNKNOWN, ?; verdicts at this head: -. chore(deps): bump posthog-node from 5.36.8 to 5.54.1</w:t>
+        <w:t xml:space="preserve">backend #617 @be6c957a: BEHIND, ?; verdicts at this head: -. chore(deps): bump posthog-node from 5.36.8 to 5.54.1</w:t>
       </w:r>
     </w:p>
     <w:p>
@@ -6317,7 +6329,7 @@
         </w:numPr>
       </w:pPr>
       <w:r>
-        <w:t xml:space="preserve">backend #618 @8d612b72: UNKNOWN, ?; verdicts at this head: -. chore(deps): bump @nestjs/cli from 11.0.21 to 12.0.8</w:t>
+        <w:t xml:space="preserve">backend #618 @8d612b72: BEHIND, ?; verdicts at this head: -. chore(deps): bump @nestjs/cli from 11.0.21 to 12.0.8</w:t>
       </w:r>
     </w:p>
     <w:p>
@@ -6329,7 +6341,7 @@
         </w:numPr>
       </w:pPr>
       <w:r>
-        <w:t xml:space="preserve">backend #619 @e53a0688: UNKNOWN, ?; verdicts at this head: -. chore(deps): bump @nestjs/platform-express from 11.1.26 to 1</w:t>
+        <w:t xml:space="preserve">backend #619 @e53a0688: BEHIND, ?; verdicts at this head: -. chore(deps): bump @nestjs/platform-express from 11.1.26 to 1</w:t>
       </w:r>
     </w:p>
     <w:p>
@@ -6341,7 +6353,7 @@
         </w:numPr>
       </w:pPr>
       <w:r>
-        <w:t xml:space="preserve">backend #620 @aa9a0126: UNKNOWN, ?; verdicts at this head: -. chore(deps): bump @supabase/supabase-js from 2.108.1 to 2.11</w:t>
+        <w:t xml:space="preserve">backend #620 @aa9a0126: BEHIND, ?; verdicts at this head: -. chore(deps): bump @supabase/supabase-js from 2.108.1 to 2.11</w:t>
       </w:r>
     </w:p>
     <w:p>
@@ -6353,7 +6365,7 @@
         </w:numPr>
       </w:pPr>
       <w:r>
-        <w:t xml:space="preserve">backend #621 @1a7b6c26: UNKNOWN, ?; verdicts at this head: -. chore(deps): bump @nestjs/common from 11.1.26 to 12.1.1</w:t>
+        <w:t xml:space="preserve">backend #621 @1a7b6c26: BEHIND, ?; verdicts at this head: -. chore(deps): bump @nestjs/common from 11.1.26 to 12.1.1</w:t>
       </w:r>
     </w:p>
     <w:p>
@@ -6365,7 +6377,7 @@
         </w:numPr>
       </w:pPr>
       <w:r>
-        <w:t xml:space="preserve">backend #627 @2c57cc41: UNKNOWN, T4; verdicts at this head: GPT-6.1 Sol:REQUEST CHANGES, Claude Opus 5.5:REQUEST CHANGES. fix(billing): coach payout = price - actual Stripe fee - 2%</w:t>
+        <w:t xml:space="preserve">backend #627 @ef19980f: BEHIND, T4; verdicts at this head: -. fix(billing): coach payout = price - actual Stripe fee - 2%</w:t>
       </w:r>
     </w:p>
     <w:p>
@@ -6377,7 +6389,7 @@
         </w:numPr>
       </w:pPr>
       <w:r>
-        <w:t xml:space="preserve">backend #628 @ba1d9480: UNKNOWN, T4; verdicts at this head: Claude Opus 5.5:REQUEST CHANGES, GPT-6.1 Sol:REQUEST CHANGES. fix(dunning-v2): live-ready 10-day lockout + native card upd</w:t>
+        <w:t xml:space="preserve">backend #628 @ba1d9480: BEHIND, T4; verdicts at this head: Claude Opus 5.5:REQUEST CHANGES, GPT-6.1 Sol:REQUEST CHANGES. fix(dunning-v2): live-ready 10-day lockout + native card upd</w:t>
       </w:r>
     </w:p>
     <w:p>
@@ -6389,7 +6401,7 @@
         </w:numPr>
       </w:pPr>
       <w:r>
-        <w:t xml:space="preserve">backend #629 @858eb40b: UNKNOWN, T4; verdicts at this head: GPT-6.1 Sol:REQUEST CHANGES, Claude Opus 5.5:REQUEST CHANGES. feat(packages): paid packages start at $19.99, or exactly $0</w:t>
+        <w:t xml:space="preserve">backend #629 @858eb40b: BEHIND, T4; verdicts at this head: GPT-6.1 Sol:REQUEST CHANGES, Claude Opus 5.5:REQUEST CHANGES. feat(packages): paid packages start at $19.99, or exactly $0</w:t>
       </w:r>
     </w:p>
     <w:p>
@@ -6413,7 +6425,7 @@
         </w:numPr>
       </w:pPr>
       <w:r>
-        <w:t xml:space="preserve">backend #633 @850ec148: UNKNOWN, T4; verdicts at this head: GPT-6.1 Sol:REQUEST CHANGES, Claude Opus 5.5:REQUEST CHANGES. ci(flags): FEATURE_DUNNING_V2 closed-choice input for the Fl</w:t>
+        <w:t xml:space="preserve">backend #633 @850ec148: BEHIND, T4; verdicts at this head: GPT-6.1 Sol:REQUEST CHANGES, Claude Opus 5.5:REQUEST CHANGES. ci(flags): FEATURE_DUNNING_V2 closed-choice input for the Fl</w:t>
       </w:r>
     </w:p>
     <w:p>
@@ -6425,7 +6437,7 @@
         </w:numPr>
       </w:pPr>
       <w:r>
-        <w:t xml:space="preserve">backend #634 @7284e079: UNKNOWN, T4; verdicts at this head: -. feat(scheduling): S-SCHED-2 authoritative booking lifecycle,</w:t>
+        <w:t xml:space="preserve">backend #634 @7284e079: DIRTY, T4; verdicts at this head: -. feat(scheduling): S-SCHED-2 authoritative booking lifecycle,</w:t>
       </w:r>
     </w:p>
     <w:p>
@@ -6437,6 +6449,30 @@
         </w:numPr>
       </w:pPr>
       <w:r>
+        <w:t xml:space="preserve">backend #635 @0a32b4fe: BEHIND, T4; verdicts at this head: -. feat(ai-consent): client-ai-v4 true AI-chat retention copy;</w:t>
+      </w:r>
+    </w:p>
+    <w:p>
+      <w:pPr>
+        <w:pStyle w:val="Compact"/>
+        <w:numPr>
+          <w:ilvl w:val="0"/>
+          <w:numId w:val="1081"/>
+        </w:numPr>
+      </w:pPr>
+      <w:r>
+        <w:t xml:space="preserve">backend #636 @9b7a6a34: UNSTABLE (base agent/clinic/deletion-be/7c1d2e9a), T4; verdicts at this head: -. feat(data-export): private bucket storage + 5-minute user-bo</w:t>
+      </w:r>
+    </w:p>
+    <w:p>
+      <w:pPr>
+        <w:pStyle w:val="Compact"/>
+        <w:numPr>
+          <w:ilvl w:val="0"/>
+          <w:numId w:val="1081"/>
+        </w:numPr>
+      </w:pPr>
+      <w:r>
         <w:t xml:space="preserve">mobile #305 @45787152: CLEAN (base clinic/m2-core-polish), T3; verdicts at this head: -. clinic/m3: expo-updates (EAS Update, fingerprint runtime, ch</w:t>
       </w:r>
     </w:p>
@@ -6449,7 +6485,7 @@
         </w:numPr>
       </w:pPr>
       <w:r>
-        <w:t xml:space="preserve">mobile #310 @e1dbe7f9: UNKNOWN, T4; verdicts at this head: Claude Opus 5.5:REQUEST CHANGES, GPT-6.1 Sol:REQUEST CHANGES. feat(onboarding): config-driven consultation onboarding behi</w:t>
+        <w:t xml:space="preserve">mobile #310 @e1dbe7f9: DIRTY, T4; verdicts at this head: Claude Opus 5.5:REQUEST CHANGES, GPT-6.1 Sol:REQUEST CHANGES. feat(onboarding): config-driven consultation onboarding behi</w:t>
       </w:r>
     </w:p>
     <w:p>
@@ -6461,7 +6497,7 @@
         </w:numPr>
       </w:pPr>
       <w:r>
-        <w:t xml:space="preserve">mobile #312 @5b26e1f4: UNKNOWN, T3; verdicts at this head: -. C05 item 7: Workout reminders toggle in Settings &gt; Notificat</w:t>
+        <w:t xml:space="preserve">mobile #312 @5b26e1f4: DIRTY, T3; verdicts at this head: -. C05 item 7: Workout reminders toggle in Settings &gt; Notificat</w:t>
       </w:r>
     </w:p>
     <w:p>
@@ -6473,7 +6509,7 @@
         </w:numPr>
       </w:pPr>
       <w:r>
-        <w:t xml:space="preserve">mobile #314 @41d829d7: UNKNOWN, T4; verdicts at this head: GPT-6.1 Sol:REQUEST CHANGES. feat(community): report, block, moderation actions and safet</w:t>
+        <w:t xml:space="preserve">mobile #314 @41d829d7: BEHIND, T4; verdicts at this head: GPT-6.1 Sol:REQUEST CHANGES. feat(community): report, block, moderation actions and safet</w:t>
       </w:r>
     </w:p>
     <w:p>
@@ -6485,7 +6521,7 @@
         </w:numPr>
       </w:pPr>
       <w:r>
-        <w:t xml:space="preserve">mobile #315 @d9c2e669: UNKNOWN, T3; verdicts at this head: GPT-6.1 Sol:APPROVE, Claude Opus 5.5:APPROVE. fix(trust-center): open the real privacy policy, link the co</w:t>
+        <w:t xml:space="preserve">mobile #315 @d9c2e669: DIRTY, T3; verdicts at this head: GPT-6.1 Sol:APPROVE, Claude Opus 5.5:APPROVE. fix(trust-center): open the real privacy policy, link the co</w:t>
       </w:r>
     </w:p>
     <w:p>
@@ -6497,7 +6533,7 @@
         </w:numPr>
       </w:pPr>
       <w:r>
-        <w:t xml:space="preserve">mobile #317 @c7e35d84: UNKNOWN, T4; verdicts at this head: GPT-6.1 Sol:BLOCK, Claude Opus 5.5:REQUEST CHANGES. fix(wearables): S14 [T4] Apple Health / Health Connect conne</w:t>
+        <w:t xml:space="preserve">mobile #317 @c7e35d84: DIRTY, T4; verdicts at this head: GPT-6.1 Sol:BLOCK, Claude Opus 5.5:REQUEST CHANGES. fix(wearables): S14 [T4] Apple Health / Health Connect conne</w:t>
       </w:r>
     </w:p>
     <w:p>
@@ -6509,7 +6545,7 @@
         </w:numPr>
       </w:pPr>
       <w:r>
-        <w:t xml:space="preserve">mobile #321 @a9b1f49d: UNKNOWN, T3; verdicts at this head: Claude Opus 5.5:REQUEST CHANGES. feat(packages): editor shows the $19.99 minimum or free rule</w:t>
+        <w:t xml:space="preserve">mobile #321 @a9b1f49d: BEHIND, T3; verdicts at this head: Claude Opus 5.5:REQUEST CHANGES. feat(packages): editor shows the $19.99 minimum or free rule</w:t>
       </w:r>
     </w:p>
     <w:p>
@@ -6521,7 +6557,7 @@
         </w:numPr>
       </w:pPr>
       <w:r>
-        <w:t xml:space="preserve">mobile #322 @8991ddf3: UNKNOWN, T4; verdicts at this head: Claude Opus 5.5:REQUEST CHANGES, GPT-6.1 Sol:REQUEST CHANGES. feat(dunning): payment lockout + Days 0-9 banner + native Up</w:t>
+        <w:t xml:space="preserve">mobile #322 @8991ddf3: DIRTY, T4; verdicts at this head: Claude Opus 5.5:REQUEST CHANGES, GPT-6.1 Sol:REQUEST CHANGES. feat(dunning): payment lockout + Days 0-9 banner + native Up</w:t>
       </w:r>
     </w:p>
     <w:p>
@@ -6533,7 +6569,7 @@
         </w:numPr>
       </w:pPr>
       <w:r>
-        <w:t xml:space="preserve">mobile #324 @7f20255d: UNKNOWN, T2; verdicts at this head: GPT-6.1 Sol:REQUEST CHANGES. fix(support): one support email (</w:t>
+        <w:t xml:space="preserve">mobile #324 @7f20255d: BEHIND, T2; verdicts at this head: GPT-6.1 Sol:REQUEST CHANGES. fix(support): one support email (</w:t>
       </w:r>
       <w:hyperlink r:id="rId39">
         <w:r>
@@ -6556,7 +6592,7 @@
         </w:numPr>
       </w:pPr>
       <w:r>
-        <w:t xml:space="preserve">mobile #325 @bc1398c2: UNKNOWN, T2; verdicts at this head: -. S-SCHED: native Calendar, coach controls and welcome-call tu</w:t>
+        <w:t xml:space="preserve">mobile #325 @bc1398c2: BEHIND, T2; verdicts at this head: -. S-SCHED: native Calendar, coach controls and welcome-call tu</w:t>
       </w:r>
     </w:p>
     <w:p>
@@ -6568,7 +6604,19 @@
         </w:numPr>
       </w:pPr>
       <w:r>
-        <w:t xml:space="preserve">mobile #326 @32ed8546: UNKNOWN, T4; verdicts at this head: GPT-6.1 Sol:REQUEST CHANGES, Claude Opus 5.5:REQUEST CHANGES. fix(ai): handle ai_consent_required and ai_egress_blocked on</w:t>
+        <w:t xml:space="preserve">mobile #326 @32ed8546: BEHIND, T4; verdicts at this head: GPT-6.1 Sol:REQUEST CHANGES, Claude Opus 5.5:REQUEST CHANGES. fix(ai): handle ai_consent_required and ai_egress_blocked on</w:t>
+      </w:r>
+    </w:p>
+    <w:p>
+      <w:pPr>
+        <w:pStyle w:val="Compact"/>
+        <w:numPr>
+          <w:ilvl w:val="0"/>
+          <w:numId w:val="1081"/>
+        </w:numPr>
+      </w:pPr>
+      <w:r>
+        <w:t xml:space="preserve">mobile #327 @227c5ad9: BLOCKED, T4; verdicts at this head: -. feat(data-export): working download via fresh 5-minute link,</w:t>
       </w:r>
     </w:p>
     <w:p>

</xml_diff>

<commit_message>
op 110: v5 operator prompt for agent 111 + lane reports (23:36 PDT)
</commit_message>
<xml_diff>
--- a/handoffs/op-f083060f/TGP-Operator-Prompt-v5-Agent-111.docx
+++ b/handoffs/op-f083060f/TGP-Operator-Prompt-v5-Agent-111.docx
@@ -30,7 +30,7 @@
         </w:r>
       </w:hyperlink>
       <w:r>
-        <w:t xml:space="preserve">) at Bradley's request (10-01 21:38: "keep progressing, updating the agent 110 prompt I gave you to reflect current state and issues - rename it agent 111 … for when your out of credits and retired happily!"). This snapshot: 2026-10-01 23:32 PDT (real clock). Agent 110 keeps regenerating it; the newest copy is in tgp-agent-context at handoffs/op-f083060f/TGP-Operator-Prompt-v5-Agent-111.md (and .docx). Paste this whole document as the first message to the next operator, and attach the same four owner documents plus docs.zip (section 3.4). It replaces prompt v4 (kept at handoffs/op-f083060f/TGP-Operator-Prompt-v4-Agent-110.md for history). Most of v4 is carried over word for word; the parts that changed are sections 0 (overarching facts, item 5), 2 (update note), 3, 4.13 (new), 5, 6.0 (110's lessons first), 7, 12 and 13.</w:t>
+        <w:t xml:space="preserve">) at Bradley's request (10-01 21:38: "keep progressing, updating the agent 110 prompt I gave you to reflect current state and issues - rename it agent 111 … for when your out of credits and retired happily!"). This snapshot: 2026-10-01 23:36 PDT (real clock). Agent 110 keeps regenerating it; the newest copy is in tgp-agent-context at handoffs/op-f083060f/TGP-Operator-Prompt-v5-Agent-111.md (and .docx). Paste this whole document as the first message to the next operator, and attach the same four owner documents plus docs.zip (section 3.4). It replaces prompt v4 (kept at handoffs/op-f083060f/TGP-Operator-Prompt-v4-Agent-110.md for history). Most of v4 is carried over word for word; the parts that changed are sections 0 (overarching facts, item 5), 2 (update note), 3, 4.13 (new), 5, 6.0 (110's lessons first), 7, 12 and 13.</w:t>
       </w:r>
     </w:p>
     <w:p>
@@ -1744,7 +1744,7 @@
         <w:pStyle w:val="FirstParagraph"/>
       </w:pPr>
       <w:r>
-        <w:t xml:space="preserve">UPDATE 10-01 20:17-23:32 (agent 110 era; sections 4.13 and 5 have the detail):</w:t>
+        <w:t xml:space="preserve">UPDATE 10-01 20:17-23:36 (agent 110 era; sections 4.13 and 5 have the detail):</w:t>
       </w:r>
     </w:p>
     <w:p>
@@ -5684,13 +5684,13 @@
         <w:t xml:space="preserve">The live, newest version of this section is the top of tgp-agent-context LAST_OPERATOR_STATE.md ("AGENT 110 TAKEOVER" + "Train log (agent 110)"). Agent 110 appends to that train log after every merge, deploy and lane result; if this prompt and the train log disagree, the train log wins.</w:t>
       </w:r>
     </w:p>
-    <w:bookmarkStart w:id="50" w:name="Xf1b42f45fe6200c2752a12b56c1545c7dde2488"/>
+    <w:bookmarkStart w:id="50" w:name="Xc2f89dff71100ea5827cb53fa1decd4622fec07"/>
     <w:p>
       <w:pPr>
         <w:pStyle w:val="Heading3"/>
       </w:pPr>
       <w:r>
-        <w:t xml:space="preserve">AGENT 110 STATE FOR AGENT 111 — snapshot 2026-10-01 23:32 PDT (real clock)</w:t>
+        <w:t xml:space="preserve">AGENT 110 STATE FOR AGENT 111 — snapshot 2026-10-01 23:36 PDT (real clock)</w:t>
       </w:r>
     </w:p>
     <w:bookmarkStart w:id="43" w:name="production-and-mains"/>
@@ -5887,7 +5887,7 @@
         </w:numPr>
       </w:pPr>
       <w:r>
-        <w:t xml:space="preserve">AUD-SOL (GPT-6.1 Sol): standing Sol lens. Batch done 23:12 (see train log); 23:32 #604 delta @08658e77 REQUEST CHANGES B-604-1 (four C14 ENV_RULES entries need explicit defaults 240/60/400/10 under #624's hygiene contract; build-and-test red) -&gt; fix sent to B-607-FIX. Idle until fixes land.</w:t>
+        <w:t xml:space="preserve">AUD-SOL (GPT-6.1 Sol): standing Sol lens. Now (23:36): T4 audits of #636 and mobile #327 (support-email check). Earlier: #604 delta RC B-604-1 (fix sent to B-607-FIX).</w:t>
       </w:r>
     </w:p>
     <w:p>
@@ -6031,7 +6031,7 @@
         </w:numPr>
       </w:pPr>
       <w:r>
-        <w:t xml:space="preserve">B-EXPORT (Claude Opus 5.5): durable, downloadable data export stacked on #608 (migration 20270221000000). Status: running since 22:38.</w:t>
+        <w:t xml:space="preserve">B-EXPORT (Claude Opus 5.5): DONE 23:36. backend #636 @9b7a6a34 STACKED on #608 (private bucket data-exports via migration 20270221000000 + release check script; 5-min single-user download streamed through the API; deletion cleanup) and mobile #327 @227c5ad9 (base main). CI green. Plan: dual audit #636 + #327 -&gt; operator merges #636 into #608 branch -&gt; update #608 -&gt; dual delta -&gt; merge #608. Production step: normal deploy (release runs prisma migrate deploy + check script); leave DATA_EXPORT_STORAGE unset.</w:t>
       </w:r>
     </w:p>
     <w:p>
@@ -6461,7 +6461,7 @@
         </w:numPr>
       </w:pPr>
       <w:r>
-        <w:t xml:space="preserve">backend #636 @9b7a6a34: UNSTABLE (base agent/clinic/deletion-be/7c1d2e9a), T4; verdicts at this head: -. feat(data-export): private bucket storage + 5-minute user-bo</w:t>
+        <w:t xml:space="preserve">backend #636 @9b7a6a34: CLEAN (base agent/clinic/deletion-be/7c1d2e9a), T4; verdicts at this head: -. feat(data-export): private bucket storage + 5-minute user-bo</w:t>
       </w:r>
     </w:p>
     <w:p>
@@ -6616,7 +6616,7 @@
         </w:numPr>
       </w:pPr>
       <w:r>
-        <w:t xml:space="preserve">mobile #327 @227c5ad9: BLOCKED, T4; verdicts at this head: -. feat(data-export): working download via fresh 5-minute link,</w:t>
+        <w:t xml:space="preserve">mobile #327 @227c5ad9: CLEAN, T4; verdicts at this head: -. feat(data-export): working download via fresh 5-minute link,</w:t>
       </w:r>
     </w:p>
     <w:p>

</xml_diff>

<commit_message>
op 110: v5 operator prompt for agent 111 + lane reports (23:59 PDT)
</commit_message>
<xml_diff>
--- a/handoffs/op-f083060f/TGP-Operator-Prompt-v5-Agent-111.docx
+++ b/handoffs/op-f083060f/TGP-Operator-Prompt-v5-Agent-111.docx
@@ -30,7 +30,7 @@
         </w:r>
       </w:hyperlink>
       <w:r>
-        <w:t xml:space="preserve">) at Bradley's request (10-01 21:38: "keep progressing, updating the agent 110 prompt I gave you to reflect current state and issues - rename it agent 111 … for when your out of credits and retired happily!"). This snapshot: 2026-10-01 23:36 PDT (real clock). Agent 110 keeps regenerating it; the newest copy is in tgp-agent-context at handoffs/op-f083060f/TGP-Operator-Prompt-v5-Agent-111.md (and .docx). Paste this whole document as the first message to the next operator, and attach the same four owner documents plus docs.zip (section 3.4). It replaces prompt v4 (kept at handoffs/op-f083060f/TGP-Operator-Prompt-v4-Agent-110.md for history). Most of v4 is carried over word for word; the parts that changed are sections 0 (overarching facts, item 5), 2 (update note), 3, 4.13 (new), 5, 6.0 (110's lessons first), 7, 12 and 13.</w:t>
+        <w:t xml:space="preserve">) at Bradley's request (10-01 21:38: "keep progressing, updating the agent 110 prompt I gave you to reflect current state and issues - rename it agent 111 … for when your out of credits and retired happily!"). This snapshot: 2026-10-01 23:59 PDT (real clock). Agent 110 keeps regenerating it; the newest copy is in tgp-agent-context at handoffs/op-f083060f/TGP-Operator-Prompt-v5-Agent-111.md (and .docx). Paste this whole document as the first message to the next operator, and attach the same four owner documents plus docs.zip (section 3.4). It replaces prompt v4 (kept at handoffs/op-f083060f/TGP-Operator-Prompt-v4-Agent-110.md for history). Most of v4 is carried over word for word; the parts that changed are sections 0 (overarching facts, item 5), 2 (update note), 3, 4.13 (new), 5, 6.0 (110's lessons first), 7, 12 and 13.</w:t>
       </w:r>
     </w:p>
     <w:p>
@@ -1744,7 +1744,7 @@
         <w:pStyle w:val="FirstParagraph"/>
       </w:pPr>
       <w:r>
-        <w:t xml:space="preserve">UPDATE 10-01 20:17-23:36 (agent 110 era; sections 4.13 and 5 have the detail):</w:t>
+        <w:t xml:space="preserve">UPDATE 10-01 20:17-23:59 (agent 110 era; sections 4.13 and 5 have the detail):</w:t>
       </w:r>
     </w:p>
     <w:p>
@@ -5684,13 +5684,13 @@
         <w:t xml:space="preserve">The live, newest version of this section is the top of tgp-agent-context LAST_OPERATOR_STATE.md ("AGENT 110 TAKEOVER" + "Train log (agent 110)"). Agent 110 appends to that train log after every merge, deploy and lane result; if this prompt and the train log disagree, the train log wins.</w:t>
       </w:r>
     </w:p>
-    <w:bookmarkStart w:id="50" w:name="Xc2f89dff71100ea5827cb53fa1decd4622fec07"/>
+    <w:bookmarkStart w:id="50" w:name="X1b8e130a9bad0007c7f25a50b79f43d15b9d87c"/>
     <w:p>
       <w:pPr>
         <w:pStyle w:val="Heading3"/>
       </w:pPr>
       <w:r>
-        <w:t xml:space="preserve">AGENT 110 STATE FOR AGENT 111 — snapshot 2026-10-01 23:36 PDT (real clock)</w:t>
+        <w:t xml:space="preserve">AGENT 110 STATE FOR AGENT 111 — snapshot 2026-10-01 23:59 PDT (real clock)</w:t>
       </w:r>
     </w:p>
     <w:bookmarkStart w:id="43" w:name="production-and-mains"/>
@@ -5887,7 +5887,7 @@
         </w:numPr>
       </w:pPr>
       <w:r>
-        <w:t xml:space="preserve">AUD-SOL (GPT-6.1 Sol): standing Sol lens. Now (23:36): T4 audits of #636 and mobile #327 (support-email check). Earlier: #604 delta RC B-604-1 (fix sent to B-607-FIX).</w:t>
+        <w:t xml:space="preserve">AUD-SOL (GPT-6.1 Sol): running: #636, mobile #327, #632 delta @b859a1c6, #634, mobile #325.</w:t>
       </w:r>
     </w:p>
     <w:p>
@@ -5899,7 +5899,7 @@
         </w:numPr>
       </w:pPr>
       <w:r>
-        <w:t xml:space="preserve">AUD-OPUS (Claude Opus 5.5): standing Opus lens. Status: batch done 23:00: #627 RC 0/3/2, #629 RC 0/2/1, mobile #321 RC 0/2/1, #624 APPROVE (75a4e563) + delta ready at e3e0a314 (posting after danger fix), #608 APPROVE (export counted to B-EXPORT), #633 RC 0/2/3, mobile #313 delta APPROVE @1e80017, #604 delta APPROVE @12a4d423, #628 RC 0/2/4, mobile #322 RC 0/2/1.</w:t>
+        <w:t xml:space="preserve">AUD-OPUS (Claude Opus 5.5) re-queued 23:58: #636, mobile #327, #634, mobile #325.</w:t>
       </w:r>
     </w:p>
     <w:p>
@@ -6019,7 +6019,7 @@
         </w:numPr>
       </w:pPr>
       <w:r>
-        <w:t xml:space="preserve">S-SCHED-2 (Claude Opus 5.5): scheduling backend lifecycle/concurrency/ownership/contracts/notifications + #325 consumer changes. Status: running since 22:26 (migration 20270212000000).</w:t>
+        <w:t xml:space="preserve">S-SCHED-2 (Claude Opus 5.5): DONE 23:58. NEW backend #634 @dbc10b7b (T4: validation, exclusion-constraint no-double-booking, ownership, new contracts, notifications; migration 20270222000000; installs btree_gist), #632 -&gt; b859a1c6 (main merged; conflict in prod-switches.yml resolved; reminders run only when BOOKING_REMINDERS_ENABLED=on), mobile #325 -&gt; b0c02156 (now T4; needs #634 first). CI green. Prod read-only: overlap preflight 0 pairs; btree_gist not installed. OR-110-5: BOOKING_REMINDERS_ENABLED=on via the B-FLAGS manifest in #632's deploy window. Follow-ups: seed is_welcome on "Quick initialization"; delete unreachable ClientBookingRequest route.</w:t>
       </w:r>
     </w:p>
     <w:p>
@@ -6173,7 +6173,7 @@
         </w:numPr>
       </w:pPr>
       <w:r>
-        <w:t xml:space="preserve">backend #604 @08658e77: BLOCKED, T4; verdicts at this head: GPT-6.1 Sol:REQUEST CHANGES. fix(throttler): isolate named throttlers to their routes, pu</w:t>
+        <w:t xml:space="preserve">backend #604 @e159d665: BLOCKED, T4; verdicts at this head: -. fix(throttler): isolate named throttlers to their routes, pu</w:t>
       </w:r>
     </w:p>
     <w:p>
@@ -6233,7 +6233,7 @@
         </w:numPr>
       </w:pPr>
       <w:r>
-        <w:t xml:space="preserve">backend #610 @9e4b3795: BEHIND, T4; verdicts at this head: GPT-6.1 Sol:BLOCK, Claude Opus 5.5:BLOCK. feat(community): UGC safety for App Review 1.2 (content filt</w:t>
+        <w:t xml:space="preserve">backend #610 @304613e4: BLOCKED, T4; verdicts at this head: -. feat(community): UGC safety for App Review 1.2 (content filt</w:t>
       </w:r>
     </w:p>
     <w:p>
@@ -6401,7 +6401,7 @@
         </w:numPr>
       </w:pPr>
       <w:r>
-        <w:t xml:space="preserve">backend #629 @858eb40b: BEHIND, T4; verdicts at this head: GPT-6.1 Sol:REQUEST CHANGES, Claude Opus 5.5:REQUEST CHANGES. feat(packages): paid packages start at $19.99, or exactly $0</w:t>
+        <w:t xml:space="preserve">backend #629 @d134f012: BEHIND, T4; verdicts at this head: -. feat(packages): paid packages start at $19.99, or exactly $0</w:t>
       </w:r>
     </w:p>
     <w:p>
@@ -6413,7 +6413,7 @@
         </w:numPr>
       </w:pPr>
       <w:r>
-        <w:t xml:space="preserve">backend #632 @0ae744b6: DIRTY, T2; verdicts at this head: GPT-6.1 Sol:APPROVE. feat(scheduling): S-SCHED explicit booking reminders and saf</w:t>
+        <w:t xml:space="preserve">backend #632 @b859a1c6: UNSTABLE, T2; verdicts at this head: -. feat(scheduling): S-SCHED explicit booking reminders and saf</w:t>
       </w:r>
     </w:p>
     <w:p>
@@ -6437,7 +6437,7 @@
         </w:numPr>
       </w:pPr>
       <w:r>
-        <w:t xml:space="preserve">backend #634 @7284e079: DIRTY, T4; verdicts at this head: -. feat(scheduling): S-SCHED-2 authoritative booking lifecycle,</w:t>
+        <w:t xml:space="preserve">backend #634 @dbc10b7b: UNSTABLE, T4; verdicts at this head: -. feat(scheduling): S-SCHED-2 authoritative booking lifecycle,</w:t>
       </w:r>
     </w:p>
     <w:p>
@@ -6461,7 +6461,7 @@
         </w:numPr>
       </w:pPr>
       <w:r>
-        <w:t xml:space="preserve">backend #636 @9b7a6a34: CLEAN (base agent/clinic/deletion-be/7c1d2e9a), T4; verdicts at this head: -. feat(data-export): private bucket storage + 5-minute user-bo</w:t>
+        <w:t xml:space="preserve">backend #636 @9b7a6a34: CLEAN (base agent/clinic/deletion-be/7c1d2e9a), T4; verdicts at this head: GPT-6.1 Sol:REQUEST CHANGES. feat(data-export): private bucket storage + 5-minute user-bo</w:t>
       </w:r>
     </w:p>
     <w:p>
@@ -6485,7 +6485,7 @@
         </w:numPr>
       </w:pPr>
       <w:r>
-        <w:t xml:space="preserve">mobile #310 @e1dbe7f9: DIRTY, T4; verdicts at this head: Claude Opus 5.5:REQUEST CHANGES, GPT-6.1 Sol:REQUEST CHANGES. feat(onboarding): config-driven consultation onboarding behi</w:t>
+        <w:t xml:space="preserve">mobile #310 @f85ffd36: CLEAN, T4; verdicts at this head: -. feat(onboarding): config-driven consultation onboarding behi</w:t>
       </w:r>
     </w:p>
     <w:p>
@@ -6545,7 +6545,7 @@
         </w:numPr>
       </w:pPr>
       <w:r>
-        <w:t xml:space="preserve">mobile #321 @a9b1f49d: BEHIND, T3; verdicts at this head: Claude Opus 5.5:REQUEST CHANGES. feat(packages): editor shows the $19.99 minimum or free rule</w:t>
+        <w:t xml:space="preserve">mobile #321 @4295fc79: BEHIND, T3; verdicts at this head: -. feat(packages): editor shows the $19.99 minimum or free rule</w:t>
       </w:r>
     </w:p>
     <w:p>
@@ -6592,7 +6592,7 @@
         </w:numPr>
       </w:pPr>
       <w:r>
-        <w:t xml:space="preserve">mobile #325 @bc1398c2: BEHIND, T2; verdicts at this head: -. S-SCHED: native Calendar, coach controls and welcome-call tu</w:t>
+        <w:t xml:space="preserve">mobile #325 @b0c02156: BEHIND, T4; verdicts at this head: -. S-SCHED: native Calendar, coach controls, welcome call and l</w:t>
       </w:r>
     </w:p>
     <w:p>
@@ -6616,7 +6616,7 @@
         </w:numPr>
       </w:pPr>
       <w:r>
-        <w:t xml:space="preserve">mobile #327 @227c5ad9: CLEAN, T4; verdicts at this head: -. feat(data-export): working download via fresh 5-minute link,</w:t>
+        <w:t xml:space="preserve">mobile #327 @227c5ad9: CLEAN, T4; verdicts at this head: GPT-6.1 Sol:REQUEST CHANGES. feat(data-export): working download via fresh 5-minute link,</w:t>
       </w:r>
     </w:p>
     <w:p>
@@ -6736,7 +6736,22 @@
         <w:pStyle w:val="FirstParagraph"/>
       </w:pPr>
       <w:r>
-        <w:t xml:space="preserve">OR-109-1 (community safety contact = SUPPORT_EMAIL), OR-109-2 (ai_egress_blocked 503 -&gt; contact support with reference), OR-109-3 (B-RECIPES defaults), OR-110-1 (user delete + account deletion erase AI chats), OR-110-2 (native Stripe surfaces), OR-110-3 (schema parity as merge gate; now enforced by GitHub), OR-110-4 (FEATURE_AI_CONSENT_LEDGER_ENABLED goes ON in the same window as the #626 deploy; #626 without the ledger flag blocks all AI for every client).</w:t>
+        <w:t xml:space="preserve">OR-109-1 (community safety contact = SUPPORT_EMAIL), OR-109-2 (ai_egress_blocked 503 -&gt; contact support with reference), OR-109-3 (B-RECIPES defaults), OR-110-1 (user delete + account deletion erase AI chats), OR-110-2 (native Stripe surfaces), OR-110-3 (schema parity as merge gate; now enforced by GitHub), OR-110-4 (FEATURE_AI_CONSENT_LEDGER_ENABLED goes ON in the same window as the #626 deploy; #626 without the ledger flag blocks all AI for every client), OR-110-5 (BOOKING_REMINDERS_ENABLED=on — the code accepts only</w:t>
+      </w:r>
+      <w:r>
+        <w:t xml:space="preserve"> </w:t>
+      </w:r>
+      <w:r>
+        <w:rPr>
+          <w:rStyle w:val="VerbatimChar"/>
+        </w:rPr>
+        <w:t xml:space="preserve">on</w:t>
+      </w:r>
+      <w:r>
+        <w:t xml:space="preserve"> </w:t>
+      </w:r>
+      <w:r>
+        <w:t xml:space="preserve">— through the B-FLAGS manifest in the same deploy window as #632).</w:t>
       </w:r>
     </w:p>
     <w:bookmarkEnd w:id="48"/>

</xml_diff>